<commit_message>
Updated CPFR VC CPH Roadmap to version 0.4
</commit_message>
<xml_diff>
--- a/CPFR_VDS_CPH_Docs/TPM/CPFR_VC_CPH_Roadmap_v0_4.docx
+++ b/CPFR_VDS_CPH_Docs/TPM/CPFR_VC_CPH_Roadmap_v0_4.docx
@@ -32,12 +32,6 @@
         <w:gridCol w:w="8743"/>
       </w:tblGrid>
       <w:tr>
-        <w:tblPrEx>
-          <w:tblCellMar>
-            <w:top w:w="0" w:type="dxa"/>
-            <w:bottom w:w="0" w:type="dxa"/>
-          </w:tblCellMar>
-        </w:tblPrEx>
         <w:trPr>
           <w:trHeight w:val="211"/>
         </w:trPr>
@@ -93,12 +87,6 @@
         </w:tc>
       </w:tr>
       <w:tr>
-        <w:tblPrEx>
-          <w:tblCellMar>
-            <w:top w:w="0" w:type="dxa"/>
-            <w:bottom w:w="0" w:type="dxa"/>
-          </w:tblCellMar>
-        </w:tblPrEx>
         <w:trPr>
           <w:trHeight w:val="199"/>
         </w:trPr>
@@ -148,18 +136,15 @@
               <w:pStyle w:val="BodyText2"/>
             </w:pPr>
             <w:r>
-              <w:t>Dave Livesay, Sr. Director, Inventory Management</w:t>
+              <w:t xml:space="preserve">Dave Livesay, Sr. Director, </w:t>
+            </w:r>
+            <w:r>
+              <w:t>Strategy and Network Operations Planning</w:t>
             </w:r>
           </w:p>
         </w:tc>
       </w:tr>
       <w:tr>
-        <w:tblPrEx>
-          <w:tblCellMar>
-            <w:top w:w="0" w:type="dxa"/>
-            <w:bottom w:w="0" w:type="dxa"/>
-          </w:tblCellMar>
-        </w:tblPrEx>
         <w:trPr>
           <w:trHeight w:val="211"/>
         </w:trPr>
@@ -209,18 +194,18 @@
               <w:pStyle w:val="BodyText2"/>
             </w:pPr>
             <w:r>
-              <w:t>March 2026</w:t>
+              <w:t xml:space="preserve">March </w:t>
+            </w:r>
+            <w:r>
+              <w:t xml:space="preserve">18, </w:t>
+            </w:r>
+            <w:r>
+              <w:t>2026</w:t>
             </w:r>
           </w:p>
         </w:tc>
       </w:tr>
       <w:tr>
-        <w:tblPrEx>
-          <w:tblCellMar>
-            <w:top w:w="0" w:type="dxa"/>
-            <w:bottom w:w="0" w:type="dxa"/>
-          </w:tblCellMar>
-        </w:tblPrEx>
         <w:trPr>
           <w:trHeight w:val="199"/>
         </w:trPr>
@@ -309,16 +294,7 @@
         <w:spacing w:before="120" w:after="120"/>
       </w:pPr>
       <w:r>
-        <w:t xml:space="preserve">One of the </w:t>
-      </w:r>
-      <w:r>
-        <w:t>hardest</w:t>
-      </w:r>
-      <w:r>
-        <w:t xml:space="preserve"> key investments </w:t>
-      </w:r>
-      <w:r>
-        <w:t>has already been made. The CPFR data platform—a Snowflake-based semantic layer with vendor isolation, daily refresh, and data lineage—delivers on 3/31/2026 at network grain, covering 98.4% of active vendors. he VC/Chargeback workstream has secured engineering support through Jeremy Wartnick for its SPARK-related data pipeline needs. What is missing for both workstreams is the same thing: CPH integration capacity to surface this data to vendors through a governed portal experience.</w:t>
+        <w:t>One of the hardest key investments has already been made. The CPFR data platform—a Snowflake-based semantic layer with vendor isolation, daily refresh, and data lineage—delivers on 3/31/2026 at network grain, covering 98.4% of active vendors. he VC/Chargeback workstream has secured engineering support through Jeremy Wartnick for its SPARK-related data pipeline needs. What is missing for both workstreams is the same thing: CPH integration capacity to surface this data to vendors through a governed portal experience.</w:t>
       </w:r>
     </w:p>
     <w:p>
@@ -385,7 +361,10 @@
         <w:t>Now a</w:t>
       </w:r>
       <w:r>
-        <w:t xml:space="preserve">t more than three times that scale, it creates compounding strain: distribution list management requires contractor triage before requests reach the CPFR team; data freshness is limited to weekly snapshots while ISMs and vendors need mid-week visibility; and Chewy remains the sole handler of vendor-to-recipient mapping, creating exposure to misdirected proprietary data—a risk that materialized in January 2026 when data for one vendor was released to an unrelated vendor through the manual </w:t>
+        <w:t>t more than three times that scale, it creates compounding strain: distribution list management requires contractor triage before requests reach the CPFR team; data freshness is limited to weekly snapshots while ISMs and vendors need mid-week visibility; and Chewy remains the sole handler of vendor-to-recipient mapping, creating exposure to misdirected proprietary data—a risk that materialized in January 2026 when dat</w:t>
+      </w:r>
+      <w:r>
+        <w:t xml:space="preserve">a for one vendor was released to an unrelated vendor through the manual </w:t>
       </w:r>
       <w:r>
         <w:t>onboarding</w:t>
@@ -859,12 +838,6 @@
         <w:gridCol w:w="3356"/>
       </w:tblGrid>
       <w:tr>
-        <w:tblPrEx>
-          <w:tblCellMar>
-            <w:top w:w="0" w:type="dxa"/>
-            <w:bottom w:w="0" w:type="dxa"/>
-          </w:tblCellMar>
-        </w:tblPrEx>
         <w:tc>
           <w:tcPr>
             <w:tcW w:w="3800" w:type="dxa"/>
@@ -955,12 +928,6 @@
         </w:tc>
       </w:tr>
       <w:tr>
-        <w:tblPrEx>
-          <w:tblCellMar>
-            <w:top w:w="0" w:type="dxa"/>
-            <w:bottom w:w="0" w:type="dxa"/>
-          </w:tblCellMar>
-        </w:tblPrEx>
         <w:tc>
           <w:tcPr>
             <w:tcW w:w="3800" w:type="dxa"/>
@@ -1029,12 +996,6 @@
         </w:tc>
       </w:tr>
       <w:tr>
-        <w:tblPrEx>
-          <w:tblCellMar>
-            <w:top w:w="0" w:type="dxa"/>
-            <w:bottom w:w="0" w:type="dxa"/>
-          </w:tblCellMar>
-        </w:tblPrEx>
         <w:tc>
           <w:tcPr>
             <w:tcW w:w="3800" w:type="dxa"/>
@@ -1103,12 +1064,6 @@
         </w:tc>
       </w:tr>
       <w:tr>
-        <w:tblPrEx>
-          <w:tblCellMar>
-            <w:top w:w="0" w:type="dxa"/>
-            <w:bottom w:w="0" w:type="dxa"/>
-          </w:tblCellMar>
-        </w:tblPrEx>
         <w:tc>
           <w:tcPr>
             <w:tcW w:w="3800" w:type="dxa"/>
@@ -1177,12 +1132,6 @@
         </w:tc>
       </w:tr>
       <w:tr>
-        <w:tblPrEx>
-          <w:tblCellMar>
-            <w:top w:w="0" w:type="dxa"/>
-            <w:bottom w:w="0" w:type="dxa"/>
-          </w:tblCellMar>
-        </w:tblPrEx>
         <w:tc>
           <w:tcPr>
             <w:tcW w:w="3800" w:type="dxa"/>
@@ -1251,12 +1200,6 @@
         </w:tc>
       </w:tr>
       <w:tr>
-        <w:tblPrEx>
-          <w:tblCellMar>
-            <w:top w:w="0" w:type="dxa"/>
-            <w:bottom w:w="0" w:type="dxa"/>
-          </w:tblCellMar>
-        </w:tblPrEx>
         <w:tc>
           <w:tcPr>
             <w:tcW w:w="3800" w:type="dxa"/>
@@ -1469,10 +1412,29 @@
     </w:p>
     <w:p>
       <w:pPr>
+        <w:pStyle w:val="Heading4"/>
+      </w:pPr>
+      <w:r>
+        <w:t xml:space="preserve">5.0.1 OP1 Submission: </w:t>
+      </w:r>
+      <w:hyperlink r:id="rId7" w:history="1">
+        <w:r>
+          <w:rPr>
+            <w:rStyle w:val="Hyperlink"/>
+          </w:rPr>
+          <w:t>2026 In-stock OP1—Vendor Facing Tools</w:t>
+        </w:r>
+      </w:hyperlink>
+    </w:p>
+    <w:p>
+      <w:pPr>
         <w:pStyle w:val="Heading3"/>
       </w:pPr>
       <w:r>
-        <w:t>5.1 What Has Already Been Done</w:t>
+        <w:t>5</w:t>
+      </w:r>
+      <w:r>
+        <w:t>.1 What Has Already Been Done</w:t>
       </w:r>
     </w:p>
     <w:p>
@@ -1567,6 +1529,7 @@
           <w:b/>
           <w:bCs/>
         </w:rPr>
+        <w:lastRenderedPageBreak/>
         <w:t>VC Data Pipeline Bridge:</w:t>
       </w:r>
       <w:r>
@@ -1597,12 +1560,27 @@
           <w:b/>
           <w:bCs/>
         </w:rPr>
-        <w:lastRenderedPageBreak/>
         <w:t>Entitlement Document:</w:t>
       </w:r>
       <w:r>
         <w:t xml:space="preserve"> Quantified value analysis on file with the OP1 submission.</w:t>
       </w:r>
+    </w:p>
+    <w:p>
+      <w:pPr>
+        <w:pStyle w:val="Heading4"/>
+      </w:pPr>
+      <w:r>
+        <w:t xml:space="preserve">5.1.1 CPFR Entitlement: </w:t>
+      </w:r>
+      <w:hyperlink r:id="rId8" w:history="1">
+        <w:r>
+          <w:rPr>
+            <w:rStyle w:val="Hyperlink"/>
+          </w:rPr>
+          <w:t>2026 CPFR-CPH Entitlement</w:t>
+        </w:r>
+      </w:hyperlink>
     </w:p>
     <w:p>
       <w:pPr>
@@ -1643,12 +1621,6 @@
         <w:gridCol w:w="3700"/>
       </w:tblGrid>
       <w:tr>
-        <w:tblPrEx>
-          <w:tblCellMar>
-            <w:top w:w="0" w:type="dxa"/>
-            <w:bottom w:w="0" w:type="dxa"/>
-          </w:tblCellMar>
-        </w:tblPrEx>
         <w:tc>
           <w:tcPr>
             <w:tcW w:w="3800" w:type="dxa"/>
@@ -1732,12 +1704,6 @@
         </w:tc>
       </w:tr>
       <w:tr>
-        <w:tblPrEx>
-          <w:tblCellMar>
-            <w:top w:w="0" w:type="dxa"/>
-            <w:bottom w:w="0" w:type="dxa"/>
-          </w:tblCellMar>
-        </w:tblPrEx>
         <w:tc>
           <w:tcPr>
             <w:tcW w:w="3800" w:type="dxa"/>
@@ -1812,12 +1778,6 @@
         </w:tc>
       </w:tr>
       <w:tr>
-        <w:tblPrEx>
-          <w:tblCellMar>
-            <w:top w:w="0" w:type="dxa"/>
-            <w:bottom w:w="0" w:type="dxa"/>
-          </w:tblCellMar>
-        </w:tblPrEx>
         <w:tc>
           <w:tcPr>
             <w:tcW w:w="3800" w:type="dxa"/>
@@ -1892,12 +1852,6 @@
         </w:tc>
       </w:tr>
       <w:tr>
-        <w:tblPrEx>
-          <w:tblCellMar>
-            <w:top w:w="0" w:type="dxa"/>
-            <w:bottom w:w="0" w:type="dxa"/>
-          </w:tblCellMar>
-        </w:tblPrEx>
         <w:tc>
           <w:tcPr>
             <w:tcW w:w="3800" w:type="dxa"/>
@@ -1916,15 +1870,7 @@
           </w:tcPr>
           <w:p>
             <w:r>
-              <w:t xml:space="preserve">Deliver requirements to Jeremy / </w:t>
-            </w:r>
-            <w:proofErr w:type="spellStart"/>
-            <w:r>
-              <w:t>Replen</w:t>
-            </w:r>
-            <w:proofErr w:type="spellEnd"/>
-            <w:r>
-              <w:t xml:space="preserve"> Eng for VC pipeline scoping</w:t>
+              <w:t>Deliver requirements to Jeremy / Replen Eng for VC pipeline scoping</w:t>
             </w:r>
           </w:p>
         </w:tc>
@@ -1974,12 +1920,6 @@
         </w:tc>
       </w:tr>
       <w:tr>
-        <w:tblPrEx>
-          <w:tblCellMar>
-            <w:top w:w="0" w:type="dxa"/>
-            <w:bottom w:w="0" w:type="dxa"/>
-          </w:tblCellMar>
-        </w:tblPrEx>
         <w:tc>
           <w:tcPr>
             <w:tcW w:w="3800" w:type="dxa"/>
@@ -2044,8 +1984,13 @@
             <w:r>
               <w:t>Requires CPH contact + platform delivery (</w:t>
             </w:r>
-            <w:r>
-              <w:t xml:space="preserve">on-target: </w:t>
+            <w:proofErr w:type="gramStart"/>
+            <w:r>
+              <w:t>on-target</w:t>
+            </w:r>
+            <w:proofErr w:type="gramEnd"/>
+            <w:r>
+              <w:t xml:space="preserve">: </w:t>
             </w:r>
             <w:r>
               <w:t>3/31).</w:t>
@@ -2054,12 +1999,6 @@
         </w:tc>
       </w:tr>
       <w:tr>
-        <w:tblPrEx>
-          <w:tblCellMar>
-            <w:top w:w="0" w:type="dxa"/>
-            <w:bottom w:w="0" w:type="dxa"/>
-          </w:tblCellMar>
-        </w:tblPrEx>
         <w:tc>
           <w:tcPr>
             <w:tcW w:w="3800" w:type="dxa"/>
@@ -2226,12 +2165,6 @@
         <w:gridCol w:w="2712"/>
       </w:tblGrid>
       <w:tr>
-        <w:tblPrEx>
-          <w:tblCellMar>
-            <w:top w:w="0" w:type="dxa"/>
-            <w:bottom w:w="0" w:type="dxa"/>
-          </w:tblCellMar>
-        </w:tblPrEx>
         <w:tc>
           <w:tcPr>
             <w:tcW w:w="3200" w:type="dxa"/>
@@ -2342,12 +2275,6 @@
         </w:tc>
       </w:tr>
       <w:tr>
-        <w:tblPrEx>
-          <w:tblCellMar>
-            <w:top w:w="0" w:type="dxa"/>
-            <w:bottom w:w="0" w:type="dxa"/>
-          </w:tblCellMar>
-        </w:tblPrEx>
         <w:tc>
           <w:tcPr>
             <w:tcW w:w="3200" w:type="dxa"/>
@@ -2439,12 +2366,6 @@
         </w:tc>
       </w:tr>
       <w:tr>
-        <w:tblPrEx>
-          <w:tblCellMar>
-            <w:top w:w="0" w:type="dxa"/>
-            <w:bottom w:w="0" w:type="dxa"/>
-          </w:tblCellMar>
-        </w:tblPrEx>
         <w:tc>
           <w:tcPr>
             <w:tcW w:w="3200" w:type="dxa"/>
@@ -2463,6 +2384,7 @@
           </w:tcPr>
           <w:p>
             <w:r>
+              <w:lastRenderedPageBreak/>
               <w:t>VC data pipeline work (SPARK bridge)</w:t>
             </w:r>
           </w:p>
@@ -2536,12 +2458,6 @@
         </w:tc>
       </w:tr>
       <w:tr>
-        <w:tblPrEx>
-          <w:tblCellMar>
-            <w:top w:w="0" w:type="dxa"/>
-            <w:bottom w:w="0" w:type="dxa"/>
-          </w:tblCellMar>
-        </w:tblPrEx>
         <w:tc>
           <w:tcPr>
             <w:tcW w:w="3200" w:type="dxa"/>
@@ -2636,12 +2552,6 @@
         </w:tc>
       </w:tr>
       <w:tr>
-        <w:tblPrEx>
-          <w:tblCellMar>
-            <w:top w:w="0" w:type="dxa"/>
-            <w:bottom w:w="0" w:type="dxa"/>
-          </w:tblCellMar>
-        </w:tblPrEx>
         <w:tc>
           <w:tcPr>
             <w:tcW w:w="3200" w:type="dxa"/>
@@ -2660,7 +2570,6 @@
           </w:tcPr>
           <w:p>
             <w:r>
-              <w:lastRenderedPageBreak/>
               <w:t>Requirements delivered to CPH Eng for LOE estimation</w:t>
             </w:r>
           </w:p>
@@ -2734,12 +2643,6 @@
         </w:tc>
       </w:tr>
       <w:tr>
-        <w:tblPrEx>
-          <w:tblCellMar>
-            <w:top w:w="0" w:type="dxa"/>
-            <w:bottom w:w="0" w:type="dxa"/>
-          </w:tblCellMar>
-        </w:tblPrEx>
         <w:tc>
           <w:tcPr>
             <w:tcW w:w="3200" w:type="dxa"/>
@@ -2758,15 +2661,7 @@
           </w:tcPr>
           <w:p>
             <w:r>
-              <w:t xml:space="preserve">Requirements delivered to Jeremy / </w:t>
-            </w:r>
-            <w:proofErr w:type="spellStart"/>
-            <w:r>
-              <w:t>Replen</w:t>
-            </w:r>
-            <w:proofErr w:type="spellEnd"/>
-            <w:r>
-              <w:t xml:space="preserve"> Eng for VC LOE</w:t>
+              <w:t>Requirements delivered to Jeremy / Replen Eng for VC LOE</w:t>
             </w:r>
           </w:p>
         </w:tc>
@@ -2839,12 +2734,6 @@
         </w:tc>
       </w:tr>
       <w:tr>
-        <w:tblPrEx>
-          <w:tblCellMar>
-            <w:top w:w="0" w:type="dxa"/>
-            <w:bottom w:w="0" w:type="dxa"/>
-          </w:tblCellMar>
-        </w:tblPrEx>
         <w:tc>
           <w:tcPr>
             <w:tcW w:w="3200" w:type="dxa"/>
@@ -2936,12 +2825,6 @@
         </w:tc>
       </w:tr>
       <w:tr>
-        <w:tblPrEx>
-          <w:tblCellMar>
-            <w:top w:w="0" w:type="dxa"/>
-            <w:bottom w:w="0" w:type="dxa"/>
-          </w:tblCellMar>
-        </w:tblPrEx>
         <w:tc>
           <w:tcPr>
             <w:tcW w:w="3200" w:type="dxa"/>
@@ -3033,12 +2916,6 @@
         </w:tc>
       </w:tr>
       <w:tr>
-        <w:tblPrEx>
-          <w:tblCellMar>
-            <w:top w:w="0" w:type="dxa"/>
-            <w:bottom w:w="0" w:type="dxa"/>
-          </w:tblCellMar>
-        </w:tblPrEx>
         <w:tc>
           <w:tcPr>
             <w:tcW w:w="3200" w:type="dxa"/>
@@ -3130,12 +3007,6 @@
         </w:tc>
       </w:tr>
       <w:tr>
-        <w:tblPrEx>
-          <w:tblCellMar>
-            <w:top w:w="0" w:type="dxa"/>
-            <w:bottom w:w="0" w:type="dxa"/>
-          </w:tblCellMar>
-        </w:tblPrEx>
         <w:tc>
           <w:tcPr>
             <w:tcW w:w="3200" w:type="dxa"/>
@@ -3227,12 +3098,6 @@
         </w:tc>
       </w:tr>
       <w:tr>
-        <w:tblPrEx>
-          <w:tblCellMar>
-            <w:top w:w="0" w:type="dxa"/>
-            <w:bottom w:w="0" w:type="dxa"/>
-          </w:tblCellMar>
-        </w:tblPrEx>
         <w:tc>
           <w:tcPr>
             <w:tcW w:w="3200" w:type="dxa"/>
@@ -3324,12 +3189,6 @@
         </w:tc>
       </w:tr>
       <w:tr>
-        <w:tblPrEx>
-          <w:tblCellMar>
-            <w:top w:w="0" w:type="dxa"/>
-            <w:bottom w:w="0" w:type="dxa"/>
-          </w:tblCellMar>
-        </w:tblPrEx>
         <w:tc>
           <w:tcPr>
             <w:tcW w:w="3200" w:type="dxa"/>
@@ -3421,12 +3280,6 @@
         </w:tc>
       </w:tr>
       <w:tr>
-        <w:tblPrEx>
-          <w:tblCellMar>
-            <w:top w:w="0" w:type="dxa"/>
-            <w:bottom w:w="0" w:type="dxa"/>
-          </w:tblCellMar>
-        </w:tblPrEx>
         <w:tc>
           <w:tcPr>
             <w:tcW w:w="3200" w:type="dxa"/>
@@ -3525,12 +3378,6 @@
         </w:tc>
       </w:tr>
       <w:tr>
-        <w:tblPrEx>
-          <w:tblCellMar>
-            <w:top w:w="0" w:type="dxa"/>
-            <w:bottom w:w="0" w:type="dxa"/>
-          </w:tblCellMar>
-        </w:tblPrEx>
         <w:tc>
           <w:tcPr>
             <w:tcW w:w="3200" w:type="dxa"/>
@@ -3625,12 +3472,6 @@
         </w:tc>
       </w:tr>
       <w:tr>
-        <w:tblPrEx>
-          <w:tblCellMar>
-            <w:top w:w="0" w:type="dxa"/>
-            <w:bottom w:w="0" w:type="dxa"/>
-          </w:tblCellMar>
-        </w:tblPrEx>
         <w:tc>
           <w:tcPr>
             <w:tcW w:w="3200" w:type="dxa"/>
@@ -3725,12 +3566,6 @@
         </w:tc>
       </w:tr>
       <w:tr>
-        <w:tblPrEx>
-          <w:tblCellMar>
-            <w:top w:w="0" w:type="dxa"/>
-            <w:bottom w:w="0" w:type="dxa"/>
-          </w:tblCellMar>
-        </w:tblPrEx>
         <w:tc>
           <w:tcPr>
             <w:tcW w:w="3200" w:type="dxa"/>
@@ -3825,12 +3660,6 @@
         </w:tc>
       </w:tr>
       <w:tr>
-        <w:tblPrEx>
-          <w:tblCellMar>
-            <w:top w:w="0" w:type="dxa"/>
-            <w:bottom w:w="0" w:type="dxa"/>
-          </w:tblCellMar>
-        </w:tblPrEx>
         <w:tc>
           <w:tcPr>
             <w:tcW w:w="3200" w:type="dxa"/>
@@ -3925,12 +3754,6 @@
         </w:tc>
       </w:tr>
       <w:tr>
-        <w:tblPrEx>
-          <w:tblCellMar>
-            <w:top w:w="0" w:type="dxa"/>
-            <w:bottom w:w="0" w:type="dxa"/>
-          </w:tblCellMar>
-        </w:tblPrEx>
         <w:tc>
           <w:tcPr>
             <w:tcW w:w="3200" w:type="dxa"/>
@@ -3995,13 +3818,8 @@
             </w:tcMar>
           </w:tcPr>
           <w:p>
-            <w:proofErr w:type="spellStart"/>
-            <w:r>
-              <w:t>Replen</w:t>
-            </w:r>
-            <w:proofErr w:type="spellEnd"/>
-            <w:r>
-              <w:t xml:space="preserve"> Tech EDS partnership</w:t>
+            <w:r>
+              <w:t>Replen Tech EDS partnership</w:t>
             </w:r>
           </w:p>
         </w:tc>
@@ -4030,12 +3848,6 @@
         </w:tc>
       </w:tr>
       <w:tr>
-        <w:tblPrEx>
-          <w:tblCellMar>
-            <w:top w:w="0" w:type="dxa"/>
-            <w:bottom w:w="0" w:type="dxa"/>
-          </w:tblCellMar>
-        </w:tblPrEx>
         <w:tc>
           <w:tcPr>
             <w:tcW w:w="3200" w:type="dxa"/>
@@ -4130,12 +3942,6 @@
         </w:tc>
       </w:tr>
       <w:tr>
-        <w:tblPrEx>
-          <w:tblCellMar>
-            <w:top w:w="0" w:type="dxa"/>
-            <w:bottom w:w="0" w:type="dxa"/>
-          </w:tblCellMar>
-        </w:tblPrEx>
         <w:tc>
           <w:tcPr>
             <w:tcW w:w="3200" w:type="dxa"/>
@@ -4230,12 +4036,6 @@
         </w:tc>
       </w:tr>
       <w:tr>
-        <w:tblPrEx>
-          <w:tblCellMar>
-            <w:top w:w="0" w:type="dxa"/>
-            <w:bottom w:w="0" w:type="dxa"/>
-          </w:tblCellMar>
-        </w:tblPrEx>
         <w:tc>
           <w:tcPr>
             <w:tcW w:w="3200" w:type="dxa"/>
@@ -4330,12 +4130,6 @@
         </w:tc>
       </w:tr>
       <w:tr>
-        <w:tblPrEx>
-          <w:tblCellMar>
-            <w:top w:w="0" w:type="dxa"/>
-            <w:bottom w:w="0" w:type="dxa"/>
-          </w:tblCellMar>
-        </w:tblPrEx>
         <w:tc>
           <w:tcPr>
             <w:tcW w:w="3200" w:type="dxa"/>
@@ -4355,6 +4149,7 @@
           </w:tcPr>
           <w:p>
             <w:r>
+              <w:lastRenderedPageBreak/>
               <w:t>SKU/FC-grain semantic table (SC-BIE)</w:t>
             </w:r>
           </w:p>
@@ -4430,12 +4225,6 @@
         </w:tc>
       </w:tr>
       <w:tr>
-        <w:tblPrEx>
-          <w:tblCellMar>
-            <w:top w:w="0" w:type="dxa"/>
-            <w:bottom w:w="0" w:type="dxa"/>
-          </w:tblCellMar>
-        </w:tblPrEx>
         <w:tc>
           <w:tcPr>
             <w:tcW w:w="3200" w:type="dxa"/>
@@ -4455,7 +4244,6 @@
           </w:tcPr>
           <w:p>
             <w:r>
-              <w:lastRenderedPageBreak/>
               <w:t>Tier 1 module extensions + API access framework</w:t>
             </w:r>
           </w:p>
@@ -4570,12 +4358,6 @@
         <w:gridCol w:w="4156"/>
       </w:tblGrid>
       <w:tr>
-        <w:tblPrEx>
-          <w:tblCellMar>
-            <w:top w:w="0" w:type="dxa"/>
-            <w:bottom w:w="0" w:type="dxa"/>
-          </w:tblCellMar>
-        </w:tblPrEx>
         <w:tc>
           <w:tcPr>
             <w:tcW w:w="2200" w:type="dxa"/>
@@ -4659,12 +4441,6 @@
         </w:tc>
       </w:tr>
       <w:tr>
-        <w:tblPrEx>
-          <w:tblCellMar>
-            <w:top w:w="0" w:type="dxa"/>
-            <w:bottom w:w="0" w:type="dxa"/>
-          </w:tblCellMar>
-        </w:tblPrEx>
         <w:tc>
           <w:tcPr>
             <w:tcW w:w="2200" w:type="dxa"/>
@@ -4743,12 +4519,6 @@
         </w:tc>
       </w:tr>
       <w:tr>
-        <w:tblPrEx>
-          <w:tblCellMar>
-            <w:top w:w="0" w:type="dxa"/>
-            <w:bottom w:w="0" w:type="dxa"/>
-          </w:tblCellMar>
-        </w:tblPrEx>
         <w:tc>
           <w:tcPr>
             <w:tcW w:w="2200" w:type="dxa"/>
@@ -4827,12 +4597,6 @@
         </w:tc>
       </w:tr>
       <w:tr>
-        <w:tblPrEx>
-          <w:tblCellMar>
-            <w:top w:w="0" w:type="dxa"/>
-            <w:bottom w:w="0" w:type="dxa"/>
-          </w:tblCellMar>
-        </w:tblPrEx>
         <w:tc>
           <w:tcPr>
             <w:tcW w:w="2200" w:type="dxa"/>
@@ -4905,12 +4669,6 @@
         </w:tc>
       </w:tr>
       <w:tr>
-        <w:tblPrEx>
-          <w:tblCellMar>
-            <w:top w:w="0" w:type="dxa"/>
-            <w:bottom w:w="0" w:type="dxa"/>
-          </w:tblCellMar>
-        </w:tblPrEx>
         <w:tc>
           <w:tcPr>
             <w:tcW w:w="2200" w:type="dxa"/>
@@ -4983,12 +4741,6 @@
         </w:tc>
       </w:tr>
       <w:tr>
-        <w:tblPrEx>
-          <w:tblCellMar>
-            <w:top w:w="0" w:type="dxa"/>
-            <w:bottom w:w="0" w:type="dxa"/>
-          </w:tblCellMar>
-        </w:tblPrEx>
         <w:tc>
           <w:tcPr>
             <w:tcW w:w="2200" w:type="dxa"/>
@@ -5108,6 +4860,9 @@
       <w:r>
         <w:t>6.4 Critical Constraint</w:t>
       </w:r>
+      <w:r>
+        <w:t>(s)</w:t>
+      </w:r>
     </w:p>
     <w:p>
       <w:pPr>
@@ -5125,10 +4880,10 @@
       </w:r>
     </w:p>
     <w:sectPr>
-      <w:headerReference w:type="default" r:id="rId7"/>
-      <w:footerReference w:type="default" r:id="rId8"/>
+      <w:headerReference w:type="default" r:id="rId9"/>
+      <w:footerReference w:type="default" r:id="rId10"/>
       <w:pgSz w:w="12240" w:h="15840"/>
-      <w:pgMar w:top="720" w:right="720" w:bottom="720" w:left="720" w:header="288" w:footer="288" w:gutter="288"/>
+      <w:pgMar w:top="720" w:right="720" w:bottom="720" w:left="720" w:header="432" w:footer="432" w:gutter="288"/>
       <w:lnNumType w:countBy="1" w:distance="360"/>
       <w:cols w:space="720"/>
       <w:docGrid w:linePitch="360"/>
@@ -5271,7 +5026,7 @@
       <w:tabs>
         <w:tab w:val="right" w:pos="10512"/>
       </w:tabs>
-      <w:spacing w:after="60"/>
+      <w:spacing w:after="120"/>
     </w:pPr>
     <w:r>
       <w:rPr>
@@ -6255,7 +6010,6 @@
   <w:style w:type="paragraph" w:styleId="Heading4">
     <w:name w:val="heading 4"/>
     <w:uiPriority w:val="9"/>
-    <w:semiHidden/>
     <w:unhideWhenUsed/>
     <w:qFormat/>
     <w:pPr>
@@ -6410,6 +6164,62 @@
       <w:spacing w:before="120" w:after="120"/>
       <w:contextualSpacing/>
     </w:pPr>
+  </w:style>
+  <w:style w:type="paragraph" w:styleId="Header">
+    <w:name w:val="header"/>
+    <w:basedOn w:val="Normal"/>
+    <w:link w:val="HeaderChar"/>
+    <w:uiPriority w:val="99"/>
+    <w:unhideWhenUsed/>
+    <w:rsid w:val="00BA5DC9"/>
+    <w:pPr>
+      <w:tabs>
+        <w:tab w:val="center" w:pos="4680"/>
+        <w:tab w:val="right" w:pos="9360"/>
+      </w:tabs>
+      <w:spacing w:line="240" w:lineRule="auto"/>
+    </w:pPr>
+  </w:style>
+  <w:style w:type="character" w:customStyle="1" w:styleId="HeaderChar">
+    <w:name w:val="Header Char"/>
+    <w:basedOn w:val="DefaultParagraphFont"/>
+    <w:link w:val="Header"/>
+    <w:uiPriority w:val="99"/>
+    <w:rsid w:val="00BA5DC9"/>
+  </w:style>
+  <w:style w:type="paragraph" w:styleId="Footer">
+    <w:name w:val="footer"/>
+    <w:basedOn w:val="Normal"/>
+    <w:link w:val="FooterChar"/>
+    <w:uiPriority w:val="99"/>
+    <w:unhideWhenUsed/>
+    <w:rsid w:val="00BA5DC9"/>
+    <w:pPr>
+      <w:tabs>
+        <w:tab w:val="center" w:pos="4680"/>
+        <w:tab w:val="right" w:pos="9360"/>
+      </w:tabs>
+      <w:spacing w:line="240" w:lineRule="auto"/>
+    </w:pPr>
+  </w:style>
+  <w:style w:type="character" w:customStyle="1" w:styleId="FooterChar">
+    <w:name w:val="Footer Char"/>
+    <w:basedOn w:val="DefaultParagraphFont"/>
+    <w:link w:val="Footer"/>
+    <w:uiPriority w:val="99"/>
+    <w:rsid w:val="00BA5DC9"/>
+  </w:style>
+  <w:style w:type="character" w:styleId="UnresolvedMention">
+    <w:name w:val="Unresolved Mention"/>
+    <w:basedOn w:val="DefaultParagraphFont"/>
+    <w:uiPriority w:val="99"/>
+    <w:semiHidden/>
+    <w:unhideWhenUsed/>
+    <w:rsid w:val="00CC076E"/>
+    <w:rPr>
+      <w:color w:val="605E5C"/>
+      <w:shd w:val="clear" w:color="auto" w:fill="E1DFDD"/>
+    </w:rPr>
   </w:style>
 </w:styles>
 </file>
@@ -6727,4 +6537,10 @@
     </a:ext>
   </a:extLst>
 </a:theme>
+</file>
+
+<file path=docMetadata/LabelInfo.xml><?xml version="1.0" encoding="utf-8"?>
+<clbl:labelList xmlns:clbl="http://schemas.microsoft.com/office/2020/mipLabelMetadata">
+  <clbl:label id="{99879b8e-3b16-427d-902a-05eda342f629}" enabled="0" method="" siteId="{99879b8e-3b16-427d-902a-05eda342f629}" removed="1"/>
+</clbl:labelList>
 </file>
</xml_diff>

<commit_message>
Batch add & roadmap update
</commit_message>
<xml_diff>
--- a/CPFR_VDS_CPH_Docs/TPM/CPFR_VC_CPH_Roadmap_v0_4.docx
+++ b/CPFR_VDS_CPH_Docs/TPM/CPFR_VC_CPH_Roadmap_v0_4.docx
@@ -294,7 +294,39 @@
         <w:spacing w:before="120" w:after="120"/>
       </w:pPr>
       <w:r>
-        <w:t>One of the hardest key investments has already been made. The CPFR data platform—a Snowflake-based semantic layer with vendor isolation, daily refresh, and data lineage—delivers on 3/31/2026 at network grain, covering 98.4% of active vendors. he VC/Chargeback workstream has secured engineering support through Jeremy Wartnick for its SPARK-related data pipeline needs. What is missing for both workstreams is the same thing: CPH integration capacity to surface this data to vendors through a governed portal experience.</w:t>
+        <w:t xml:space="preserve">One of the hardest key investments has already been made. The CPFR data platform—a Snowflake-based semantic layer with vendor isolation, daily refresh, and data lineage—delivers on 3/31/2026 at network grain, covering 98.4% of active vendors. </w:t>
+      </w:r>
+      <w:r>
+        <w:t>T</w:t>
+      </w:r>
+      <w:r>
+        <w:t xml:space="preserve">he VC/Chargeback workstream has secured engineering support through </w:t>
+      </w:r>
+      <w:commentRangeStart w:id="0"/>
+      <w:commentRangeStart w:id="1"/>
+      <w:r>
+        <w:t>Jeremy Wartnick f</w:t>
+      </w:r>
+      <w:commentRangeEnd w:id="0"/>
+      <w:r>
+        <w:rPr>
+          <w:rStyle w:val="CommentReference"/>
+          <w:sz w:val="20"/>
+          <w:szCs w:val="20"/>
+        </w:rPr>
+        <w:commentReference w:id="0"/>
+      </w:r>
+      <w:commentRangeEnd w:id="1"/>
+      <w:r>
+        <w:rPr>
+          <w:rStyle w:val="CommentReference"/>
+          <w:sz w:val="20"/>
+          <w:szCs w:val="20"/>
+        </w:rPr>
+        <w:commentReference w:id="1"/>
+      </w:r>
+      <w:r>
+        <w:t>or its SPARK-related data pipeline needs. What is missing for both workstreams is the same thing: CPH integration capacity to surface this data to vendors through a governed portal experience.</w:t>
       </w:r>
     </w:p>
     <w:p>
@@ -341,7 +373,16 @@
         <w:spacing w:before="120" w:after="120"/>
       </w:pPr>
       <w:r>
-        <w:t>CPFR (Collaborative Planning, Forecasting &amp; Replenishment) provides the shared data substrate for vendor collaboration across Chewy’s In-Stock organization. ISM vendor-facing work—from order planning to performance monitoring to joint business reviews—depends on CPFR data as a primary input. The program currently serves more than 3,200 vendors with line-of-sight to 4,150+.</w:t>
+        <w:t xml:space="preserve">CPFR (Collaborative Planning, Forecasting &amp; Replenishment) provides the shared data substrate for vendor collaboration across Chewy’s In-Stock organization. ISM vendor-facing work—from order planning to performance monitoring to joint business reviews—depends on CPFR data as a primary input. The </w:t>
+      </w:r>
+      <w:r>
+        <w:rPr>
+          <w:highlight w:val="yellow"/>
+        </w:rPr>
+        <w:t>program currently serves more than 3,200 vendors</w:t>
+      </w:r>
+      <w:r>
+        <w:t xml:space="preserve"> with line-of-sight to 4,150+.</w:t>
       </w:r>
     </w:p>
     <w:p>
@@ -361,10 +402,7 @@
         <w:t>Now a</w:t>
       </w:r>
       <w:r>
-        <w:t>t more than three times that scale, it creates compounding strain: distribution list management requires contractor triage before requests reach the CPFR team; data freshness is limited to weekly snapshots while ISMs and vendors need mid-week visibility; and Chewy remains the sole handler of vendor-to-recipient mapping, creating exposure to misdirected proprietary data—a risk that materialized in January 2026 when dat</w:t>
-      </w:r>
-      <w:r>
-        <w:t xml:space="preserve">a for one vendor was released to an unrelated vendor through the manual </w:t>
+        <w:t xml:space="preserve">t more than three times that scale, it creates compounding strain: distribution list management requires contractor triage before requests reach the CPFR team; data freshness is limited to weekly snapshots while ISMs and vendors need mid-week visibility; and Chewy remains the sole handler of vendor-to-recipient mapping, creating exposure to misdirected proprietary data—a risk that materialized in January 2026 when data for one vendor was released to an unrelated vendor through the manual </w:t>
       </w:r>
       <w:r>
         <w:t>onboarding</w:t>
@@ -398,7 +436,43 @@
         <w:t>e</w:t>
       </w:r>
       <w:r>
-        <w:t xml:space="preserve"> vendors structured, self-service access to chargeback and violation data through CPH. Today, chargeback disputes generate approximately 1,500 Oracle CRM tickets annually, consuming operational capacity across multiple teams. The VC integration into CPH would enable vendor self-service for dispute resolution, expanded chargeback categories, and integrated compliance metrics in ISM discussions.</w:t>
+        <w:t xml:space="preserve"> vendors structured, self-service access to chargeback and violation data through CPH. Today, chargeback disputes generate approximately 1,500 Oracle CRM tickets annually, consuming operational capacity across multiple teams. The VC integration into CPH would enable vendor self-service for dispute resolution, </w:t>
+      </w:r>
+      <w:commentRangeStart w:id="2"/>
+      <w:commentRangeStart w:id="3"/>
+      <w:commentRangeStart w:id="4"/>
+      <w:r>
+        <w:t xml:space="preserve">expanded chargeback categories, </w:t>
+      </w:r>
+      <w:commentRangeEnd w:id="2"/>
+      <w:r>
+        <w:rPr>
+          <w:rStyle w:val="CommentReference"/>
+          <w:sz w:val="20"/>
+          <w:szCs w:val="20"/>
+        </w:rPr>
+        <w:commentReference w:id="2"/>
+      </w:r>
+      <w:commentRangeEnd w:id="3"/>
+      <w:r>
+        <w:rPr>
+          <w:rStyle w:val="CommentReference"/>
+          <w:sz w:val="20"/>
+          <w:szCs w:val="20"/>
+        </w:rPr>
+        <w:commentReference w:id="3"/>
+      </w:r>
+      <w:commentRangeEnd w:id="4"/>
+      <w:r>
+        <w:rPr>
+          <w:rStyle w:val="CommentReference"/>
+          <w:sz w:val="20"/>
+          <w:szCs w:val="20"/>
+        </w:rPr>
+        <w:commentReference w:id="4"/>
+      </w:r>
+      <w:r>
+        <w:t>and integrated compliance metrics in ISM discussions.</w:t>
       </w:r>
     </w:p>
     <w:p>
@@ -406,7 +480,6 @@
         <w:spacing w:before="120" w:after="120"/>
       </w:pPr>
       <w:r>
-        <w:lastRenderedPageBreak/>
         <w:t>Nathan Nelson (Supply Chain Optimization, reporting to Keinan Zanck) leads the VC workstream. The VC and CPFR workstreams share a consolidated BRD co-authored by both Nathans, reflecting a deliberate coordination strategy that addresses the vendor experience fragmentation concern raised by Sr. Director Richard Neely.</w:t>
       </w:r>
     </w:p>
@@ -504,7 +577,32 @@
         <w:t>Data Layer (CPFR):</w:t>
       </w:r>
       <w:r>
-        <w:t xml:space="preserve"> The SC-BIE CPFR data platform is on track for 3/31/2026 delivery at network grain. This covers Tiers 2 and 3 (98.4% of the active vendor base). The platform provides vendor isolation</w:t>
+        <w:t xml:space="preserve"> The SC-BIE CPFR data platform </w:t>
+      </w:r>
+      <w:r>
+        <w:rPr>
+          <w:highlight w:val="yellow"/>
+        </w:rPr>
+        <w:t>is on track for 3/31/2026</w:t>
+      </w:r>
+      <w:r>
+        <w:t xml:space="preserve"> delivery at network grain. </w:t>
+      </w:r>
+      <w:commentRangeStart w:id="5"/>
+      <w:r>
+        <w:t>This covers Tiers 2 and 3 (98.4% of the active vendor base).</w:t>
+      </w:r>
+      <w:commentRangeEnd w:id="5"/>
+      <w:r>
+        <w:rPr>
+          <w:rStyle w:val="CommentReference"/>
+          <w:sz w:val="20"/>
+          <w:szCs w:val="20"/>
+        </w:rPr>
+        <w:commentReference w:id="5"/>
+      </w:r>
+      <w:r>
+        <w:t xml:space="preserve"> The platform provides vendor isolation</w:t>
       </w:r>
       <w:r>
         <w:t xml:space="preserve"> compatibility</w:t>
@@ -570,30 +668,60 @@
         <w:t>proceed</w:t>
       </w:r>
       <w:r>
-        <w:t xml:space="preserve">. In parallel, both </w:t>
-      </w:r>
-      <w:r>
+        <w:t xml:space="preserve">. </w:t>
+      </w:r>
+      <w:r>
+        <w:rPr>
+          <w:highlight w:val="yellow"/>
+        </w:rPr>
+        <w:t xml:space="preserve">In parallel, both </w:t>
+      </w:r>
+      <w:r>
+        <w:rPr>
+          <w:highlight w:val="yellow"/>
+        </w:rPr>
         <w:t>CPFR and VC</w:t>
       </w:r>
       <w:r>
+        <w:rPr>
+          <w:highlight w:val="yellow"/>
+        </w:rPr>
         <w:t xml:space="preserve"> are</w:t>
       </w:r>
       <w:r>
+        <w:rPr>
+          <w:highlight w:val="yellow"/>
+        </w:rPr>
         <w:t xml:space="preserve"> also</w:t>
       </w:r>
       <w:r>
+        <w:rPr>
+          <w:highlight w:val="yellow"/>
+        </w:rPr>
         <w:t xml:space="preserve"> developing additional capabilities—including AI-assisted ISM/vendor communication tools, advanced data distillation for ISM workflows (Apollo), and signal-based alerting—</w:t>
       </w:r>
       <w:r>
+        <w:rPr>
+          <w:highlight w:val="yellow"/>
+        </w:rPr>
         <w:t>features which</w:t>
       </w:r>
       <w:r>
+        <w:rPr>
+          <w:highlight w:val="yellow"/>
+        </w:rPr>
         <w:t xml:space="preserve"> are</w:t>
       </w:r>
       <w:r>
+        <w:rPr>
+          <w:highlight w:val="yellow"/>
+        </w:rPr>
         <w:t xml:space="preserve"> also</w:t>
       </w:r>
       <w:r>
+        <w:rPr>
+          <w:highlight w:val="yellow"/>
+        </w:rPr>
         <w:t xml:space="preserve"> candidates for future CPH integration.</w:t>
       </w:r>
     </w:p>
@@ -722,7 +850,30 @@
         <w:pStyle w:val="Heading3"/>
       </w:pPr>
       <w:r>
-        <w:t>4.2 What Is Missing</w:t>
+        <w:t xml:space="preserve">4.2 </w:t>
+      </w:r>
+      <w:commentRangeStart w:id="6"/>
+      <w:commentRangeStart w:id="7"/>
+      <w:r>
+        <w:t>What Is Missing</w:t>
+      </w:r>
+      <w:commentRangeEnd w:id="6"/>
+      <w:r>
+        <w:rPr>
+          <w:rStyle w:val="CommentReference"/>
+          <w:sz w:val="24"/>
+          <w:szCs w:val="24"/>
+        </w:rPr>
+        <w:commentReference w:id="6"/>
+      </w:r>
+      <w:commentRangeEnd w:id="7"/>
+      <w:r>
+        <w:rPr>
+          <w:rStyle w:val="CommentReference"/>
+          <w:sz w:val="24"/>
+          <w:szCs w:val="24"/>
+        </w:rPr>
+        <w:commentReference w:id="7"/>
       </w:r>
     </w:p>
     <w:p>
@@ -742,7 +893,6 @@
           <w:b/>
           <w:bCs/>
         </w:rPr>
-        <w:lastRenderedPageBreak/>
         <w:t>CPH Engineering Capacity:</w:t>
       </w:r>
       <w:r>
@@ -796,6 +946,7 @@
       <w:pPr>
         <w:pStyle w:val="ListBullet"/>
       </w:pPr>
+      <w:commentRangeStart w:id="8"/>
       <w:r>
         <w:rPr>
           <w:b/>
@@ -806,13 +957,35 @@
       <w:r>
         <w:t xml:space="preserve"> The cross-team coordination function is currently carried on allocation. Whether this is sustainable through delivery is an open question.</w:t>
       </w:r>
+      <w:commentRangeEnd w:id="8"/>
+      <w:r>
+        <w:rPr>
+          <w:rStyle w:val="CommentReference"/>
+          <w:sz w:val="20"/>
+          <w:szCs w:val="20"/>
+        </w:rPr>
+        <w:commentReference w:id="8"/>
+      </w:r>
     </w:p>
     <w:p>
       <w:pPr>
         <w:pStyle w:val="Heading3"/>
       </w:pPr>
       <w:r>
-        <w:t>4.3 Entitlement</w:t>
+        <w:t>4.</w:t>
+      </w:r>
+      <w:commentRangeStart w:id="9"/>
+      <w:r>
+        <w:t>3 Entitlement</w:t>
+      </w:r>
+      <w:commentRangeEnd w:id="9"/>
+      <w:r>
+        <w:rPr>
+          <w:rStyle w:val="CommentReference"/>
+          <w:sz w:val="24"/>
+          <w:szCs w:val="24"/>
+        </w:rPr>
+        <w:commentReference w:id="9"/>
       </w:r>
     </w:p>
     <w:tbl>
@@ -842,12 +1015,12 @@
           <w:tcPr>
             <w:tcW w:w="3800" w:type="dxa"/>
             <w:tcBorders>
-              <w:top w:val="single" w:sz="4" w:space="0" w:color="BFBFBF"/>
-              <w:left w:val="single" w:sz="4" w:space="0" w:color="BFBFBF"/>
-              <w:bottom w:val="single" w:sz="4" w:space="0" w:color="BFBFBF"/>
-              <w:right w:val="single" w:sz="4" w:space="0" w:color="BFBFBF"/>
-            </w:tcBorders>
-            <w:shd w:val="clear" w:color="auto" w:fill="D9D9D9"/>
+              <w:top w:val="single" w:sz="4" w:space="0" w:color="BFBFBF" w:themeColor="background1" w:themeShade="BF"/>
+              <w:left w:val="single" w:sz="4" w:space="0" w:color="BFBFBF" w:themeColor="background1" w:themeShade="BF"/>
+              <w:bottom w:val="single" w:sz="4" w:space="0" w:color="BFBFBF" w:themeColor="background1" w:themeShade="BF"/>
+              <w:right w:val="single" w:sz="4" w:space="0" w:color="BFBFBF" w:themeColor="background1" w:themeShade="BF"/>
+            </w:tcBorders>
+            <w:shd w:val="clear" w:color="auto" w:fill="D9D9D9" w:themeFill="background1" w:themeFillShade="D9"/>
             <w:tcMar>
               <w:top w:w="58" w:type="dxa"/>
               <w:left w:w="100" w:type="dxa"/>
@@ -869,12 +1042,12 @@
           <w:tcPr>
             <w:tcW w:w="3356" w:type="dxa"/>
             <w:tcBorders>
-              <w:top w:val="single" w:sz="4" w:space="0" w:color="BFBFBF"/>
-              <w:left w:val="single" w:sz="4" w:space="0" w:color="BFBFBF"/>
-              <w:bottom w:val="single" w:sz="4" w:space="0" w:color="BFBFBF"/>
-              <w:right w:val="single" w:sz="4" w:space="0" w:color="BFBFBF"/>
-            </w:tcBorders>
-            <w:shd w:val="clear" w:color="auto" w:fill="D9D9D9"/>
+              <w:top w:val="single" w:sz="4" w:space="0" w:color="BFBFBF" w:themeColor="background1" w:themeShade="BF"/>
+              <w:left w:val="single" w:sz="4" w:space="0" w:color="BFBFBF" w:themeColor="background1" w:themeShade="BF"/>
+              <w:bottom w:val="single" w:sz="4" w:space="0" w:color="BFBFBF" w:themeColor="background1" w:themeShade="BF"/>
+              <w:right w:val="single" w:sz="4" w:space="0" w:color="BFBFBF" w:themeColor="background1" w:themeShade="BF"/>
+            </w:tcBorders>
+            <w:shd w:val="clear" w:color="auto" w:fill="D9D9D9" w:themeFill="background1" w:themeFillShade="D9"/>
             <w:tcMar>
               <w:top w:w="58" w:type="dxa"/>
               <w:left w:w="100" w:type="dxa"/>
@@ -903,12 +1076,12 @@
           <w:tcPr>
             <w:tcW w:w="3356" w:type="dxa"/>
             <w:tcBorders>
-              <w:top w:val="single" w:sz="4" w:space="0" w:color="BFBFBF"/>
-              <w:left w:val="single" w:sz="4" w:space="0" w:color="BFBFBF"/>
-              <w:bottom w:val="single" w:sz="4" w:space="0" w:color="BFBFBF"/>
-              <w:right w:val="single" w:sz="4" w:space="0" w:color="BFBFBF"/>
-            </w:tcBorders>
-            <w:shd w:val="clear" w:color="auto" w:fill="D9D9D9"/>
+              <w:top w:val="single" w:sz="4" w:space="0" w:color="BFBFBF" w:themeColor="background1" w:themeShade="BF"/>
+              <w:left w:val="single" w:sz="4" w:space="0" w:color="BFBFBF" w:themeColor="background1" w:themeShade="BF"/>
+              <w:bottom w:val="single" w:sz="4" w:space="0" w:color="BFBFBF" w:themeColor="background1" w:themeShade="BF"/>
+              <w:right w:val="single" w:sz="4" w:space="0" w:color="BFBFBF" w:themeColor="background1" w:themeShade="BF"/>
+            </w:tcBorders>
+            <w:shd w:val="clear" w:color="auto" w:fill="D9D9D9" w:themeFill="background1" w:themeFillShade="D9"/>
             <w:tcMar>
               <w:top w:w="58" w:type="dxa"/>
               <w:left w:w="100" w:type="dxa"/>
@@ -932,19 +1105,20 @@
           <w:tcPr>
             <w:tcW w:w="3800" w:type="dxa"/>
             <w:tcBorders>
-              <w:top w:val="single" w:sz="4" w:space="0" w:color="BFBFBF"/>
-              <w:left w:val="single" w:sz="4" w:space="0" w:color="BFBFBF"/>
-              <w:bottom w:val="single" w:sz="4" w:space="0" w:color="BFBFBF"/>
-              <w:right w:val="single" w:sz="4" w:space="0" w:color="BFBFBF"/>
-            </w:tcBorders>
-            <w:tcMar>
-              <w:top w:w="58" w:type="dxa"/>
-              <w:left w:w="100" w:type="dxa"/>
-              <w:bottom w:w="58" w:type="dxa"/>
-              <w:right w:w="100" w:type="dxa"/>
-            </w:tcMar>
-          </w:tcPr>
-          <w:p>
+              <w:top w:val="single" w:sz="4" w:space="0" w:color="BFBFBF" w:themeColor="background1" w:themeShade="BF"/>
+              <w:left w:val="single" w:sz="4" w:space="0" w:color="BFBFBF" w:themeColor="background1" w:themeShade="BF"/>
+              <w:bottom w:val="single" w:sz="4" w:space="0" w:color="BFBFBF" w:themeColor="background1" w:themeShade="BF"/>
+              <w:right w:val="single" w:sz="4" w:space="0" w:color="BFBFBF" w:themeColor="background1" w:themeShade="BF"/>
+            </w:tcBorders>
+            <w:tcMar>
+              <w:top w:w="58" w:type="dxa"/>
+              <w:left w:w="100" w:type="dxa"/>
+              <w:bottom w:w="58" w:type="dxa"/>
+              <w:right w:w="100" w:type="dxa"/>
+            </w:tcMar>
+          </w:tcPr>
+          <w:p>
+            <w:commentRangeStart w:id="10"/>
             <w:r>
               <w:t>Chargeback Expansion</w:t>
             </w:r>
@@ -954,10 +1128,10 @@
           <w:tcPr>
             <w:tcW w:w="3356" w:type="dxa"/>
             <w:tcBorders>
-              <w:top w:val="single" w:sz="4" w:space="0" w:color="BFBFBF"/>
-              <w:left w:val="single" w:sz="4" w:space="0" w:color="BFBFBF"/>
-              <w:bottom w:val="single" w:sz="4" w:space="0" w:color="BFBFBF"/>
-              <w:right w:val="single" w:sz="4" w:space="0" w:color="BFBFBF"/>
+              <w:top w:val="single" w:sz="4" w:space="0" w:color="BFBFBF" w:themeColor="background1" w:themeShade="BF"/>
+              <w:left w:val="single" w:sz="4" w:space="0" w:color="BFBFBF" w:themeColor="background1" w:themeShade="BF"/>
+              <w:bottom w:val="single" w:sz="4" w:space="0" w:color="BFBFBF" w:themeColor="background1" w:themeShade="BF"/>
+              <w:right w:val="single" w:sz="4" w:space="0" w:color="BFBFBF" w:themeColor="background1" w:themeShade="BF"/>
             </w:tcBorders>
             <w:tcMar>
               <w:top w:w="58" w:type="dxa"/>
@@ -976,10 +1150,10 @@
           <w:tcPr>
             <w:tcW w:w="3356" w:type="dxa"/>
             <w:tcBorders>
-              <w:top w:val="single" w:sz="4" w:space="0" w:color="BFBFBF"/>
-              <w:left w:val="single" w:sz="4" w:space="0" w:color="BFBFBF"/>
-              <w:bottom w:val="single" w:sz="4" w:space="0" w:color="BFBFBF"/>
-              <w:right w:val="single" w:sz="4" w:space="0" w:color="BFBFBF"/>
+              <w:top w:val="single" w:sz="4" w:space="0" w:color="BFBFBF" w:themeColor="background1" w:themeShade="BF"/>
+              <w:left w:val="single" w:sz="4" w:space="0" w:color="BFBFBF" w:themeColor="background1" w:themeShade="BF"/>
+              <w:bottom w:val="single" w:sz="4" w:space="0" w:color="BFBFBF" w:themeColor="background1" w:themeShade="BF"/>
+              <w:right w:val="single" w:sz="4" w:space="0" w:color="BFBFBF" w:themeColor="background1" w:themeShade="BF"/>
             </w:tcBorders>
             <w:tcMar>
               <w:top w:w="58" w:type="dxa"/>
@@ -991,6 +1165,15 @@
           <w:p>
             <w:r>
               <w:t>VC entitlement analysis</w:t>
+            </w:r>
+            <w:commentRangeEnd w:id="10"/>
+            <w:r>
+              <w:rPr>
+                <w:rStyle w:val="CommentReference"/>
+                <w:sz w:val="20"/>
+                <w:szCs w:val="20"/>
+              </w:rPr>
+              <w:commentReference w:id="10"/>
             </w:r>
           </w:p>
         </w:tc>
@@ -1000,10 +1183,10 @@
           <w:tcPr>
             <w:tcW w:w="3800" w:type="dxa"/>
             <w:tcBorders>
-              <w:top w:val="single" w:sz="4" w:space="0" w:color="BFBFBF"/>
-              <w:left w:val="single" w:sz="4" w:space="0" w:color="BFBFBF"/>
-              <w:bottom w:val="single" w:sz="4" w:space="0" w:color="BFBFBF"/>
-              <w:right w:val="single" w:sz="4" w:space="0" w:color="BFBFBF"/>
+              <w:top w:val="single" w:sz="4" w:space="0" w:color="BFBFBF" w:themeColor="background1" w:themeShade="BF"/>
+              <w:left w:val="single" w:sz="4" w:space="0" w:color="BFBFBF" w:themeColor="background1" w:themeShade="BF"/>
+              <w:bottom w:val="single" w:sz="4" w:space="0" w:color="BFBFBF" w:themeColor="background1" w:themeShade="BF"/>
+              <w:right w:val="single" w:sz="4" w:space="0" w:color="BFBFBF" w:themeColor="background1" w:themeShade="BF"/>
             </w:tcBorders>
             <w:tcMar>
               <w:top w:w="58" w:type="dxa"/>
@@ -1022,10 +1205,10 @@
           <w:tcPr>
             <w:tcW w:w="3356" w:type="dxa"/>
             <w:tcBorders>
-              <w:top w:val="single" w:sz="4" w:space="0" w:color="BFBFBF"/>
-              <w:left w:val="single" w:sz="4" w:space="0" w:color="BFBFBF"/>
-              <w:bottom w:val="single" w:sz="4" w:space="0" w:color="BFBFBF"/>
-              <w:right w:val="single" w:sz="4" w:space="0" w:color="BFBFBF"/>
+              <w:top w:val="single" w:sz="4" w:space="0" w:color="BFBFBF" w:themeColor="background1" w:themeShade="BF"/>
+              <w:left w:val="single" w:sz="4" w:space="0" w:color="BFBFBF" w:themeColor="background1" w:themeShade="BF"/>
+              <w:bottom w:val="single" w:sz="4" w:space="0" w:color="BFBFBF" w:themeColor="background1" w:themeShade="BF"/>
+              <w:right w:val="single" w:sz="4" w:space="0" w:color="BFBFBF" w:themeColor="background1" w:themeShade="BF"/>
             </w:tcBorders>
             <w:tcMar>
               <w:top w:w="58" w:type="dxa"/>
@@ -1044,10 +1227,10 @@
           <w:tcPr>
             <w:tcW w:w="3356" w:type="dxa"/>
             <w:tcBorders>
-              <w:top w:val="single" w:sz="4" w:space="0" w:color="BFBFBF"/>
-              <w:left w:val="single" w:sz="4" w:space="0" w:color="BFBFBF"/>
-              <w:bottom w:val="single" w:sz="4" w:space="0" w:color="BFBFBF"/>
-              <w:right w:val="single" w:sz="4" w:space="0" w:color="BFBFBF"/>
+              <w:top w:val="single" w:sz="4" w:space="0" w:color="BFBFBF" w:themeColor="background1" w:themeShade="BF"/>
+              <w:left w:val="single" w:sz="4" w:space="0" w:color="BFBFBF" w:themeColor="background1" w:themeShade="BF"/>
+              <w:bottom w:val="single" w:sz="4" w:space="0" w:color="BFBFBF" w:themeColor="background1" w:themeShade="BF"/>
+              <w:right w:val="single" w:sz="4" w:space="0" w:color="BFBFBF" w:themeColor="background1" w:themeShade="BF"/>
             </w:tcBorders>
             <w:tcMar>
               <w:top w:w="58" w:type="dxa"/>
@@ -1068,10 +1251,10 @@
           <w:tcPr>
             <w:tcW w:w="3800" w:type="dxa"/>
             <w:tcBorders>
-              <w:top w:val="single" w:sz="4" w:space="0" w:color="BFBFBF"/>
-              <w:left w:val="single" w:sz="4" w:space="0" w:color="BFBFBF"/>
-              <w:bottom w:val="single" w:sz="4" w:space="0" w:color="BFBFBF"/>
-              <w:right w:val="single" w:sz="4" w:space="0" w:color="BFBFBF"/>
+              <w:top w:val="single" w:sz="4" w:space="0" w:color="BFBFBF" w:themeColor="background1" w:themeShade="BF"/>
+              <w:left w:val="single" w:sz="4" w:space="0" w:color="BFBFBF" w:themeColor="background1" w:themeShade="BF"/>
+              <w:bottom w:val="single" w:sz="4" w:space="0" w:color="BFBFBF" w:themeColor="background1" w:themeShade="BF"/>
+              <w:right w:val="single" w:sz="4" w:space="0" w:color="BFBFBF" w:themeColor="background1" w:themeShade="BF"/>
             </w:tcBorders>
             <w:tcMar>
               <w:top w:w="58" w:type="dxa"/>
@@ -1090,10 +1273,10 @@
           <w:tcPr>
             <w:tcW w:w="3356" w:type="dxa"/>
             <w:tcBorders>
-              <w:top w:val="single" w:sz="4" w:space="0" w:color="BFBFBF"/>
-              <w:left w:val="single" w:sz="4" w:space="0" w:color="BFBFBF"/>
-              <w:bottom w:val="single" w:sz="4" w:space="0" w:color="BFBFBF"/>
-              <w:right w:val="single" w:sz="4" w:space="0" w:color="BFBFBF"/>
+              <w:top w:val="single" w:sz="4" w:space="0" w:color="BFBFBF" w:themeColor="background1" w:themeShade="BF"/>
+              <w:left w:val="single" w:sz="4" w:space="0" w:color="BFBFBF" w:themeColor="background1" w:themeShade="BF"/>
+              <w:bottom w:val="single" w:sz="4" w:space="0" w:color="BFBFBF" w:themeColor="background1" w:themeShade="BF"/>
+              <w:right w:val="single" w:sz="4" w:space="0" w:color="BFBFBF" w:themeColor="background1" w:themeShade="BF"/>
             </w:tcBorders>
             <w:tcMar>
               <w:top w:w="58" w:type="dxa"/>
@@ -1112,10 +1295,10 @@
           <w:tcPr>
             <w:tcW w:w="3356" w:type="dxa"/>
             <w:tcBorders>
-              <w:top w:val="single" w:sz="4" w:space="0" w:color="BFBFBF"/>
-              <w:left w:val="single" w:sz="4" w:space="0" w:color="BFBFBF"/>
-              <w:bottom w:val="single" w:sz="4" w:space="0" w:color="BFBFBF"/>
-              <w:right w:val="single" w:sz="4" w:space="0" w:color="BFBFBF"/>
+              <w:top w:val="single" w:sz="4" w:space="0" w:color="BFBFBF" w:themeColor="background1" w:themeShade="BF"/>
+              <w:left w:val="single" w:sz="4" w:space="0" w:color="BFBFBF" w:themeColor="background1" w:themeShade="BF"/>
+              <w:bottom w:val="single" w:sz="4" w:space="0" w:color="BFBFBF" w:themeColor="background1" w:themeShade="BF"/>
+              <w:right w:val="single" w:sz="4" w:space="0" w:color="BFBFBF" w:themeColor="background1" w:themeShade="BF"/>
             </w:tcBorders>
             <w:tcMar>
               <w:top w:w="58" w:type="dxa"/>
@@ -1136,10 +1319,10 @@
           <w:tcPr>
             <w:tcW w:w="3800" w:type="dxa"/>
             <w:tcBorders>
-              <w:top w:val="single" w:sz="4" w:space="0" w:color="BFBFBF"/>
-              <w:left w:val="single" w:sz="4" w:space="0" w:color="BFBFBF"/>
+              <w:top w:val="single" w:sz="4" w:space="0" w:color="BFBFBF" w:themeColor="background1" w:themeShade="BF"/>
+              <w:left w:val="single" w:sz="4" w:space="0" w:color="BFBFBF" w:themeColor="background1" w:themeShade="BF"/>
               <w:bottom w:val="double" w:sz="4" w:space="0" w:color="BFBFBF" w:themeColor="background1" w:themeShade="BF"/>
-              <w:right w:val="single" w:sz="4" w:space="0" w:color="BFBFBF"/>
+              <w:right w:val="single" w:sz="4" w:space="0" w:color="BFBFBF" w:themeColor="background1" w:themeShade="BF"/>
             </w:tcBorders>
             <w:tcMar>
               <w:top w:w="58" w:type="dxa"/>
@@ -1158,10 +1341,10 @@
           <w:tcPr>
             <w:tcW w:w="3356" w:type="dxa"/>
             <w:tcBorders>
-              <w:top w:val="single" w:sz="4" w:space="0" w:color="BFBFBF"/>
-              <w:left w:val="single" w:sz="4" w:space="0" w:color="BFBFBF"/>
+              <w:top w:val="single" w:sz="4" w:space="0" w:color="BFBFBF" w:themeColor="background1" w:themeShade="BF"/>
+              <w:left w:val="single" w:sz="4" w:space="0" w:color="BFBFBF" w:themeColor="background1" w:themeShade="BF"/>
               <w:bottom w:val="double" w:sz="4" w:space="0" w:color="BFBFBF" w:themeColor="background1" w:themeShade="BF"/>
-              <w:right w:val="single" w:sz="4" w:space="0" w:color="BFBFBF"/>
+              <w:right w:val="single" w:sz="4" w:space="0" w:color="BFBFBF" w:themeColor="background1" w:themeShade="BF"/>
             </w:tcBorders>
             <w:tcMar>
               <w:top w:w="58" w:type="dxa"/>
@@ -1180,10 +1363,10 @@
           <w:tcPr>
             <w:tcW w:w="3356" w:type="dxa"/>
             <w:tcBorders>
-              <w:top w:val="single" w:sz="4" w:space="0" w:color="BFBFBF"/>
-              <w:left w:val="single" w:sz="4" w:space="0" w:color="BFBFBF"/>
+              <w:top w:val="single" w:sz="4" w:space="0" w:color="BFBFBF" w:themeColor="background1" w:themeShade="BF"/>
+              <w:left w:val="single" w:sz="4" w:space="0" w:color="BFBFBF" w:themeColor="background1" w:themeShade="BF"/>
               <w:bottom w:val="double" w:sz="4" w:space="0" w:color="BFBFBF" w:themeColor="background1" w:themeShade="BF"/>
-              <w:right w:val="single" w:sz="4" w:space="0" w:color="BFBFBF"/>
+              <w:right w:val="single" w:sz="4" w:space="0" w:color="BFBFBF" w:themeColor="background1" w:themeShade="BF"/>
             </w:tcBorders>
             <w:tcMar>
               <w:top w:w="58" w:type="dxa"/>
@@ -1205,9 +1388,9 @@
             <w:tcW w:w="3800" w:type="dxa"/>
             <w:tcBorders>
               <w:top w:val="double" w:sz="4" w:space="0" w:color="BFBFBF" w:themeColor="background1" w:themeShade="BF"/>
-              <w:left w:val="single" w:sz="4" w:space="0" w:color="BFBFBF"/>
-              <w:bottom w:val="single" w:sz="4" w:space="0" w:color="BFBFBF"/>
-              <w:right w:val="single" w:sz="4" w:space="0" w:color="BFBFBF"/>
+              <w:left w:val="single" w:sz="4" w:space="0" w:color="BFBFBF" w:themeColor="background1" w:themeShade="BF"/>
+              <w:bottom w:val="single" w:sz="4" w:space="0" w:color="BFBFBF" w:themeColor="background1" w:themeShade="BF"/>
+              <w:right w:val="single" w:sz="4" w:space="0" w:color="BFBFBF" w:themeColor="background1" w:themeShade="BF"/>
             </w:tcBorders>
             <w:tcMar>
               <w:top w:w="58" w:type="dxa"/>
@@ -1231,9 +1414,9 @@
             <w:tcW w:w="3356" w:type="dxa"/>
             <w:tcBorders>
               <w:top w:val="double" w:sz="4" w:space="0" w:color="BFBFBF" w:themeColor="background1" w:themeShade="BF"/>
-              <w:left w:val="single" w:sz="4" w:space="0" w:color="BFBFBF"/>
-              <w:bottom w:val="single" w:sz="4" w:space="0" w:color="BFBFBF"/>
-              <w:right w:val="single" w:sz="4" w:space="0" w:color="BFBFBF"/>
+              <w:left w:val="single" w:sz="4" w:space="0" w:color="BFBFBF" w:themeColor="background1" w:themeShade="BF"/>
+              <w:bottom w:val="single" w:sz="4" w:space="0" w:color="BFBFBF" w:themeColor="background1" w:themeShade="BF"/>
+              <w:right w:val="single" w:sz="4" w:space="0" w:color="BFBFBF" w:themeColor="background1" w:themeShade="BF"/>
             </w:tcBorders>
             <w:tcMar>
               <w:top w:w="58" w:type="dxa"/>
@@ -1257,9 +1440,9 @@
             <w:tcW w:w="3356" w:type="dxa"/>
             <w:tcBorders>
               <w:top w:val="double" w:sz="4" w:space="0" w:color="BFBFBF" w:themeColor="background1" w:themeShade="BF"/>
-              <w:left w:val="single" w:sz="4" w:space="0" w:color="BFBFBF"/>
-              <w:bottom w:val="single" w:sz="4" w:space="0" w:color="BFBFBF"/>
-              <w:right w:val="single" w:sz="4" w:space="0" w:color="BFBFBF"/>
+              <w:left w:val="single" w:sz="4" w:space="0" w:color="BFBFBF" w:themeColor="background1" w:themeShade="BF"/>
+              <w:bottom w:val="single" w:sz="4" w:space="0" w:color="BFBFBF" w:themeColor="background1" w:themeShade="BF"/>
+              <w:right w:val="single" w:sz="4" w:space="0" w:color="BFBFBF" w:themeColor="background1" w:themeShade="BF"/>
             </w:tcBorders>
             <w:tcMar>
               <w:top w:w="58" w:type="dxa"/>
@@ -1301,6 +1484,7 @@
       <w:pPr>
         <w:pStyle w:val="ListBullet"/>
       </w:pPr>
+      <w:commentRangeStart w:id="11"/>
       <w:r>
         <w:t xml:space="preserve">risk exposure in the current state includes documented cost avoidance from </w:t>
       </w:r>
@@ -1324,6 +1508,15 @@
       </w:r>
       <w:r>
         <w:t>)</w:t>
+      </w:r>
+      <w:commentRangeEnd w:id="11"/>
+      <w:r>
+        <w:rPr>
+          <w:rStyle w:val="CommentReference"/>
+          <w:sz w:val="20"/>
+          <w:szCs w:val="20"/>
+        </w:rPr>
+        <w:commentReference w:id="11"/>
       </w:r>
     </w:p>
     <w:p>
@@ -1417,7 +1610,7 @@
       <w:r>
         <w:t xml:space="preserve">5.0.1 OP1 Submission: </w:t>
       </w:r>
-      <w:hyperlink r:id="rId7" w:history="1">
+      <w:hyperlink r:id="rId11" w:history="1">
         <w:r>
           <w:rPr>
             <w:rStyle w:val="Hyperlink"/>
@@ -1431,10 +1624,7 @@
         <w:pStyle w:val="Heading3"/>
       </w:pPr>
       <w:r>
-        <w:t>5</w:t>
-      </w:r>
-      <w:r>
-        <w:t>.1 What Has Already Been Done</w:t>
+        <w:t>5.1 What Has Already Been Done</w:t>
       </w:r>
     </w:p>
     <w:p>
@@ -1494,6 +1684,7 @@
       <w:pPr>
         <w:pStyle w:val="ListBullet"/>
       </w:pPr>
+      <w:commentRangeStart w:id="12"/>
       <w:r>
         <w:rPr>
           <w:b/>
@@ -1502,7 +1693,19 @@
         <w:t>Feasibility Analysis:</w:t>
       </w:r>
       <w:r>
-        <w:t xml:space="preserve"> Implementation alternatives evaluated across four CPH integration architectures (CPH Hub + Raw Queries, CPH Hub + Data-Service, CPH Hub + BI-Built Data-Service, CPH Hub + SWE/BI Data-Service).</w:t>
+        <w:t xml:space="preserve"> I</w:t>
+      </w:r>
+      <w:commentRangeEnd w:id="12"/>
+      <w:r>
+        <w:rPr>
+          <w:rStyle w:val="CommentReference"/>
+          <w:sz w:val="20"/>
+          <w:szCs w:val="20"/>
+        </w:rPr>
+        <w:commentReference w:id="12"/>
+      </w:r>
+      <w:r>
+        <w:t>mplementation alternatives evaluated across four CPH integration architectures (CPH Hub + Raw Queries, CPH Hub + Data-Service, CPH Hub + BI-Built Data-Service, CPH Hub + SWE/BI Data-Service).</w:t>
       </w:r>
     </w:p>
     <w:p>
@@ -1529,7 +1732,6 @@
           <w:b/>
           <w:bCs/>
         </w:rPr>
-        <w:lastRenderedPageBreak/>
         <w:t>VC Data Pipeline Bridge:</w:t>
       </w:r>
       <w:r>
@@ -1540,6 +1742,8 @@
       <w:pPr>
         <w:pStyle w:val="ListBullet"/>
       </w:pPr>
+      <w:commentRangeStart w:id="13"/>
+      <w:commentRangeStart w:id="14"/>
       <w:r>
         <w:rPr>
           <w:b/>
@@ -1565,6 +1769,24 @@
       <w:r>
         <w:t xml:space="preserve"> Quantified value analysis on file with the OP1 submission.</w:t>
       </w:r>
+      <w:commentRangeEnd w:id="13"/>
+      <w:r>
+        <w:rPr>
+          <w:rStyle w:val="CommentReference"/>
+          <w:sz w:val="20"/>
+          <w:szCs w:val="20"/>
+        </w:rPr>
+        <w:commentReference w:id="13"/>
+      </w:r>
+      <w:commentRangeEnd w:id="14"/>
+      <w:r>
+        <w:rPr>
+          <w:rStyle w:val="CommentReference"/>
+          <w:sz w:val="20"/>
+          <w:szCs w:val="20"/>
+        </w:rPr>
+        <w:commentReference w:id="14"/>
+      </w:r>
     </w:p>
     <w:p>
       <w:pPr>
@@ -1573,7 +1795,7 @@
       <w:r>
         <w:t xml:space="preserve">5.1.1 CPFR Entitlement: </w:t>
       </w:r>
-      <w:hyperlink r:id="rId8" w:history="1">
+      <w:hyperlink r:id="rId12" w:history="1">
         <w:r>
           <w:rPr>
             <w:rStyle w:val="Hyperlink"/>
@@ -1984,13 +2206,8 @@
             <w:r>
               <w:t>Requires CPH contact + platform delivery (</w:t>
             </w:r>
-            <w:proofErr w:type="gramStart"/>
-            <w:r>
-              <w:t>on-target</w:t>
-            </w:r>
-            <w:proofErr w:type="gramEnd"/>
-            <w:r>
-              <w:t xml:space="preserve">: </w:t>
+            <w:r>
+              <w:t xml:space="preserve">on-target: </w:t>
             </w:r>
             <w:r>
               <w:t>3/31).</w:t>
@@ -2080,7 +2297,20 @@
         <w:pStyle w:val="Heading3"/>
       </w:pPr>
       <w:r>
-        <w:t>5.3 The Core Ask</w:t>
+        <w:t xml:space="preserve">5.3 </w:t>
+      </w:r>
+      <w:commentRangeStart w:id="15"/>
+      <w:r>
+        <w:t>The Core Ask</w:t>
+      </w:r>
+      <w:commentRangeEnd w:id="15"/>
+      <w:r>
+        <w:rPr>
+          <w:rStyle w:val="CommentReference"/>
+          <w:sz w:val="24"/>
+          <w:szCs w:val="24"/>
+        </w:rPr>
+        <w:commentReference w:id="15"/>
       </w:r>
     </w:p>
     <w:p>
@@ -2088,7 +2318,23 @@
         <w:spacing w:before="120" w:after="120"/>
       </w:pPr>
       <w:r>
-        <w:t>The core ask is bounded: CPH engineering capacity (1–2 engineers for module build), design resources (Tamara’s team or outsource equivalent), and formalization of the cross-team coordination role. The data platform and data pipeline investments are already funded. The business requirements, user stories, wireframes, and feasibility analysis are complete. The marginal investment to realize value on assets already built is bounded and clear.</w:t>
+        <w:t>The core ask is bounded: CPH engineering capacity (</w:t>
+      </w:r>
+      <w:commentRangeStart w:id="16"/>
+      <w:r>
+        <w:t>1–2 engineers for module build</w:t>
+      </w:r>
+      <w:commentRangeEnd w:id="16"/>
+      <w:r>
+        <w:rPr>
+          <w:rStyle w:val="CommentReference"/>
+          <w:sz w:val="20"/>
+          <w:szCs w:val="20"/>
+        </w:rPr>
+        <w:commentReference w:id="16"/>
+      </w:r>
+      <w:r>
+        <w:t>), design resources (Tamara’s team or outsource equivalent), and formalization of the cross-team coordination role. The data platform and data pipeline investments are already funded. The business requirements, user stories, wireframes, and feasibility analysis are complete. The marginal investment to realize value on assets already built is bounded and clear.</w:t>
       </w:r>
     </w:p>
     <w:p>
@@ -2169,12 +2415,12 @@
           <w:tcPr>
             <w:tcW w:w="3200" w:type="dxa"/>
             <w:tcBorders>
-              <w:top w:val="single" w:sz="4" w:space="0" w:color="BFBFBF"/>
-              <w:left w:val="single" w:sz="4" w:space="0" w:color="BFBFBF"/>
-              <w:bottom w:val="single" w:sz="4" w:space="0" w:color="BFBFBF"/>
-              <w:right w:val="single" w:sz="4" w:space="0" w:color="BFBFBF"/>
-            </w:tcBorders>
-            <w:shd w:val="clear" w:color="auto" w:fill="D9D9D9"/>
+              <w:top w:val="single" w:sz="4" w:space="0" w:color="BFBFBF" w:themeColor="background1" w:themeShade="BF"/>
+              <w:left w:val="single" w:sz="4" w:space="0" w:color="BFBFBF" w:themeColor="background1" w:themeShade="BF"/>
+              <w:bottom w:val="single" w:sz="4" w:space="0" w:color="BFBFBF" w:themeColor="background1" w:themeShade="BF"/>
+              <w:right w:val="single" w:sz="4" w:space="0" w:color="BFBFBF" w:themeColor="background1" w:themeShade="BF"/>
+            </w:tcBorders>
+            <w:shd w:val="clear" w:color="auto" w:fill="D9D9D9" w:themeFill="background1" w:themeFillShade="D9"/>
             <w:tcMar>
               <w:top w:w="58" w:type="dxa"/>
               <w:left w:w="100" w:type="dxa"/>
@@ -2196,12 +2442,12 @@
           <w:tcPr>
             <w:tcW w:w="2600" w:type="dxa"/>
             <w:tcBorders>
-              <w:top w:val="single" w:sz="4" w:space="0" w:color="BFBFBF"/>
-              <w:left w:val="single" w:sz="4" w:space="0" w:color="BFBFBF"/>
-              <w:bottom w:val="single" w:sz="4" w:space="0" w:color="BFBFBF"/>
-              <w:right w:val="single" w:sz="4" w:space="0" w:color="BFBFBF"/>
-            </w:tcBorders>
-            <w:shd w:val="clear" w:color="auto" w:fill="D9D9D9"/>
+              <w:top w:val="single" w:sz="4" w:space="0" w:color="BFBFBF" w:themeColor="background1" w:themeShade="BF"/>
+              <w:left w:val="single" w:sz="4" w:space="0" w:color="BFBFBF" w:themeColor="background1" w:themeShade="BF"/>
+              <w:bottom w:val="single" w:sz="4" w:space="0" w:color="BFBFBF" w:themeColor="background1" w:themeShade="BF"/>
+              <w:right w:val="single" w:sz="4" w:space="0" w:color="BFBFBF" w:themeColor="background1" w:themeShade="BF"/>
+            </w:tcBorders>
+            <w:shd w:val="clear" w:color="auto" w:fill="D9D9D9" w:themeFill="background1" w:themeFillShade="D9"/>
             <w:tcMar>
               <w:top w:w="58" w:type="dxa"/>
               <w:left w:w="100" w:type="dxa"/>
@@ -2223,12 +2469,12 @@
           <w:tcPr>
             <w:tcW w:w="2000" w:type="dxa"/>
             <w:tcBorders>
-              <w:top w:val="single" w:sz="4" w:space="0" w:color="BFBFBF"/>
-              <w:left w:val="single" w:sz="4" w:space="0" w:color="BFBFBF"/>
-              <w:bottom w:val="single" w:sz="4" w:space="0" w:color="BFBFBF"/>
-              <w:right w:val="single" w:sz="4" w:space="0" w:color="BFBFBF"/>
-            </w:tcBorders>
-            <w:shd w:val="clear" w:color="auto" w:fill="D9D9D9"/>
+              <w:top w:val="single" w:sz="4" w:space="0" w:color="BFBFBF" w:themeColor="background1" w:themeShade="BF"/>
+              <w:left w:val="single" w:sz="4" w:space="0" w:color="BFBFBF" w:themeColor="background1" w:themeShade="BF"/>
+              <w:bottom w:val="single" w:sz="4" w:space="0" w:color="BFBFBF" w:themeColor="background1" w:themeShade="BF"/>
+              <w:right w:val="single" w:sz="4" w:space="0" w:color="BFBFBF" w:themeColor="background1" w:themeShade="BF"/>
+            </w:tcBorders>
+            <w:shd w:val="clear" w:color="auto" w:fill="D9D9D9" w:themeFill="background1" w:themeFillShade="D9"/>
             <w:tcMar>
               <w:top w:w="58" w:type="dxa"/>
               <w:left w:w="100" w:type="dxa"/>
@@ -2250,12 +2496,12 @@
           <w:tcPr>
             <w:tcW w:w="2712" w:type="dxa"/>
             <w:tcBorders>
-              <w:top w:val="single" w:sz="4" w:space="0" w:color="BFBFBF"/>
-              <w:left w:val="single" w:sz="4" w:space="0" w:color="BFBFBF"/>
-              <w:bottom w:val="single" w:sz="4" w:space="0" w:color="BFBFBF"/>
-              <w:right w:val="single" w:sz="4" w:space="0" w:color="BFBFBF"/>
-            </w:tcBorders>
-            <w:shd w:val="clear" w:color="auto" w:fill="D9D9D9"/>
+              <w:top w:val="single" w:sz="4" w:space="0" w:color="BFBFBF" w:themeColor="background1" w:themeShade="BF"/>
+              <w:left w:val="single" w:sz="4" w:space="0" w:color="BFBFBF" w:themeColor="background1" w:themeShade="BF"/>
+              <w:bottom w:val="single" w:sz="4" w:space="0" w:color="BFBFBF" w:themeColor="background1" w:themeShade="BF"/>
+              <w:right w:val="single" w:sz="4" w:space="0" w:color="BFBFBF" w:themeColor="background1" w:themeShade="BF"/>
+            </w:tcBorders>
+            <w:shd w:val="clear" w:color="auto" w:fill="D9D9D9" w:themeFill="background1" w:themeFillShade="D9"/>
             <w:tcMar>
               <w:top w:w="58" w:type="dxa"/>
               <w:left w:w="100" w:type="dxa"/>
@@ -2279,10 +2525,10 @@
           <w:tcPr>
             <w:tcW w:w="3200" w:type="dxa"/>
             <w:tcBorders>
-              <w:top w:val="single" w:sz="4" w:space="0" w:color="BFBFBF"/>
-              <w:left w:val="single" w:sz="4" w:space="0" w:color="BFBFBF"/>
-              <w:bottom w:val="single" w:sz="4" w:space="0" w:color="BFBFBF"/>
-              <w:right w:val="single" w:sz="4" w:space="0" w:color="BFBFBF"/>
+              <w:top w:val="single" w:sz="4" w:space="0" w:color="BFBFBF" w:themeColor="background1" w:themeShade="BF"/>
+              <w:left w:val="single" w:sz="4" w:space="0" w:color="BFBFBF" w:themeColor="background1" w:themeShade="BF"/>
+              <w:bottom w:val="single" w:sz="4" w:space="0" w:color="BFBFBF" w:themeColor="background1" w:themeShade="BF"/>
+              <w:right w:val="single" w:sz="4" w:space="0" w:color="BFBFBF" w:themeColor="background1" w:themeShade="BF"/>
             </w:tcBorders>
             <w:tcMar>
               <w:top w:w="58" w:type="dxa"/>
@@ -2301,10 +2547,10 @@
           <w:tcPr>
             <w:tcW w:w="2600" w:type="dxa"/>
             <w:tcBorders>
-              <w:top w:val="single" w:sz="4" w:space="0" w:color="BFBFBF"/>
-              <w:left w:val="single" w:sz="4" w:space="0" w:color="BFBFBF"/>
-              <w:bottom w:val="single" w:sz="4" w:space="0" w:color="BFBFBF"/>
-              <w:right w:val="single" w:sz="4" w:space="0" w:color="BFBFBF"/>
+              <w:top w:val="single" w:sz="4" w:space="0" w:color="BFBFBF" w:themeColor="background1" w:themeShade="BF"/>
+              <w:left w:val="single" w:sz="4" w:space="0" w:color="BFBFBF" w:themeColor="background1" w:themeShade="BF"/>
+              <w:bottom w:val="single" w:sz="4" w:space="0" w:color="BFBFBF" w:themeColor="background1" w:themeShade="BF"/>
+              <w:right w:val="single" w:sz="4" w:space="0" w:color="BFBFBF" w:themeColor="background1" w:themeShade="BF"/>
             </w:tcBorders>
             <w:tcMar>
               <w:top w:w="58" w:type="dxa"/>
@@ -2323,10 +2569,10 @@
           <w:tcPr>
             <w:tcW w:w="2000" w:type="dxa"/>
             <w:tcBorders>
-              <w:top w:val="single" w:sz="4" w:space="0" w:color="BFBFBF"/>
-              <w:left w:val="single" w:sz="4" w:space="0" w:color="BFBFBF"/>
-              <w:bottom w:val="single" w:sz="4" w:space="0" w:color="BFBFBF"/>
-              <w:right w:val="single" w:sz="4" w:space="0" w:color="BFBFBF"/>
+              <w:top w:val="single" w:sz="4" w:space="0" w:color="BFBFBF" w:themeColor="background1" w:themeShade="BF"/>
+              <w:left w:val="single" w:sz="4" w:space="0" w:color="BFBFBF" w:themeColor="background1" w:themeShade="BF"/>
+              <w:bottom w:val="single" w:sz="4" w:space="0" w:color="BFBFBF" w:themeColor="background1" w:themeShade="BF"/>
+              <w:right w:val="single" w:sz="4" w:space="0" w:color="BFBFBF" w:themeColor="background1" w:themeShade="BF"/>
             </w:tcBorders>
             <w:tcMar>
               <w:top w:w="58" w:type="dxa"/>
@@ -2345,10 +2591,10 @@
           <w:tcPr>
             <w:tcW w:w="2712" w:type="dxa"/>
             <w:tcBorders>
-              <w:top w:val="single" w:sz="4" w:space="0" w:color="BFBFBF"/>
-              <w:left w:val="single" w:sz="4" w:space="0" w:color="BFBFBF"/>
-              <w:bottom w:val="single" w:sz="4" w:space="0" w:color="BFBFBF"/>
-              <w:right w:val="single" w:sz="4" w:space="0" w:color="BFBFBF"/>
+              <w:top w:val="single" w:sz="4" w:space="0" w:color="BFBFBF" w:themeColor="background1" w:themeShade="BF"/>
+              <w:left w:val="single" w:sz="4" w:space="0" w:color="BFBFBF" w:themeColor="background1" w:themeShade="BF"/>
+              <w:bottom w:val="single" w:sz="4" w:space="0" w:color="BFBFBF" w:themeColor="background1" w:themeShade="BF"/>
+              <w:right w:val="single" w:sz="4" w:space="0" w:color="BFBFBF" w:themeColor="background1" w:themeShade="BF"/>
             </w:tcBorders>
             <w:shd w:val="clear" w:color="auto" w:fill="E2EFDA"/>
             <w:tcMar>
@@ -2370,21 +2616,20 @@
           <w:tcPr>
             <w:tcW w:w="3200" w:type="dxa"/>
             <w:tcBorders>
-              <w:top w:val="single" w:sz="4" w:space="0" w:color="BFBFBF"/>
-              <w:left w:val="single" w:sz="4" w:space="0" w:color="BFBFBF"/>
-              <w:bottom w:val="single" w:sz="4" w:space="0" w:color="BFBFBF"/>
-              <w:right w:val="single" w:sz="4" w:space="0" w:color="BFBFBF"/>
-            </w:tcBorders>
-            <w:tcMar>
-              <w:top w:w="58" w:type="dxa"/>
-              <w:left w:w="100" w:type="dxa"/>
-              <w:bottom w:w="58" w:type="dxa"/>
-              <w:right w:w="100" w:type="dxa"/>
-            </w:tcMar>
-          </w:tcPr>
-          <w:p>
-            <w:r>
-              <w:lastRenderedPageBreak/>
+              <w:top w:val="single" w:sz="4" w:space="0" w:color="BFBFBF" w:themeColor="background1" w:themeShade="BF"/>
+              <w:left w:val="single" w:sz="4" w:space="0" w:color="BFBFBF" w:themeColor="background1" w:themeShade="BF"/>
+              <w:bottom w:val="single" w:sz="4" w:space="0" w:color="BFBFBF" w:themeColor="background1" w:themeShade="BF"/>
+              <w:right w:val="single" w:sz="4" w:space="0" w:color="BFBFBF" w:themeColor="background1" w:themeShade="BF"/>
+            </w:tcBorders>
+            <w:tcMar>
+              <w:top w:w="58" w:type="dxa"/>
+              <w:left w:w="100" w:type="dxa"/>
+              <w:bottom w:w="58" w:type="dxa"/>
+              <w:right w:w="100" w:type="dxa"/>
+            </w:tcMar>
+          </w:tcPr>
+          <w:p>
+            <w:r>
               <w:t>VC data pipeline work (SPARK bridge)</w:t>
             </w:r>
           </w:p>
@@ -2393,10 +2638,10 @@
           <w:tcPr>
             <w:tcW w:w="2600" w:type="dxa"/>
             <w:tcBorders>
-              <w:top w:val="single" w:sz="4" w:space="0" w:color="BFBFBF"/>
-              <w:left w:val="single" w:sz="4" w:space="0" w:color="BFBFBF"/>
-              <w:bottom w:val="single" w:sz="4" w:space="0" w:color="BFBFBF"/>
-              <w:right w:val="single" w:sz="4" w:space="0" w:color="BFBFBF"/>
+              <w:top w:val="single" w:sz="4" w:space="0" w:color="BFBFBF" w:themeColor="background1" w:themeShade="BF"/>
+              <w:left w:val="single" w:sz="4" w:space="0" w:color="BFBFBF" w:themeColor="background1" w:themeShade="BF"/>
+              <w:bottom w:val="single" w:sz="4" w:space="0" w:color="BFBFBF" w:themeColor="background1" w:themeShade="BF"/>
+              <w:right w:val="single" w:sz="4" w:space="0" w:color="BFBFBF" w:themeColor="background1" w:themeShade="BF"/>
             </w:tcBorders>
             <w:tcMar>
               <w:top w:w="58" w:type="dxa"/>
@@ -2415,10 +2660,10 @@
           <w:tcPr>
             <w:tcW w:w="2000" w:type="dxa"/>
             <w:tcBorders>
-              <w:top w:val="single" w:sz="4" w:space="0" w:color="BFBFBF"/>
-              <w:left w:val="single" w:sz="4" w:space="0" w:color="BFBFBF"/>
-              <w:bottom w:val="single" w:sz="4" w:space="0" w:color="BFBFBF"/>
-              <w:right w:val="single" w:sz="4" w:space="0" w:color="BFBFBF"/>
+              <w:top w:val="single" w:sz="4" w:space="0" w:color="BFBFBF" w:themeColor="background1" w:themeShade="BF"/>
+              <w:left w:val="single" w:sz="4" w:space="0" w:color="BFBFBF" w:themeColor="background1" w:themeShade="BF"/>
+              <w:bottom w:val="single" w:sz="4" w:space="0" w:color="BFBFBF" w:themeColor="background1" w:themeShade="BF"/>
+              <w:right w:val="single" w:sz="4" w:space="0" w:color="BFBFBF" w:themeColor="background1" w:themeShade="BF"/>
             </w:tcBorders>
             <w:tcMar>
               <w:top w:w="58" w:type="dxa"/>
@@ -2437,10 +2682,10 @@
           <w:tcPr>
             <w:tcW w:w="2712" w:type="dxa"/>
             <w:tcBorders>
-              <w:top w:val="single" w:sz="4" w:space="0" w:color="BFBFBF"/>
-              <w:left w:val="single" w:sz="4" w:space="0" w:color="BFBFBF"/>
-              <w:bottom w:val="single" w:sz="4" w:space="0" w:color="BFBFBF"/>
-              <w:right w:val="single" w:sz="4" w:space="0" w:color="BFBFBF"/>
+              <w:top w:val="single" w:sz="4" w:space="0" w:color="BFBFBF" w:themeColor="background1" w:themeShade="BF"/>
+              <w:left w:val="single" w:sz="4" w:space="0" w:color="BFBFBF" w:themeColor="background1" w:themeShade="BF"/>
+              <w:bottom w:val="single" w:sz="4" w:space="0" w:color="BFBFBF" w:themeColor="background1" w:themeShade="BF"/>
+              <w:right w:val="single" w:sz="4" w:space="0" w:color="BFBFBF" w:themeColor="background1" w:themeShade="BF"/>
             </w:tcBorders>
             <w:shd w:val="clear" w:color="auto" w:fill="E2EFDA"/>
             <w:tcMar>
@@ -2462,10 +2707,10 @@
           <w:tcPr>
             <w:tcW w:w="3200" w:type="dxa"/>
             <w:tcBorders>
-              <w:top w:val="single" w:sz="4" w:space="0" w:color="BFBFBF"/>
-              <w:left w:val="single" w:sz="4" w:space="0" w:color="BFBFBF"/>
-              <w:bottom w:val="single" w:sz="4" w:space="0" w:color="BFBFBF"/>
-              <w:right w:val="single" w:sz="4" w:space="0" w:color="BFBFBF"/>
+              <w:top w:val="single" w:sz="4" w:space="0" w:color="BFBFBF" w:themeColor="background1" w:themeShade="BF"/>
+              <w:left w:val="single" w:sz="4" w:space="0" w:color="BFBFBF" w:themeColor="background1" w:themeShade="BF"/>
+              <w:bottom w:val="single" w:sz="4" w:space="0" w:color="BFBFBF" w:themeColor="background1" w:themeShade="BF"/>
+              <w:right w:val="single" w:sz="4" w:space="0" w:color="BFBFBF" w:themeColor="background1" w:themeShade="BF"/>
             </w:tcBorders>
             <w:shd w:val="clear" w:color="auto" w:fill="FDE5D7"/>
             <w:tcMar>
@@ -2485,10 +2730,10 @@
           <w:tcPr>
             <w:tcW w:w="2600" w:type="dxa"/>
             <w:tcBorders>
-              <w:top w:val="single" w:sz="4" w:space="0" w:color="BFBFBF"/>
-              <w:left w:val="single" w:sz="4" w:space="0" w:color="BFBFBF"/>
-              <w:bottom w:val="single" w:sz="4" w:space="0" w:color="BFBFBF"/>
-              <w:right w:val="single" w:sz="4" w:space="0" w:color="BFBFBF"/>
+              <w:top w:val="single" w:sz="4" w:space="0" w:color="BFBFBF" w:themeColor="background1" w:themeShade="BF"/>
+              <w:left w:val="single" w:sz="4" w:space="0" w:color="BFBFBF" w:themeColor="background1" w:themeShade="BF"/>
+              <w:bottom w:val="single" w:sz="4" w:space="0" w:color="BFBFBF" w:themeColor="background1" w:themeShade="BF"/>
+              <w:right w:val="single" w:sz="4" w:space="0" w:color="BFBFBF" w:themeColor="background1" w:themeShade="BF"/>
             </w:tcBorders>
             <w:shd w:val="clear" w:color="auto" w:fill="FDE5D7"/>
             <w:tcMar>
@@ -2508,10 +2753,10 @@
           <w:tcPr>
             <w:tcW w:w="2000" w:type="dxa"/>
             <w:tcBorders>
-              <w:top w:val="single" w:sz="4" w:space="0" w:color="BFBFBF"/>
-              <w:left w:val="single" w:sz="4" w:space="0" w:color="BFBFBF"/>
-              <w:bottom w:val="single" w:sz="4" w:space="0" w:color="BFBFBF"/>
-              <w:right w:val="single" w:sz="4" w:space="0" w:color="BFBFBF"/>
+              <w:top w:val="single" w:sz="4" w:space="0" w:color="BFBFBF" w:themeColor="background1" w:themeShade="BF"/>
+              <w:left w:val="single" w:sz="4" w:space="0" w:color="BFBFBF" w:themeColor="background1" w:themeShade="BF"/>
+              <w:bottom w:val="single" w:sz="4" w:space="0" w:color="BFBFBF" w:themeColor="background1" w:themeShade="BF"/>
+              <w:right w:val="single" w:sz="4" w:space="0" w:color="BFBFBF" w:themeColor="background1" w:themeShade="BF"/>
             </w:tcBorders>
             <w:shd w:val="clear" w:color="auto" w:fill="FDE5D7"/>
             <w:tcMar>
@@ -2531,10 +2776,10 @@
           <w:tcPr>
             <w:tcW w:w="2712" w:type="dxa"/>
             <w:tcBorders>
-              <w:top w:val="single" w:sz="4" w:space="0" w:color="BFBFBF"/>
-              <w:left w:val="single" w:sz="4" w:space="0" w:color="BFBFBF"/>
-              <w:bottom w:val="single" w:sz="4" w:space="0" w:color="BFBFBF"/>
-              <w:right w:val="single" w:sz="4" w:space="0" w:color="BFBFBF"/>
+              <w:top w:val="single" w:sz="4" w:space="0" w:color="BFBFBF" w:themeColor="background1" w:themeShade="BF"/>
+              <w:left w:val="single" w:sz="4" w:space="0" w:color="BFBFBF" w:themeColor="background1" w:themeShade="BF"/>
+              <w:bottom w:val="single" w:sz="4" w:space="0" w:color="BFBFBF" w:themeColor="background1" w:themeShade="BF"/>
+              <w:right w:val="single" w:sz="4" w:space="0" w:color="BFBFBF" w:themeColor="background1" w:themeShade="BF"/>
             </w:tcBorders>
             <w:shd w:val="clear" w:color="auto" w:fill="FDE5D7"/>
             <w:tcMar>
@@ -2556,10 +2801,10 @@
           <w:tcPr>
             <w:tcW w:w="3200" w:type="dxa"/>
             <w:tcBorders>
-              <w:top w:val="single" w:sz="4" w:space="0" w:color="BFBFBF"/>
-              <w:left w:val="single" w:sz="4" w:space="0" w:color="BFBFBF"/>
-              <w:bottom w:val="single" w:sz="4" w:space="0" w:color="BFBFBF"/>
-              <w:right w:val="single" w:sz="4" w:space="0" w:color="BFBFBF"/>
+              <w:top w:val="single" w:sz="4" w:space="0" w:color="BFBFBF" w:themeColor="background1" w:themeShade="BF"/>
+              <w:left w:val="single" w:sz="4" w:space="0" w:color="BFBFBF" w:themeColor="background1" w:themeShade="BF"/>
+              <w:bottom w:val="single" w:sz="4" w:space="0" w:color="BFBFBF" w:themeColor="background1" w:themeShade="BF"/>
+              <w:right w:val="single" w:sz="4" w:space="0" w:color="BFBFBF" w:themeColor="background1" w:themeShade="BF"/>
             </w:tcBorders>
             <w:tcMar>
               <w:top w:w="58" w:type="dxa"/>
@@ -2578,10 +2823,10 @@
           <w:tcPr>
             <w:tcW w:w="2600" w:type="dxa"/>
             <w:tcBorders>
-              <w:top w:val="single" w:sz="4" w:space="0" w:color="BFBFBF"/>
-              <w:left w:val="single" w:sz="4" w:space="0" w:color="BFBFBF"/>
-              <w:bottom w:val="single" w:sz="4" w:space="0" w:color="BFBFBF"/>
-              <w:right w:val="single" w:sz="4" w:space="0" w:color="BFBFBF"/>
+              <w:top w:val="single" w:sz="4" w:space="0" w:color="BFBFBF" w:themeColor="background1" w:themeShade="BF"/>
+              <w:left w:val="single" w:sz="4" w:space="0" w:color="BFBFBF" w:themeColor="background1" w:themeShade="BF"/>
+              <w:bottom w:val="single" w:sz="4" w:space="0" w:color="BFBFBF" w:themeColor="background1" w:themeShade="BF"/>
+              <w:right w:val="single" w:sz="4" w:space="0" w:color="BFBFBF" w:themeColor="background1" w:themeShade="BF"/>
             </w:tcBorders>
             <w:tcMar>
               <w:top w:w="58" w:type="dxa"/>
@@ -2600,10 +2845,10 @@
           <w:tcPr>
             <w:tcW w:w="2000" w:type="dxa"/>
             <w:tcBorders>
-              <w:top w:val="single" w:sz="4" w:space="0" w:color="BFBFBF"/>
-              <w:left w:val="single" w:sz="4" w:space="0" w:color="BFBFBF"/>
-              <w:bottom w:val="single" w:sz="4" w:space="0" w:color="BFBFBF"/>
-              <w:right w:val="single" w:sz="4" w:space="0" w:color="BFBFBF"/>
+              <w:top w:val="single" w:sz="4" w:space="0" w:color="BFBFBF" w:themeColor="background1" w:themeShade="BF"/>
+              <w:left w:val="single" w:sz="4" w:space="0" w:color="BFBFBF" w:themeColor="background1" w:themeShade="BF"/>
+              <w:bottom w:val="single" w:sz="4" w:space="0" w:color="BFBFBF" w:themeColor="background1" w:themeShade="BF"/>
+              <w:right w:val="single" w:sz="4" w:space="0" w:color="BFBFBF" w:themeColor="background1" w:themeShade="BF"/>
             </w:tcBorders>
             <w:tcMar>
               <w:top w:w="58" w:type="dxa"/>
@@ -2622,10 +2867,10 @@
           <w:tcPr>
             <w:tcW w:w="2712" w:type="dxa"/>
             <w:tcBorders>
-              <w:top w:val="single" w:sz="4" w:space="0" w:color="BFBFBF"/>
-              <w:left w:val="single" w:sz="4" w:space="0" w:color="BFBFBF"/>
-              <w:bottom w:val="single" w:sz="4" w:space="0" w:color="BFBFBF"/>
-              <w:right w:val="single" w:sz="4" w:space="0" w:color="BFBFBF"/>
+              <w:top w:val="single" w:sz="4" w:space="0" w:color="BFBFBF" w:themeColor="background1" w:themeShade="BF"/>
+              <w:left w:val="single" w:sz="4" w:space="0" w:color="BFBFBF" w:themeColor="background1" w:themeShade="BF"/>
+              <w:bottom w:val="single" w:sz="4" w:space="0" w:color="BFBFBF" w:themeColor="background1" w:themeShade="BF"/>
+              <w:right w:val="single" w:sz="4" w:space="0" w:color="BFBFBF" w:themeColor="background1" w:themeShade="BF"/>
             </w:tcBorders>
             <w:shd w:val="clear" w:color="auto" w:fill="FCE4D6"/>
             <w:tcMar>
@@ -2647,10 +2892,10 @@
           <w:tcPr>
             <w:tcW w:w="3200" w:type="dxa"/>
             <w:tcBorders>
-              <w:top w:val="single" w:sz="4" w:space="0" w:color="BFBFBF"/>
-              <w:left w:val="single" w:sz="4" w:space="0" w:color="BFBFBF"/>
-              <w:bottom w:val="single" w:sz="4" w:space="0" w:color="BFBFBF"/>
-              <w:right w:val="single" w:sz="4" w:space="0" w:color="BFBFBF"/>
+              <w:top w:val="single" w:sz="4" w:space="0" w:color="BFBFBF" w:themeColor="background1" w:themeShade="BF"/>
+              <w:left w:val="single" w:sz="4" w:space="0" w:color="BFBFBF" w:themeColor="background1" w:themeShade="BF"/>
+              <w:bottom w:val="single" w:sz="4" w:space="0" w:color="BFBFBF" w:themeColor="background1" w:themeShade="BF"/>
+              <w:right w:val="single" w:sz="4" w:space="0" w:color="BFBFBF" w:themeColor="background1" w:themeShade="BF"/>
             </w:tcBorders>
             <w:tcMar>
               <w:top w:w="58" w:type="dxa"/>
@@ -2669,10 +2914,10 @@
           <w:tcPr>
             <w:tcW w:w="2600" w:type="dxa"/>
             <w:tcBorders>
-              <w:top w:val="single" w:sz="4" w:space="0" w:color="BFBFBF"/>
-              <w:left w:val="single" w:sz="4" w:space="0" w:color="BFBFBF"/>
-              <w:bottom w:val="single" w:sz="4" w:space="0" w:color="BFBFBF"/>
-              <w:right w:val="single" w:sz="4" w:space="0" w:color="BFBFBF"/>
+              <w:top w:val="single" w:sz="4" w:space="0" w:color="BFBFBF" w:themeColor="background1" w:themeShade="BF"/>
+              <w:left w:val="single" w:sz="4" w:space="0" w:color="BFBFBF" w:themeColor="background1" w:themeShade="BF"/>
+              <w:bottom w:val="single" w:sz="4" w:space="0" w:color="BFBFBF" w:themeColor="background1" w:themeShade="BF"/>
+              <w:right w:val="single" w:sz="4" w:space="0" w:color="BFBFBF" w:themeColor="background1" w:themeShade="BF"/>
             </w:tcBorders>
             <w:tcMar>
               <w:top w:w="58" w:type="dxa"/>
@@ -2691,10 +2936,10 @@
           <w:tcPr>
             <w:tcW w:w="2000" w:type="dxa"/>
             <w:tcBorders>
-              <w:top w:val="single" w:sz="4" w:space="0" w:color="BFBFBF"/>
-              <w:left w:val="single" w:sz="4" w:space="0" w:color="BFBFBF"/>
-              <w:bottom w:val="single" w:sz="4" w:space="0" w:color="BFBFBF"/>
-              <w:right w:val="single" w:sz="4" w:space="0" w:color="BFBFBF"/>
+              <w:top w:val="single" w:sz="4" w:space="0" w:color="BFBFBF" w:themeColor="background1" w:themeShade="BF"/>
+              <w:left w:val="single" w:sz="4" w:space="0" w:color="BFBFBF" w:themeColor="background1" w:themeShade="BF"/>
+              <w:bottom w:val="single" w:sz="4" w:space="0" w:color="BFBFBF" w:themeColor="background1" w:themeShade="BF"/>
+              <w:right w:val="single" w:sz="4" w:space="0" w:color="BFBFBF" w:themeColor="background1" w:themeShade="BF"/>
             </w:tcBorders>
             <w:tcMar>
               <w:top w:w="58" w:type="dxa"/>
@@ -2713,10 +2958,10 @@
           <w:tcPr>
             <w:tcW w:w="2712" w:type="dxa"/>
             <w:tcBorders>
-              <w:top w:val="single" w:sz="4" w:space="0" w:color="BFBFBF"/>
-              <w:left w:val="single" w:sz="4" w:space="0" w:color="BFBFBF"/>
-              <w:bottom w:val="single" w:sz="4" w:space="0" w:color="BFBFBF"/>
-              <w:right w:val="single" w:sz="4" w:space="0" w:color="BFBFBF"/>
+              <w:top w:val="single" w:sz="4" w:space="0" w:color="BFBFBF" w:themeColor="background1" w:themeShade="BF"/>
+              <w:left w:val="single" w:sz="4" w:space="0" w:color="BFBFBF" w:themeColor="background1" w:themeShade="BF"/>
+              <w:bottom w:val="single" w:sz="4" w:space="0" w:color="BFBFBF" w:themeColor="background1" w:themeShade="BF"/>
+              <w:right w:val="single" w:sz="4" w:space="0" w:color="BFBFBF" w:themeColor="background1" w:themeShade="BF"/>
             </w:tcBorders>
             <w:shd w:val="clear" w:color="auto" w:fill="E2EFDA"/>
             <w:tcMar>
@@ -2738,10 +2983,10 @@
           <w:tcPr>
             <w:tcW w:w="3200" w:type="dxa"/>
             <w:tcBorders>
-              <w:top w:val="single" w:sz="4" w:space="0" w:color="BFBFBF"/>
-              <w:left w:val="single" w:sz="4" w:space="0" w:color="BFBFBF"/>
-              <w:bottom w:val="single" w:sz="4" w:space="0" w:color="BFBFBF"/>
-              <w:right w:val="single" w:sz="4" w:space="0" w:color="BFBFBF"/>
+              <w:top w:val="single" w:sz="4" w:space="0" w:color="BFBFBF" w:themeColor="background1" w:themeShade="BF"/>
+              <w:left w:val="single" w:sz="4" w:space="0" w:color="BFBFBF" w:themeColor="background1" w:themeShade="BF"/>
+              <w:bottom w:val="single" w:sz="4" w:space="0" w:color="BFBFBF" w:themeColor="background1" w:themeShade="BF"/>
+              <w:right w:val="single" w:sz="4" w:space="0" w:color="BFBFBF" w:themeColor="background1" w:themeShade="BF"/>
             </w:tcBorders>
             <w:tcMar>
               <w:top w:w="58" w:type="dxa"/>
@@ -2760,10 +3005,10 @@
           <w:tcPr>
             <w:tcW w:w="2600" w:type="dxa"/>
             <w:tcBorders>
-              <w:top w:val="single" w:sz="4" w:space="0" w:color="BFBFBF"/>
-              <w:left w:val="single" w:sz="4" w:space="0" w:color="BFBFBF"/>
-              <w:bottom w:val="single" w:sz="4" w:space="0" w:color="BFBFBF"/>
-              <w:right w:val="single" w:sz="4" w:space="0" w:color="BFBFBF"/>
+              <w:top w:val="single" w:sz="4" w:space="0" w:color="BFBFBF" w:themeColor="background1" w:themeShade="BF"/>
+              <w:left w:val="single" w:sz="4" w:space="0" w:color="BFBFBF" w:themeColor="background1" w:themeShade="BF"/>
+              <w:bottom w:val="single" w:sz="4" w:space="0" w:color="BFBFBF" w:themeColor="background1" w:themeShade="BF"/>
+              <w:right w:val="single" w:sz="4" w:space="0" w:color="BFBFBF" w:themeColor="background1" w:themeShade="BF"/>
             </w:tcBorders>
             <w:tcMar>
               <w:top w:w="58" w:type="dxa"/>
@@ -2782,10 +3027,10 @@
           <w:tcPr>
             <w:tcW w:w="2000" w:type="dxa"/>
             <w:tcBorders>
-              <w:top w:val="single" w:sz="4" w:space="0" w:color="BFBFBF"/>
-              <w:left w:val="single" w:sz="4" w:space="0" w:color="BFBFBF"/>
-              <w:bottom w:val="single" w:sz="4" w:space="0" w:color="BFBFBF"/>
-              <w:right w:val="single" w:sz="4" w:space="0" w:color="BFBFBF"/>
+              <w:top w:val="single" w:sz="4" w:space="0" w:color="BFBFBF" w:themeColor="background1" w:themeShade="BF"/>
+              <w:left w:val="single" w:sz="4" w:space="0" w:color="BFBFBF" w:themeColor="background1" w:themeShade="BF"/>
+              <w:bottom w:val="single" w:sz="4" w:space="0" w:color="BFBFBF" w:themeColor="background1" w:themeShade="BF"/>
+              <w:right w:val="single" w:sz="4" w:space="0" w:color="BFBFBF" w:themeColor="background1" w:themeShade="BF"/>
             </w:tcBorders>
             <w:tcMar>
               <w:top w:w="58" w:type="dxa"/>
@@ -2804,10 +3049,10 @@
           <w:tcPr>
             <w:tcW w:w="2712" w:type="dxa"/>
             <w:tcBorders>
-              <w:top w:val="single" w:sz="4" w:space="0" w:color="BFBFBF"/>
-              <w:left w:val="single" w:sz="4" w:space="0" w:color="BFBFBF"/>
-              <w:bottom w:val="single" w:sz="4" w:space="0" w:color="BFBFBF"/>
-              <w:right w:val="single" w:sz="4" w:space="0" w:color="BFBFBF"/>
+              <w:top w:val="single" w:sz="4" w:space="0" w:color="BFBFBF" w:themeColor="background1" w:themeShade="BF"/>
+              <w:left w:val="single" w:sz="4" w:space="0" w:color="BFBFBF" w:themeColor="background1" w:themeShade="BF"/>
+              <w:bottom w:val="single" w:sz="4" w:space="0" w:color="BFBFBF" w:themeColor="background1" w:themeShade="BF"/>
+              <w:right w:val="single" w:sz="4" w:space="0" w:color="BFBFBF" w:themeColor="background1" w:themeShade="BF"/>
             </w:tcBorders>
             <w:shd w:val="clear" w:color="auto" w:fill="FCE4D6"/>
             <w:tcMar>
@@ -2829,10 +3074,10 @@
           <w:tcPr>
             <w:tcW w:w="3200" w:type="dxa"/>
             <w:tcBorders>
-              <w:top w:val="single" w:sz="4" w:space="0" w:color="BFBFBF"/>
-              <w:left w:val="single" w:sz="4" w:space="0" w:color="BFBFBF"/>
-              <w:bottom w:val="single" w:sz="4" w:space="0" w:color="BFBFBF"/>
-              <w:right w:val="single" w:sz="4" w:space="0" w:color="BFBFBF"/>
+              <w:top w:val="single" w:sz="4" w:space="0" w:color="BFBFBF" w:themeColor="background1" w:themeShade="BF"/>
+              <w:left w:val="single" w:sz="4" w:space="0" w:color="BFBFBF" w:themeColor="background1" w:themeShade="BF"/>
+              <w:bottom w:val="single" w:sz="4" w:space="0" w:color="BFBFBF" w:themeColor="background1" w:themeShade="BF"/>
+              <w:right w:val="single" w:sz="4" w:space="0" w:color="BFBFBF" w:themeColor="background1" w:themeShade="BF"/>
             </w:tcBorders>
             <w:tcMar>
               <w:top w:w="58" w:type="dxa"/>
@@ -2851,10 +3096,10 @@
           <w:tcPr>
             <w:tcW w:w="2600" w:type="dxa"/>
             <w:tcBorders>
-              <w:top w:val="single" w:sz="4" w:space="0" w:color="BFBFBF"/>
-              <w:left w:val="single" w:sz="4" w:space="0" w:color="BFBFBF"/>
-              <w:bottom w:val="single" w:sz="4" w:space="0" w:color="BFBFBF"/>
-              <w:right w:val="single" w:sz="4" w:space="0" w:color="BFBFBF"/>
+              <w:top w:val="single" w:sz="4" w:space="0" w:color="BFBFBF" w:themeColor="background1" w:themeShade="BF"/>
+              <w:left w:val="single" w:sz="4" w:space="0" w:color="BFBFBF" w:themeColor="background1" w:themeShade="BF"/>
+              <w:bottom w:val="single" w:sz="4" w:space="0" w:color="BFBFBF" w:themeColor="background1" w:themeShade="BF"/>
+              <w:right w:val="single" w:sz="4" w:space="0" w:color="BFBFBF" w:themeColor="background1" w:themeShade="BF"/>
             </w:tcBorders>
             <w:tcMar>
               <w:top w:w="58" w:type="dxa"/>
@@ -2873,10 +3118,10 @@
           <w:tcPr>
             <w:tcW w:w="2000" w:type="dxa"/>
             <w:tcBorders>
-              <w:top w:val="single" w:sz="4" w:space="0" w:color="BFBFBF"/>
-              <w:left w:val="single" w:sz="4" w:space="0" w:color="BFBFBF"/>
-              <w:bottom w:val="single" w:sz="4" w:space="0" w:color="BFBFBF"/>
-              <w:right w:val="single" w:sz="4" w:space="0" w:color="BFBFBF"/>
+              <w:top w:val="single" w:sz="4" w:space="0" w:color="BFBFBF" w:themeColor="background1" w:themeShade="BF"/>
+              <w:left w:val="single" w:sz="4" w:space="0" w:color="BFBFBF" w:themeColor="background1" w:themeShade="BF"/>
+              <w:bottom w:val="single" w:sz="4" w:space="0" w:color="BFBFBF" w:themeColor="background1" w:themeShade="BF"/>
+              <w:right w:val="single" w:sz="4" w:space="0" w:color="BFBFBF" w:themeColor="background1" w:themeShade="BF"/>
             </w:tcBorders>
             <w:tcMar>
               <w:top w:w="58" w:type="dxa"/>
@@ -2895,10 +3140,10 @@
           <w:tcPr>
             <w:tcW w:w="2712" w:type="dxa"/>
             <w:tcBorders>
-              <w:top w:val="single" w:sz="4" w:space="0" w:color="BFBFBF"/>
-              <w:left w:val="single" w:sz="4" w:space="0" w:color="BFBFBF"/>
-              <w:bottom w:val="single" w:sz="4" w:space="0" w:color="BFBFBF"/>
-              <w:right w:val="single" w:sz="4" w:space="0" w:color="BFBFBF"/>
+              <w:top w:val="single" w:sz="4" w:space="0" w:color="BFBFBF" w:themeColor="background1" w:themeShade="BF"/>
+              <w:left w:val="single" w:sz="4" w:space="0" w:color="BFBFBF" w:themeColor="background1" w:themeShade="BF"/>
+              <w:bottom w:val="single" w:sz="4" w:space="0" w:color="BFBFBF" w:themeColor="background1" w:themeShade="BF"/>
+              <w:right w:val="single" w:sz="4" w:space="0" w:color="BFBFBF" w:themeColor="background1" w:themeShade="BF"/>
             </w:tcBorders>
             <w:shd w:val="clear" w:color="auto" w:fill="FFF2CC"/>
             <w:tcMar>
@@ -2920,10 +3165,10 @@
           <w:tcPr>
             <w:tcW w:w="3200" w:type="dxa"/>
             <w:tcBorders>
-              <w:top w:val="single" w:sz="4" w:space="0" w:color="BFBFBF"/>
-              <w:left w:val="single" w:sz="4" w:space="0" w:color="BFBFBF"/>
-              <w:bottom w:val="single" w:sz="4" w:space="0" w:color="BFBFBF"/>
-              <w:right w:val="single" w:sz="4" w:space="0" w:color="BFBFBF"/>
+              <w:top w:val="single" w:sz="4" w:space="0" w:color="BFBFBF" w:themeColor="background1" w:themeShade="BF"/>
+              <w:left w:val="single" w:sz="4" w:space="0" w:color="BFBFBF" w:themeColor="background1" w:themeShade="BF"/>
+              <w:bottom w:val="single" w:sz="4" w:space="0" w:color="BFBFBF" w:themeColor="background1" w:themeShade="BF"/>
+              <w:right w:val="single" w:sz="4" w:space="0" w:color="BFBFBF" w:themeColor="background1" w:themeShade="BF"/>
             </w:tcBorders>
             <w:tcMar>
               <w:top w:w="58" w:type="dxa"/>
@@ -2942,10 +3187,10 @@
           <w:tcPr>
             <w:tcW w:w="2600" w:type="dxa"/>
             <w:tcBorders>
-              <w:top w:val="single" w:sz="4" w:space="0" w:color="BFBFBF"/>
-              <w:left w:val="single" w:sz="4" w:space="0" w:color="BFBFBF"/>
-              <w:bottom w:val="single" w:sz="4" w:space="0" w:color="BFBFBF"/>
-              <w:right w:val="single" w:sz="4" w:space="0" w:color="BFBFBF"/>
+              <w:top w:val="single" w:sz="4" w:space="0" w:color="BFBFBF" w:themeColor="background1" w:themeShade="BF"/>
+              <w:left w:val="single" w:sz="4" w:space="0" w:color="BFBFBF" w:themeColor="background1" w:themeShade="BF"/>
+              <w:bottom w:val="single" w:sz="4" w:space="0" w:color="BFBFBF" w:themeColor="background1" w:themeShade="BF"/>
+              <w:right w:val="single" w:sz="4" w:space="0" w:color="BFBFBF" w:themeColor="background1" w:themeShade="BF"/>
             </w:tcBorders>
             <w:tcMar>
               <w:top w:w="58" w:type="dxa"/>
@@ -2964,10 +3209,10 @@
           <w:tcPr>
             <w:tcW w:w="2000" w:type="dxa"/>
             <w:tcBorders>
-              <w:top w:val="single" w:sz="4" w:space="0" w:color="BFBFBF"/>
-              <w:left w:val="single" w:sz="4" w:space="0" w:color="BFBFBF"/>
-              <w:bottom w:val="single" w:sz="4" w:space="0" w:color="BFBFBF"/>
-              <w:right w:val="single" w:sz="4" w:space="0" w:color="BFBFBF"/>
+              <w:top w:val="single" w:sz="4" w:space="0" w:color="BFBFBF" w:themeColor="background1" w:themeShade="BF"/>
+              <w:left w:val="single" w:sz="4" w:space="0" w:color="BFBFBF" w:themeColor="background1" w:themeShade="BF"/>
+              <w:bottom w:val="single" w:sz="4" w:space="0" w:color="BFBFBF" w:themeColor="background1" w:themeShade="BF"/>
+              <w:right w:val="single" w:sz="4" w:space="0" w:color="BFBFBF" w:themeColor="background1" w:themeShade="BF"/>
             </w:tcBorders>
             <w:tcMar>
               <w:top w:w="58" w:type="dxa"/>
@@ -2986,10 +3231,10 @@
           <w:tcPr>
             <w:tcW w:w="2712" w:type="dxa"/>
             <w:tcBorders>
-              <w:top w:val="single" w:sz="4" w:space="0" w:color="BFBFBF"/>
-              <w:left w:val="single" w:sz="4" w:space="0" w:color="BFBFBF"/>
-              <w:bottom w:val="single" w:sz="4" w:space="0" w:color="BFBFBF"/>
-              <w:right w:val="single" w:sz="4" w:space="0" w:color="BFBFBF"/>
+              <w:top w:val="single" w:sz="4" w:space="0" w:color="BFBFBF" w:themeColor="background1" w:themeShade="BF"/>
+              <w:left w:val="single" w:sz="4" w:space="0" w:color="BFBFBF" w:themeColor="background1" w:themeShade="BF"/>
+              <w:bottom w:val="single" w:sz="4" w:space="0" w:color="BFBFBF" w:themeColor="background1" w:themeShade="BF"/>
+              <w:right w:val="single" w:sz="4" w:space="0" w:color="BFBFBF" w:themeColor="background1" w:themeShade="BF"/>
             </w:tcBorders>
             <w:shd w:val="clear" w:color="auto" w:fill="FFF2CC"/>
             <w:tcMar>
@@ -3011,10 +3256,10 @@
           <w:tcPr>
             <w:tcW w:w="3200" w:type="dxa"/>
             <w:tcBorders>
-              <w:top w:val="single" w:sz="4" w:space="0" w:color="BFBFBF"/>
-              <w:left w:val="single" w:sz="4" w:space="0" w:color="BFBFBF"/>
-              <w:bottom w:val="single" w:sz="4" w:space="0" w:color="BFBFBF"/>
-              <w:right w:val="single" w:sz="4" w:space="0" w:color="BFBFBF"/>
+              <w:top w:val="single" w:sz="4" w:space="0" w:color="BFBFBF" w:themeColor="background1" w:themeShade="BF"/>
+              <w:left w:val="single" w:sz="4" w:space="0" w:color="BFBFBF" w:themeColor="background1" w:themeShade="BF"/>
+              <w:bottom w:val="single" w:sz="4" w:space="0" w:color="BFBFBF" w:themeColor="background1" w:themeShade="BF"/>
+              <w:right w:val="single" w:sz="4" w:space="0" w:color="BFBFBF" w:themeColor="background1" w:themeShade="BF"/>
             </w:tcBorders>
             <w:tcMar>
               <w:top w:w="58" w:type="dxa"/>
@@ -3033,10 +3278,10 @@
           <w:tcPr>
             <w:tcW w:w="2600" w:type="dxa"/>
             <w:tcBorders>
-              <w:top w:val="single" w:sz="4" w:space="0" w:color="BFBFBF"/>
-              <w:left w:val="single" w:sz="4" w:space="0" w:color="BFBFBF"/>
-              <w:bottom w:val="single" w:sz="4" w:space="0" w:color="BFBFBF"/>
-              <w:right w:val="single" w:sz="4" w:space="0" w:color="BFBFBF"/>
+              <w:top w:val="single" w:sz="4" w:space="0" w:color="BFBFBF" w:themeColor="background1" w:themeShade="BF"/>
+              <w:left w:val="single" w:sz="4" w:space="0" w:color="BFBFBF" w:themeColor="background1" w:themeShade="BF"/>
+              <w:bottom w:val="single" w:sz="4" w:space="0" w:color="BFBFBF" w:themeColor="background1" w:themeShade="BF"/>
+              <w:right w:val="single" w:sz="4" w:space="0" w:color="BFBFBF" w:themeColor="background1" w:themeShade="BF"/>
             </w:tcBorders>
             <w:tcMar>
               <w:top w:w="58" w:type="dxa"/>
@@ -3055,10 +3300,10 @@
           <w:tcPr>
             <w:tcW w:w="2000" w:type="dxa"/>
             <w:tcBorders>
-              <w:top w:val="single" w:sz="4" w:space="0" w:color="BFBFBF"/>
-              <w:left w:val="single" w:sz="4" w:space="0" w:color="BFBFBF"/>
-              <w:bottom w:val="single" w:sz="4" w:space="0" w:color="BFBFBF"/>
-              <w:right w:val="single" w:sz="4" w:space="0" w:color="BFBFBF"/>
+              <w:top w:val="single" w:sz="4" w:space="0" w:color="BFBFBF" w:themeColor="background1" w:themeShade="BF"/>
+              <w:left w:val="single" w:sz="4" w:space="0" w:color="BFBFBF" w:themeColor="background1" w:themeShade="BF"/>
+              <w:bottom w:val="single" w:sz="4" w:space="0" w:color="BFBFBF" w:themeColor="background1" w:themeShade="BF"/>
+              <w:right w:val="single" w:sz="4" w:space="0" w:color="BFBFBF" w:themeColor="background1" w:themeShade="BF"/>
             </w:tcBorders>
             <w:tcMar>
               <w:top w:w="58" w:type="dxa"/>
@@ -3077,10 +3322,10 @@
           <w:tcPr>
             <w:tcW w:w="2712" w:type="dxa"/>
             <w:tcBorders>
-              <w:top w:val="single" w:sz="4" w:space="0" w:color="BFBFBF"/>
-              <w:left w:val="single" w:sz="4" w:space="0" w:color="BFBFBF"/>
-              <w:bottom w:val="single" w:sz="4" w:space="0" w:color="BFBFBF"/>
-              <w:right w:val="single" w:sz="4" w:space="0" w:color="BFBFBF"/>
+              <w:top w:val="single" w:sz="4" w:space="0" w:color="BFBFBF" w:themeColor="background1" w:themeShade="BF"/>
+              <w:left w:val="single" w:sz="4" w:space="0" w:color="BFBFBF" w:themeColor="background1" w:themeShade="BF"/>
+              <w:bottom w:val="single" w:sz="4" w:space="0" w:color="BFBFBF" w:themeColor="background1" w:themeShade="BF"/>
+              <w:right w:val="single" w:sz="4" w:space="0" w:color="BFBFBF" w:themeColor="background1" w:themeShade="BF"/>
             </w:tcBorders>
             <w:shd w:val="clear" w:color="auto" w:fill="E2EFDA"/>
             <w:tcMar>
@@ -3102,10 +3347,10 @@
           <w:tcPr>
             <w:tcW w:w="3200" w:type="dxa"/>
             <w:tcBorders>
-              <w:top w:val="single" w:sz="4" w:space="0" w:color="BFBFBF"/>
-              <w:left w:val="single" w:sz="4" w:space="0" w:color="BFBFBF"/>
-              <w:bottom w:val="single" w:sz="4" w:space="0" w:color="BFBFBF"/>
-              <w:right w:val="single" w:sz="4" w:space="0" w:color="BFBFBF"/>
+              <w:top w:val="single" w:sz="4" w:space="0" w:color="BFBFBF" w:themeColor="background1" w:themeShade="BF"/>
+              <w:left w:val="single" w:sz="4" w:space="0" w:color="BFBFBF" w:themeColor="background1" w:themeShade="BF"/>
+              <w:bottom w:val="single" w:sz="4" w:space="0" w:color="BFBFBF" w:themeColor="background1" w:themeShade="BF"/>
+              <w:right w:val="single" w:sz="4" w:space="0" w:color="BFBFBF" w:themeColor="background1" w:themeShade="BF"/>
             </w:tcBorders>
             <w:tcMar>
               <w:top w:w="58" w:type="dxa"/>
@@ -3124,10 +3369,10 @@
           <w:tcPr>
             <w:tcW w:w="2600" w:type="dxa"/>
             <w:tcBorders>
-              <w:top w:val="single" w:sz="4" w:space="0" w:color="BFBFBF"/>
-              <w:left w:val="single" w:sz="4" w:space="0" w:color="BFBFBF"/>
-              <w:bottom w:val="single" w:sz="4" w:space="0" w:color="BFBFBF"/>
-              <w:right w:val="single" w:sz="4" w:space="0" w:color="BFBFBF"/>
+              <w:top w:val="single" w:sz="4" w:space="0" w:color="BFBFBF" w:themeColor="background1" w:themeShade="BF"/>
+              <w:left w:val="single" w:sz="4" w:space="0" w:color="BFBFBF" w:themeColor="background1" w:themeShade="BF"/>
+              <w:bottom w:val="single" w:sz="4" w:space="0" w:color="BFBFBF" w:themeColor="background1" w:themeShade="BF"/>
+              <w:right w:val="single" w:sz="4" w:space="0" w:color="BFBFBF" w:themeColor="background1" w:themeShade="BF"/>
             </w:tcBorders>
             <w:tcMar>
               <w:top w:w="58" w:type="dxa"/>
@@ -3146,10 +3391,10 @@
           <w:tcPr>
             <w:tcW w:w="2000" w:type="dxa"/>
             <w:tcBorders>
-              <w:top w:val="single" w:sz="4" w:space="0" w:color="BFBFBF"/>
-              <w:left w:val="single" w:sz="4" w:space="0" w:color="BFBFBF"/>
-              <w:bottom w:val="single" w:sz="4" w:space="0" w:color="BFBFBF"/>
-              <w:right w:val="single" w:sz="4" w:space="0" w:color="BFBFBF"/>
+              <w:top w:val="single" w:sz="4" w:space="0" w:color="BFBFBF" w:themeColor="background1" w:themeShade="BF"/>
+              <w:left w:val="single" w:sz="4" w:space="0" w:color="BFBFBF" w:themeColor="background1" w:themeShade="BF"/>
+              <w:bottom w:val="single" w:sz="4" w:space="0" w:color="BFBFBF" w:themeColor="background1" w:themeShade="BF"/>
+              <w:right w:val="single" w:sz="4" w:space="0" w:color="BFBFBF" w:themeColor="background1" w:themeShade="BF"/>
             </w:tcBorders>
             <w:tcMar>
               <w:top w:w="58" w:type="dxa"/>
@@ -3168,10 +3413,10 @@
           <w:tcPr>
             <w:tcW w:w="2712" w:type="dxa"/>
             <w:tcBorders>
-              <w:top w:val="single" w:sz="4" w:space="0" w:color="BFBFBF"/>
-              <w:left w:val="single" w:sz="4" w:space="0" w:color="BFBFBF"/>
-              <w:bottom w:val="single" w:sz="4" w:space="0" w:color="BFBFBF"/>
-              <w:right w:val="single" w:sz="4" w:space="0" w:color="BFBFBF"/>
+              <w:top w:val="single" w:sz="4" w:space="0" w:color="BFBFBF" w:themeColor="background1" w:themeShade="BF"/>
+              <w:left w:val="single" w:sz="4" w:space="0" w:color="BFBFBF" w:themeColor="background1" w:themeShade="BF"/>
+              <w:bottom w:val="single" w:sz="4" w:space="0" w:color="BFBFBF" w:themeColor="background1" w:themeShade="BF"/>
+              <w:right w:val="single" w:sz="4" w:space="0" w:color="BFBFBF" w:themeColor="background1" w:themeShade="BF"/>
             </w:tcBorders>
             <w:shd w:val="clear" w:color="auto" w:fill="FCE4D6"/>
             <w:tcMar>
@@ -3193,10 +3438,10 @@
           <w:tcPr>
             <w:tcW w:w="3200" w:type="dxa"/>
             <w:tcBorders>
-              <w:top w:val="single" w:sz="4" w:space="0" w:color="BFBFBF"/>
-              <w:left w:val="single" w:sz="4" w:space="0" w:color="BFBFBF"/>
-              <w:bottom w:val="single" w:sz="4" w:space="0" w:color="BFBFBF"/>
-              <w:right w:val="single" w:sz="4" w:space="0" w:color="BFBFBF"/>
+              <w:top w:val="single" w:sz="4" w:space="0" w:color="BFBFBF" w:themeColor="background1" w:themeShade="BF"/>
+              <w:left w:val="single" w:sz="4" w:space="0" w:color="BFBFBF" w:themeColor="background1" w:themeShade="BF"/>
+              <w:bottom w:val="single" w:sz="4" w:space="0" w:color="BFBFBF" w:themeColor="background1" w:themeShade="BF"/>
+              <w:right w:val="single" w:sz="4" w:space="0" w:color="BFBFBF" w:themeColor="background1" w:themeShade="BF"/>
             </w:tcBorders>
             <w:tcMar>
               <w:top w:w="58" w:type="dxa"/>
@@ -3215,10 +3460,10 @@
           <w:tcPr>
             <w:tcW w:w="2600" w:type="dxa"/>
             <w:tcBorders>
-              <w:top w:val="single" w:sz="4" w:space="0" w:color="BFBFBF"/>
-              <w:left w:val="single" w:sz="4" w:space="0" w:color="BFBFBF"/>
-              <w:bottom w:val="single" w:sz="4" w:space="0" w:color="BFBFBF"/>
-              <w:right w:val="single" w:sz="4" w:space="0" w:color="BFBFBF"/>
+              <w:top w:val="single" w:sz="4" w:space="0" w:color="BFBFBF" w:themeColor="background1" w:themeShade="BF"/>
+              <w:left w:val="single" w:sz="4" w:space="0" w:color="BFBFBF" w:themeColor="background1" w:themeShade="BF"/>
+              <w:bottom w:val="single" w:sz="4" w:space="0" w:color="BFBFBF" w:themeColor="background1" w:themeShade="BF"/>
+              <w:right w:val="single" w:sz="4" w:space="0" w:color="BFBFBF" w:themeColor="background1" w:themeShade="BF"/>
             </w:tcBorders>
             <w:tcMar>
               <w:top w:w="58" w:type="dxa"/>
@@ -3237,10 +3482,10 @@
           <w:tcPr>
             <w:tcW w:w="2000" w:type="dxa"/>
             <w:tcBorders>
-              <w:top w:val="single" w:sz="4" w:space="0" w:color="BFBFBF"/>
-              <w:left w:val="single" w:sz="4" w:space="0" w:color="BFBFBF"/>
-              <w:bottom w:val="single" w:sz="4" w:space="0" w:color="BFBFBF"/>
-              <w:right w:val="single" w:sz="4" w:space="0" w:color="BFBFBF"/>
+              <w:top w:val="single" w:sz="4" w:space="0" w:color="BFBFBF" w:themeColor="background1" w:themeShade="BF"/>
+              <w:left w:val="single" w:sz="4" w:space="0" w:color="BFBFBF" w:themeColor="background1" w:themeShade="BF"/>
+              <w:bottom w:val="single" w:sz="4" w:space="0" w:color="BFBFBF" w:themeColor="background1" w:themeShade="BF"/>
+              <w:right w:val="single" w:sz="4" w:space="0" w:color="BFBFBF" w:themeColor="background1" w:themeShade="BF"/>
             </w:tcBorders>
             <w:tcMar>
               <w:top w:w="58" w:type="dxa"/>
@@ -3259,10 +3504,10 @@
           <w:tcPr>
             <w:tcW w:w="2712" w:type="dxa"/>
             <w:tcBorders>
-              <w:top w:val="single" w:sz="4" w:space="0" w:color="BFBFBF"/>
-              <w:left w:val="single" w:sz="4" w:space="0" w:color="BFBFBF"/>
-              <w:bottom w:val="single" w:sz="4" w:space="0" w:color="BFBFBF"/>
-              <w:right w:val="single" w:sz="4" w:space="0" w:color="BFBFBF"/>
+              <w:top w:val="single" w:sz="4" w:space="0" w:color="BFBFBF" w:themeColor="background1" w:themeShade="BF"/>
+              <w:left w:val="single" w:sz="4" w:space="0" w:color="BFBFBF" w:themeColor="background1" w:themeShade="BF"/>
+              <w:bottom w:val="single" w:sz="4" w:space="0" w:color="BFBFBF" w:themeColor="background1" w:themeShade="BF"/>
+              <w:right w:val="single" w:sz="4" w:space="0" w:color="BFBFBF" w:themeColor="background1" w:themeShade="BF"/>
             </w:tcBorders>
             <w:shd w:val="clear" w:color="auto" w:fill="FCE4D6"/>
             <w:tcMar>
@@ -3284,10 +3529,10 @@
           <w:tcPr>
             <w:tcW w:w="3200" w:type="dxa"/>
             <w:tcBorders>
-              <w:top w:val="single" w:sz="4" w:space="0" w:color="BFBFBF"/>
-              <w:left w:val="single" w:sz="4" w:space="0" w:color="BFBFBF"/>
-              <w:bottom w:val="single" w:sz="4" w:space="0" w:color="BFBFBF"/>
-              <w:right w:val="single" w:sz="4" w:space="0" w:color="BFBFBF"/>
+              <w:top w:val="single" w:sz="4" w:space="0" w:color="BFBFBF" w:themeColor="background1" w:themeShade="BF"/>
+              <w:left w:val="single" w:sz="4" w:space="0" w:color="BFBFBF" w:themeColor="background1" w:themeShade="BF"/>
+              <w:bottom w:val="single" w:sz="4" w:space="0" w:color="BFBFBF" w:themeColor="background1" w:themeShade="BF"/>
+              <w:right w:val="single" w:sz="4" w:space="0" w:color="BFBFBF" w:themeColor="background1" w:themeShade="BF"/>
             </w:tcBorders>
             <w:shd w:val="clear" w:color="auto" w:fill="FFF2CC"/>
             <w:tcMar>
@@ -3298,6 +3543,13 @@
             </w:tcMar>
           </w:tcPr>
           <w:p>
+            <w:pPr>
+              <w:rPr>
+                <w:b/>
+                <w:bCs/>
+              </w:rPr>
+            </w:pPr>
+            <w:commentRangeStart w:id="17"/>
             <w:r>
               <w:rPr>
                 <w:b/>
@@ -3311,10 +3563,10 @@
           <w:tcPr>
             <w:tcW w:w="2600" w:type="dxa"/>
             <w:tcBorders>
-              <w:top w:val="single" w:sz="4" w:space="0" w:color="BFBFBF"/>
-              <w:left w:val="single" w:sz="4" w:space="0" w:color="BFBFBF"/>
-              <w:bottom w:val="single" w:sz="4" w:space="0" w:color="BFBFBF"/>
-              <w:right w:val="single" w:sz="4" w:space="0" w:color="BFBFBF"/>
+              <w:top w:val="single" w:sz="4" w:space="0" w:color="BFBFBF" w:themeColor="background1" w:themeShade="BF"/>
+              <w:left w:val="single" w:sz="4" w:space="0" w:color="BFBFBF" w:themeColor="background1" w:themeShade="BF"/>
+              <w:bottom w:val="single" w:sz="4" w:space="0" w:color="BFBFBF" w:themeColor="background1" w:themeShade="BF"/>
+              <w:right w:val="single" w:sz="4" w:space="0" w:color="BFBFBF" w:themeColor="background1" w:themeShade="BF"/>
             </w:tcBorders>
             <w:shd w:val="clear" w:color="auto" w:fill="FFF2CC"/>
             <w:tcMar>
@@ -3334,10 +3586,10 @@
           <w:tcPr>
             <w:tcW w:w="2000" w:type="dxa"/>
             <w:tcBorders>
-              <w:top w:val="single" w:sz="4" w:space="0" w:color="BFBFBF"/>
-              <w:left w:val="single" w:sz="4" w:space="0" w:color="BFBFBF"/>
-              <w:bottom w:val="single" w:sz="4" w:space="0" w:color="BFBFBF"/>
-              <w:right w:val="single" w:sz="4" w:space="0" w:color="BFBFBF"/>
+              <w:top w:val="single" w:sz="4" w:space="0" w:color="BFBFBF" w:themeColor="background1" w:themeShade="BF"/>
+              <w:left w:val="single" w:sz="4" w:space="0" w:color="BFBFBF" w:themeColor="background1" w:themeShade="BF"/>
+              <w:bottom w:val="single" w:sz="4" w:space="0" w:color="BFBFBF" w:themeColor="background1" w:themeShade="BF"/>
+              <w:right w:val="single" w:sz="4" w:space="0" w:color="BFBFBF" w:themeColor="background1" w:themeShade="BF"/>
             </w:tcBorders>
             <w:shd w:val="clear" w:color="auto" w:fill="FFF2CC"/>
             <w:tcMar>
@@ -3357,10 +3609,10 @@
           <w:tcPr>
             <w:tcW w:w="2712" w:type="dxa"/>
             <w:tcBorders>
-              <w:top w:val="single" w:sz="4" w:space="0" w:color="BFBFBF"/>
-              <w:left w:val="single" w:sz="4" w:space="0" w:color="BFBFBF"/>
-              <w:bottom w:val="single" w:sz="4" w:space="0" w:color="BFBFBF"/>
-              <w:right w:val="single" w:sz="4" w:space="0" w:color="BFBFBF"/>
+              <w:top w:val="single" w:sz="4" w:space="0" w:color="BFBFBF" w:themeColor="background1" w:themeShade="BF"/>
+              <w:left w:val="single" w:sz="4" w:space="0" w:color="BFBFBF" w:themeColor="background1" w:themeShade="BF"/>
+              <w:bottom w:val="single" w:sz="4" w:space="0" w:color="BFBFBF" w:themeColor="background1" w:themeShade="BF"/>
+              <w:right w:val="single" w:sz="4" w:space="0" w:color="BFBFBF" w:themeColor="background1" w:themeShade="BF"/>
             </w:tcBorders>
             <w:shd w:val="clear" w:color="auto" w:fill="FFF2CC"/>
             <w:tcMar>
@@ -3373,6 +3625,15 @@
           <w:p>
             <w:r>
               <w:t>Vehicle TBD: OP2 2026 adjustment, OP1 2027, or other</w:t>
+            </w:r>
+            <w:commentRangeEnd w:id="17"/>
+            <w:r>
+              <w:rPr>
+                <w:rStyle w:val="CommentReference"/>
+                <w:sz w:val="20"/>
+                <w:szCs w:val="20"/>
+              </w:rPr>
+              <w:commentReference w:id="17"/>
             </w:r>
           </w:p>
         </w:tc>
@@ -3382,10 +3643,10 @@
           <w:tcPr>
             <w:tcW w:w="3200" w:type="dxa"/>
             <w:tcBorders>
-              <w:top w:val="single" w:sz="4" w:space="0" w:color="BFBFBF"/>
-              <w:left w:val="single" w:sz="4" w:space="0" w:color="BFBFBF"/>
-              <w:bottom w:val="single" w:sz="4" w:space="0" w:color="BFBFBF"/>
-              <w:right w:val="single" w:sz="4" w:space="0" w:color="BFBFBF"/>
+              <w:top w:val="single" w:sz="4" w:space="0" w:color="BFBFBF" w:themeColor="background1" w:themeShade="BF"/>
+              <w:left w:val="single" w:sz="4" w:space="0" w:color="BFBFBF" w:themeColor="background1" w:themeShade="BF"/>
+              <w:bottom w:val="single" w:sz="4" w:space="0" w:color="BFBFBF" w:themeColor="background1" w:themeShade="BF"/>
+              <w:right w:val="single" w:sz="4" w:space="0" w:color="BFBFBF" w:themeColor="background1" w:themeShade="BF"/>
             </w:tcBorders>
             <w:shd w:val="clear" w:color="auto" w:fill="D9D9D9" w:themeFill="background1" w:themeFillShade="D9"/>
             <w:tcMar>
@@ -3405,10 +3666,10 @@
           <w:tcPr>
             <w:tcW w:w="2600" w:type="dxa"/>
             <w:tcBorders>
-              <w:top w:val="single" w:sz="4" w:space="0" w:color="BFBFBF"/>
-              <w:left w:val="single" w:sz="4" w:space="0" w:color="BFBFBF"/>
-              <w:bottom w:val="single" w:sz="4" w:space="0" w:color="BFBFBF"/>
-              <w:right w:val="single" w:sz="4" w:space="0" w:color="BFBFBF"/>
+              <w:top w:val="single" w:sz="4" w:space="0" w:color="BFBFBF" w:themeColor="background1" w:themeShade="BF"/>
+              <w:left w:val="single" w:sz="4" w:space="0" w:color="BFBFBF" w:themeColor="background1" w:themeShade="BF"/>
+              <w:bottom w:val="single" w:sz="4" w:space="0" w:color="BFBFBF" w:themeColor="background1" w:themeShade="BF"/>
+              <w:right w:val="single" w:sz="4" w:space="0" w:color="BFBFBF" w:themeColor="background1" w:themeShade="BF"/>
             </w:tcBorders>
             <w:shd w:val="clear" w:color="auto" w:fill="D9D9D9" w:themeFill="background1" w:themeFillShade="D9"/>
             <w:tcMar>
@@ -3428,10 +3689,10 @@
           <w:tcPr>
             <w:tcW w:w="2000" w:type="dxa"/>
             <w:tcBorders>
-              <w:top w:val="single" w:sz="4" w:space="0" w:color="BFBFBF"/>
-              <w:left w:val="single" w:sz="4" w:space="0" w:color="BFBFBF"/>
-              <w:bottom w:val="single" w:sz="4" w:space="0" w:color="BFBFBF"/>
-              <w:right w:val="single" w:sz="4" w:space="0" w:color="BFBFBF"/>
+              <w:top w:val="single" w:sz="4" w:space="0" w:color="BFBFBF" w:themeColor="background1" w:themeShade="BF"/>
+              <w:left w:val="single" w:sz="4" w:space="0" w:color="BFBFBF" w:themeColor="background1" w:themeShade="BF"/>
+              <w:bottom w:val="single" w:sz="4" w:space="0" w:color="BFBFBF" w:themeColor="background1" w:themeShade="BF"/>
+              <w:right w:val="single" w:sz="4" w:space="0" w:color="BFBFBF" w:themeColor="background1" w:themeShade="BF"/>
             </w:tcBorders>
             <w:shd w:val="clear" w:color="auto" w:fill="D9D9D9" w:themeFill="background1" w:themeFillShade="D9"/>
             <w:tcMar>
@@ -3451,10 +3712,10 @@
           <w:tcPr>
             <w:tcW w:w="2712" w:type="dxa"/>
             <w:tcBorders>
-              <w:top w:val="single" w:sz="4" w:space="0" w:color="BFBFBF"/>
-              <w:left w:val="single" w:sz="4" w:space="0" w:color="BFBFBF"/>
-              <w:bottom w:val="single" w:sz="4" w:space="0" w:color="BFBFBF"/>
-              <w:right w:val="single" w:sz="4" w:space="0" w:color="BFBFBF"/>
+              <w:top w:val="single" w:sz="4" w:space="0" w:color="BFBFBF" w:themeColor="background1" w:themeShade="BF"/>
+              <w:left w:val="single" w:sz="4" w:space="0" w:color="BFBFBF" w:themeColor="background1" w:themeShade="BF"/>
+              <w:bottom w:val="single" w:sz="4" w:space="0" w:color="BFBFBF" w:themeColor="background1" w:themeShade="BF"/>
+              <w:right w:val="single" w:sz="4" w:space="0" w:color="BFBFBF" w:themeColor="background1" w:themeShade="BF"/>
             </w:tcBorders>
             <w:shd w:val="clear" w:color="auto" w:fill="D9D9D9" w:themeFill="background1" w:themeFillShade="D9"/>
             <w:tcMar>
@@ -3476,10 +3737,10 @@
           <w:tcPr>
             <w:tcW w:w="3200" w:type="dxa"/>
             <w:tcBorders>
-              <w:top w:val="single" w:sz="4" w:space="0" w:color="BFBFBF"/>
-              <w:left w:val="single" w:sz="4" w:space="0" w:color="BFBFBF"/>
-              <w:bottom w:val="single" w:sz="4" w:space="0" w:color="BFBFBF"/>
-              <w:right w:val="single" w:sz="4" w:space="0" w:color="BFBFBF"/>
+              <w:top w:val="single" w:sz="4" w:space="0" w:color="BFBFBF" w:themeColor="background1" w:themeShade="BF"/>
+              <w:left w:val="single" w:sz="4" w:space="0" w:color="BFBFBF" w:themeColor="background1" w:themeShade="BF"/>
+              <w:bottom w:val="single" w:sz="4" w:space="0" w:color="BFBFBF" w:themeColor="background1" w:themeShade="BF"/>
+              <w:right w:val="single" w:sz="4" w:space="0" w:color="BFBFBF" w:themeColor="background1" w:themeShade="BF"/>
             </w:tcBorders>
             <w:shd w:val="clear" w:color="auto" w:fill="D9D9D9" w:themeFill="background1" w:themeFillShade="D9"/>
             <w:tcMar>
@@ -3499,10 +3760,10 @@
           <w:tcPr>
             <w:tcW w:w="2600" w:type="dxa"/>
             <w:tcBorders>
-              <w:top w:val="single" w:sz="4" w:space="0" w:color="BFBFBF"/>
-              <w:left w:val="single" w:sz="4" w:space="0" w:color="BFBFBF"/>
-              <w:bottom w:val="single" w:sz="4" w:space="0" w:color="BFBFBF"/>
-              <w:right w:val="single" w:sz="4" w:space="0" w:color="BFBFBF"/>
+              <w:top w:val="single" w:sz="4" w:space="0" w:color="BFBFBF" w:themeColor="background1" w:themeShade="BF"/>
+              <w:left w:val="single" w:sz="4" w:space="0" w:color="BFBFBF" w:themeColor="background1" w:themeShade="BF"/>
+              <w:bottom w:val="single" w:sz="4" w:space="0" w:color="BFBFBF" w:themeColor="background1" w:themeShade="BF"/>
+              <w:right w:val="single" w:sz="4" w:space="0" w:color="BFBFBF" w:themeColor="background1" w:themeShade="BF"/>
             </w:tcBorders>
             <w:shd w:val="clear" w:color="auto" w:fill="D9D9D9" w:themeFill="background1" w:themeFillShade="D9"/>
             <w:tcMar>
@@ -3522,10 +3783,10 @@
           <w:tcPr>
             <w:tcW w:w="2000" w:type="dxa"/>
             <w:tcBorders>
-              <w:top w:val="single" w:sz="4" w:space="0" w:color="BFBFBF"/>
-              <w:left w:val="single" w:sz="4" w:space="0" w:color="BFBFBF"/>
-              <w:bottom w:val="single" w:sz="4" w:space="0" w:color="BFBFBF"/>
-              <w:right w:val="single" w:sz="4" w:space="0" w:color="BFBFBF"/>
+              <w:top w:val="single" w:sz="4" w:space="0" w:color="BFBFBF" w:themeColor="background1" w:themeShade="BF"/>
+              <w:left w:val="single" w:sz="4" w:space="0" w:color="BFBFBF" w:themeColor="background1" w:themeShade="BF"/>
+              <w:bottom w:val="single" w:sz="4" w:space="0" w:color="BFBFBF" w:themeColor="background1" w:themeShade="BF"/>
+              <w:right w:val="single" w:sz="4" w:space="0" w:color="BFBFBF" w:themeColor="background1" w:themeShade="BF"/>
             </w:tcBorders>
             <w:shd w:val="clear" w:color="auto" w:fill="D9D9D9" w:themeFill="background1" w:themeFillShade="D9"/>
             <w:tcMar>
@@ -3545,10 +3806,10 @@
           <w:tcPr>
             <w:tcW w:w="2712" w:type="dxa"/>
             <w:tcBorders>
-              <w:top w:val="single" w:sz="4" w:space="0" w:color="BFBFBF"/>
-              <w:left w:val="single" w:sz="4" w:space="0" w:color="BFBFBF"/>
-              <w:bottom w:val="single" w:sz="4" w:space="0" w:color="BFBFBF"/>
-              <w:right w:val="single" w:sz="4" w:space="0" w:color="BFBFBF"/>
+              <w:top w:val="single" w:sz="4" w:space="0" w:color="BFBFBF" w:themeColor="background1" w:themeShade="BF"/>
+              <w:left w:val="single" w:sz="4" w:space="0" w:color="BFBFBF" w:themeColor="background1" w:themeShade="BF"/>
+              <w:bottom w:val="single" w:sz="4" w:space="0" w:color="BFBFBF" w:themeColor="background1" w:themeShade="BF"/>
+              <w:right w:val="single" w:sz="4" w:space="0" w:color="BFBFBF" w:themeColor="background1" w:themeShade="BF"/>
             </w:tcBorders>
             <w:shd w:val="clear" w:color="auto" w:fill="D9D9D9" w:themeFill="background1" w:themeFillShade="D9"/>
             <w:tcMar>
@@ -3570,10 +3831,10 @@
           <w:tcPr>
             <w:tcW w:w="3200" w:type="dxa"/>
             <w:tcBorders>
-              <w:top w:val="single" w:sz="4" w:space="0" w:color="BFBFBF"/>
-              <w:left w:val="single" w:sz="4" w:space="0" w:color="BFBFBF"/>
-              <w:bottom w:val="single" w:sz="4" w:space="0" w:color="BFBFBF"/>
-              <w:right w:val="single" w:sz="4" w:space="0" w:color="BFBFBF"/>
+              <w:top w:val="single" w:sz="4" w:space="0" w:color="BFBFBF" w:themeColor="background1" w:themeShade="BF"/>
+              <w:left w:val="single" w:sz="4" w:space="0" w:color="BFBFBF" w:themeColor="background1" w:themeShade="BF"/>
+              <w:bottom w:val="single" w:sz="4" w:space="0" w:color="BFBFBF" w:themeColor="background1" w:themeShade="BF"/>
+              <w:right w:val="single" w:sz="4" w:space="0" w:color="BFBFBF" w:themeColor="background1" w:themeShade="BF"/>
             </w:tcBorders>
             <w:shd w:val="clear" w:color="auto" w:fill="D9D9D9" w:themeFill="background1" w:themeFillShade="D9"/>
             <w:tcMar>
@@ -3593,10 +3854,10 @@
           <w:tcPr>
             <w:tcW w:w="2600" w:type="dxa"/>
             <w:tcBorders>
-              <w:top w:val="single" w:sz="4" w:space="0" w:color="BFBFBF"/>
-              <w:left w:val="single" w:sz="4" w:space="0" w:color="BFBFBF"/>
-              <w:bottom w:val="single" w:sz="4" w:space="0" w:color="BFBFBF"/>
-              <w:right w:val="single" w:sz="4" w:space="0" w:color="BFBFBF"/>
+              <w:top w:val="single" w:sz="4" w:space="0" w:color="BFBFBF" w:themeColor="background1" w:themeShade="BF"/>
+              <w:left w:val="single" w:sz="4" w:space="0" w:color="BFBFBF" w:themeColor="background1" w:themeShade="BF"/>
+              <w:bottom w:val="single" w:sz="4" w:space="0" w:color="BFBFBF" w:themeColor="background1" w:themeShade="BF"/>
+              <w:right w:val="single" w:sz="4" w:space="0" w:color="BFBFBF" w:themeColor="background1" w:themeShade="BF"/>
             </w:tcBorders>
             <w:shd w:val="clear" w:color="auto" w:fill="D9D9D9" w:themeFill="background1" w:themeFillShade="D9"/>
             <w:tcMar>
@@ -3616,10 +3877,10 @@
           <w:tcPr>
             <w:tcW w:w="2000" w:type="dxa"/>
             <w:tcBorders>
-              <w:top w:val="single" w:sz="4" w:space="0" w:color="BFBFBF"/>
-              <w:left w:val="single" w:sz="4" w:space="0" w:color="BFBFBF"/>
-              <w:bottom w:val="single" w:sz="4" w:space="0" w:color="BFBFBF"/>
-              <w:right w:val="single" w:sz="4" w:space="0" w:color="BFBFBF"/>
+              <w:top w:val="single" w:sz="4" w:space="0" w:color="BFBFBF" w:themeColor="background1" w:themeShade="BF"/>
+              <w:left w:val="single" w:sz="4" w:space="0" w:color="BFBFBF" w:themeColor="background1" w:themeShade="BF"/>
+              <w:bottom w:val="single" w:sz="4" w:space="0" w:color="BFBFBF" w:themeColor="background1" w:themeShade="BF"/>
+              <w:right w:val="single" w:sz="4" w:space="0" w:color="BFBFBF" w:themeColor="background1" w:themeShade="BF"/>
             </w:tcBorders>
             <w:shd w:val="clear" w:color="auto" w:fill="D9D9D9" w:themeFill="background1" w:themeFillShade="D9"/>
             <w:tcMar>
@@ -3639,10 +3900,10 @@
           <w:tcPr>
             <w:tcW w:w="2712" w:type="dxa"/>
             <w:tcBorders>
-              <w:top w:val="single" w:sz="4" w:space="0" w:color="BFBFBF"/>
-              <w:left w:val="single" w:sz="4" w:space="0" w:color="BFBFBF"/>
-              <w:bottom w:val="single" w:sz="4" w:space="0" w:color="BFBFBF"/>
-              <w:right w:val="single" w:sz="4" w:space="0" w:color="BFBFBF"/>
+              <w:top w:val="single" w:sz="4" w:space="0" w:color="BFBFBF" w:themeColor="background1" w:themeShade="BF"/>
+              <w:left w:val="single" w:sz="4" w:space="0" w:color="BFBFBF" w:themeColor="background1" w:themeShade="BF"/>
+              <w:bottom w:val="single" w:sz="4" w:space="0" w:color="BFBFBF" w:themeColor="background1" w:themeShade="BF"/>
+              <w:right w:val="single" w:sz="4" w:space="0" w:color="BFBFBF" w:themeColor="background1" w:themeShade="BF"/>
             </w:tcBorders>
             <w:shd w:val="clear" w:color="auto" w:fill="D9D9D9" w:themeFill="background1" w:themeFillShade="D9"/>
             <w:tcMar>
@@ -3664,10 +3925,10 @@
           <w:tcPr>
             <w:tcW w:w="3200" w:type="dxa"/>
             <w:tcBorders>
-              <w:top w:val="single" w:sz="4" w:space="0" w:color="BFBFBF"/>
-              <w:left w:val="single" w:sz="4" w:space="0" w:color="BFBFBF"/>
-              <w:bottom w:val="single" w:sz="4" w:space="0" w:color="BFBFBF"/>
-              <w:right w:val="single" w:sz="4" w:space="0" w:color="BFBFBF"/>
+              <w:top w:val="single" w:sz="4" w:space="0" w:color="BFBFBF" w:themeColor="background1" w:themeShade="BF"/>
+              <w:left w:val="single" w:sz="4" w:space="0" w:color="BFBFBF" w:themeColor="background1" w:themeShade="BF"/>
+              <w:bottom w:val="single" w:sz="4" w:space="0" w:color="BFBFBF" w:themeColor="background1" w:themeShade="BF"/>
+              <w:right w:val="single" w:sz="4" w:space="0" w:color="BFBFBF" w:themeColor="background1" w:themeShade="BF"/>
             </w:tcBorders>
             <w:shd w:val="clear" w:color="auto" w:fill="D9D9D9" w:themeFill="background1" w:themeFillShade="D9"/>
             <w:tcMar>
@@ -3687,10 +3948,10 @@
           <w:tcPr>
             <w:tcW w:w="2600" w:type="dxa"/>
             <w:tcBorders>
-              <w:top w:val="single" w:sz="4" w:space="0" w:color="BFBFBF"/>
-              <w:left w:val="single" w:sz="4" w:space="0" w:color="BFBFBF"/>
-              <w:bottom w:val="single" w:sz="4" w:space="0" w:color="BFBFBF"/>
-              <w:right w:val="single" w:sz="4" w:space="0" w:color="BFBFBF"/>
+              <w:top w:val="single" w:sz="4" w:space="0" w:color="BFBFBF" w:themeColor="background1" w:themeShade="BF"/>
+              <w:left w:val="single" w:sz="4" w:space="0" w:color="BFBFBF" w:themeColor="background1" w:themeShade="BF"/>
+              <w:bottom w:val="single" w:sz="4" w:space="0" w:color="BFBFBF" w:themeColor="background1" w:themeShade="BF"/>
+              <w:right w:val="single" w:sz="4" w:space="0" w:color="BFBFBF" w:themeColor="background1" w:themeShade="BF"/>
             </w:tcBorders>
             <w:shd w:val="clear" w:color="auto" w:fill="D9D9D9" w:themeFill="background1" w:themeFillShade="D9"/>
             <w:tcMar>
@@ -3710,10 +3971,10 @@
           <w:tcPr>
             <w:tcW w:w="2000" w:type="dxa"/>
             <w:tcBorders>
-              <w:top w:val="single" w:sz="4" w:space="0" w:color="BFBFBF"/>
-              <w:left w:val="single" w:sz="4" w:space="0" w:color="BFBFBF"/>
-              <w:bottom w:val="single" w:sz="4" w:space="0" w:color="BFBFBF"/>
-              <w:right w:val="single" w:sz="4" w:space="0" w:color="BFBFBF"/>
+              <w:top w:val="single" w:sz="4" w:space="0" w:color="BFBFBF" w:themeColor="background1" w:themeShade="BF"/>
+              <w:left w:val="single" w:sz="4" w:space="0" w:color="BFBFBF" w:themeColor="background1" w:themeShade="BF"/>
+              <w:bottom w:val="single" w:sz="4" w:space="0" w:color="BFBFBF" w:themeColor="background1" w:themeShade="BF"/>
+              <w:right w:val="single" w:sz="4" w:space="0" w:color="BFBFBF" w:themeColor="background1" w:themeShade="BF"/>
             </w:tcBorders>
             <w:shd w:val="clear" w:color="auto" w:fill="D9D9D9" w:themeFill="background1" w:themeFillShade="D9"/>
             <w:tcMar>
@@ -3733,10 +3994,10 @@
           <w:tcPr>
             <w:tcW w:w="2712" w:type="dxa"/>
             <w:tcBorders>
-              <w:top w:val="single" w:sz="4" w:space="0" w:color="BFBFBF"/>
-              <w:left w:val="single" w:sz="4" w:space="0" w:color="BFBFBF"/>
-              <w:bottom w:val="single" w:sz="4" w:space="0" w:color="BFBFBF"/>
-              <w:right w:val="single" w:sz="4" w:space="0" w:color="BFBFBF"/>
+              <w:top w:val="single" w:sz="4" w:space="0" w:color="BFBFBF" w:themeColor="background1" w:themeShade="BF"/>
+              <w:left w:val="single" w:sz="4" w:space="0" w:color="BFBFBF" w:themeColor="background1" w:themeShade="BF"/>
+              <w:bottom w:val="single" w:sz="4" w:space="0" w:color="BFBFBF" w:themeColor="background1" w:themeShade="BF"/>
+              <w:right w:val="single" w:sz="4" w:space="0" w:color="BFBFBF" w:themeColor="background1" w:themeShade="BF"/>
             </w:tcBorders>
             <w:shd w:val="clear" w:color="auto" w:fill="D9D9D9" w:themeFill="background1" w:themeFillShade="D9"/>
             <w:tcMar>
@@ -3758,10 +4019,10 @@
           <w:tcPr>
             <w:tcW w:w="3200" w:type="dxa"/>
             <w:tcBorders>
-              <w:top w:val="single" w:sz="4" w:space="0" w:color="BFBFBF"/>
-              <w:left w:val="single" w:sz="4" w:space="0" w:color="BFBFBF"/>
-              <w:bottom w:val="single" w:sz="4" w:space="0" w:color="BFBFBF"/>
-              <w:right w:val="single" w:sz="4" w:space="0" w:color="BFBFBF"/>
+              <w:top w:val="single" w:sz="4" w:space="0" w:color="BFBFBF" w:themeColor="background1" w:themeShade="BF"/>
+              <w:left w:val="single" w:sz="4" w:space="0" w:color="BFBFBF" w:themeColor="background1" w:themeShade="BF"/>
+              <w:bottom w:val="single" w:sz="4" w:space="0" w:color="BFBFBF" w:themeColor="background1" w:themeShade="BF"/>
+              <w:right w:val="single" w:sz="4" w:space="0" w:color="BFBFBF" w:themeColor="background1" w:themeShade="BF"/>
             </w:tcBorders>
             <w:shd w:val="clear" w:color="auto" w:fill="D9D9D9" w:themeFill="background1" w:themeFillShade="D9"/>
             <w:tcMar>
@@ -3781,10 +4042,10 @@
           <w:tcPr>
             <w:tcW w:w="2600" w:type="dxa"/>
             <w:tcBorders>
-              <w:top w:val="single" w:sz="4" w:space="0" w:color="BFBFBF"/>
-              <w:left w:val="single" w:sz="4" w:space="0" w:color="BFBFBF"/>
-              <w:bottom w:val="single" w:sz="4" w:space="0" w:color="BFBFBF"/>
-              <w:right w:val="single" w:sz="4" w:space="0" w:color="BFBFBF"/>
+              <w:top w:val="single" w:sz="4" w:space="0" w:color="BFBFBF" w:themeColor="background1" w:themeShade="BF"/>
+              <w:left w:val="single" w:sz="4" w:space="0" w:color="BFBFBF" w:themeColor="background1" w:themeShade="BF"/>
+              <w:bottom w:val="single" w:sz="4" w:space="0" w:color="BFBFBF" w:themeColor="background1" w:themeShade="BF"/>
+              <w:right w:val="single" w:sz="4" w:space="0" w:color="BFBFBF" w:themeColor="background1" w:themeShade="BF"/>
             </w:tcBorders>
             <w:shd w:val="clear" w:color="auto" w:fill="D9D9D9" w:themeFill="background1" w:themeFillShade="D9"/>
             <w:tcMar>
@@ -3804,10 +4065,10 @@
           <w:tcPr>
             <w:tcW w:w="2000" w:type="dxa"/>
             <w:tcBorders>
-              <w:top w:val="single" w:sz="4" w:space="0" w:color="BFBFBF"/>
-              <w:left w:val="single" w:sz="4" w:space="0" w:color="BFBFBF"/>
-              <w:bottom w:val="single" w:sz="4" w:space="0" w:color="BFBFBF"/>
-              <w:right w:val="single" w:sz="4" w:space="0" w:color="BFBFBF"/>
+              <w:top w:val="single" w:sz="4" w:space="0" w:color="BFBFBF" w:themeColor="background1" w:themeShade="BF"/>
+              <w:left w:val="single" w:sz="4" w:space="0" w:color="BFBFBF" w:themeColor="background1" w:themeShade="BF"/>
+              <w:bottom w:val="single" w:sz="4" w:space="0" w:color="BFBFBF" w:themeColor="background1" w:themeShade="BF"/>
+              <w:right w:val="single" w:sz="4" w:space="0" w:color="BFBFBF" w:themeColor="background1" w:themeShade="BF"/>
             </w:tcBorders>
             <w:shd w:val="clear" w:color="auto" w:fill="D9D9D9" w:themeFill="background1" w:themeFillShade="D9"/>
             <w:tcMar>
@@ -3827,10 +4088,10 @@
           <w:tcPr>
             <w:tcW w:w="2712" w:type="dxa"/>
             <w:tcBorders>
-              <w:top w:val="single" w:sz="4" w:space="0" w:color="BFBFBF"/>
-              <w:left w:val="single" w:sz="4" w:space="0" w:color="BFBFBF"/>
-              <w:bottom w:val="single" w:sz="4" w:space="0" w:color="BFBFBF"/>
-              <w:right w:val="single" w:sz="4" w:space="0" w:color="BFBFBF"/>
+              <w:top w:val="single" w:sz="4" w:space="0" w:color="BFBFBF" w:themeColor="background1" w:themeShade="BF"/>
+              <w:left w:val="single" w:sz="4" w:space="0" w:color="BFBFBF" w:themeColor="background1" w:themeShade="BF"/>
+              <w:bottom w:val="single" w:sz="4" w:space="0" w:color="BFBFBF" w:themeColor="background1" w:themeShade="BF"/>
+              <w:right w:val="single" w:sz="4" w:space="0" w:color="BFBFBF" w:themeColor="background1" w:themeShade="BF"/>
             </w:tcBorders>
             <w:shd w:val="clear" w:color="auto" w:fill="D9D9D9" w:themeFill="background1" w:themeFillShade="D9"/>
             <w:tcMar>
@@ -3852,10 +4113,10 @@
           <w:tcPr>
             <w:tcW w:w="3200" w:type="dxa"/>
             <w:tcBorders>
-              <w:top w:val="single" w:sz="4" w:space="0" w:color="BFBFBF"/>
-              <w:left w:val="single" w:sz="4" w:space="0" w:color="BFBFBF"/>
-              <w:bottom w:val="single" w:sz="4" w:space="0" w:color="BFBFBF"/>
-              <w:right w:val="single" w:sz="4" w:space="0" w:color="BFBFBF"/>
+              <w:top w:val="single" w:sz="4" w:space="0" w:color="BFBFBF" w:themeColor="background1" w:themeShade="BF"/>
+              <w:left w:val="single" w:sz="4" w:space="0" w:color="BFBFBF" w:themeColor="background1" w:themeShade="BF"/>
+              <w:bottom w:val="single" w:sz="4" w:space="0" w:color="BFBFBF" w:themeColor="background1" w:themeShade="BF"/>
+              <w:right w:val="single" w:sz="4" w:space="0" w:color="BFBFBF" w:themeColor="background1" w:themeShade="BF"/>
             </w:tcBorders>
             <w:shd w:val="clear" w:color="auto" w:fill="D9D9D9" w:themeFill="background1" w:themeFillShade="D9"/>
             <w:tcMar>
@@ -3875,10 +4136,10 @@
           <w:tcPr>
             <w:tcW w:w="2600" w:type="dxa"/>
             <w:tcBorders>
-              <w:top w:val="single" w:sz="4" w:space="0" w:color="BFBFBF"/>
-              <w:left w:val="single" w:sz="4" w:space="0" w:color="BFBFBF"/>
-              <w:bottom w:val="single" w:sz="4" w:space="0" w:color="BFBFBF"/>
-              <w:right w:val="single" w:sz="4" w:space="0" w:color="BFBFBF"/>
+              <w:top w:val="single" w:sz="4" w:space="0" w:color="BFBFBF" w:themeColor="background1" w:themeShade="BF"/>
+              <w:left w:val="single" w:sz="4" w:space="0" w:color="BFBFBF" w:themeColor="background1" w:themeShade="BF"/>
+              <w:bottom w:val="single" w:sz="4" w:space="0" w:color="BFBFBF" w:themeColor="background1" w:themeShade="BF"/>
+              <w:right w:val="single" w:sz="4" w:space="0" w:color="BFBFBF" w:themeColor="background1" w:themeShade="BF"/>
             </w:tcBorders>
             <w:shd w:val="clear" w:color="auto" w:fill="D9D9D9" w:themeFill="background1" w:themeFillShade="D9"/>
             <w:tcMar>
@@ -3898,10 +4159,10 @@
           <w:tcPr>
             <w:tcW w:w="2000" w:type="dxa"/>
             <w:tcBorders>
-              <w:top w:val="single" w:sz="4" w:space="0" w:color="BFBFBF"/>
-              <w:left w:val="single" w:sz="4" w:space="0" w:color="BFBFBF"/>
-              <w:bottom w:val="single" w:sz="4" w:space="0" w:color="BFBFBF"/>
-              <w:right w:val="single" w:sz="4" w:space="0" w:color="BFBFBF"/>
+              <w:top w:val="single" w:sz="4" w:space="0" w:color="BFBFBF" w:themeColor="background1" w:themeShade="BF"/>
+              <w:left w:val="single" w:sz="4" w:space="0" w:color="BFBFBF" w:themeColor="background1" w:themeShade="BF"/>
+              <w:bottom w:val="single" w:sz="4" w:space="0" w:color="BFBFBF" w:themeColor="background1" w:themeShade="BF"/>
+              <w:right w:val="single" w:sz="4" w:space="0" w:color="BFBFBF" w:themeColor="background1" w:themeShade="BF"/>
             </w:tcBorders>
             <w:shd w:val="clear" w:color="auto" w:fill="D9D9D9" w:themeFill="background1" w:themeFillShade="D9"/>
             <w:tcMar>
@@ -3921,10 +4182,10 @@
           <w:tcPr>
             <w:tcW w:w="2712" w:type="dxa"/>
             <w:tcBorders>
-              <w:top w:val="single" w:sz="4" w:space="0" w:color="BFBFBF"/>
-              <w:left w:val="single" w:sz="4" w:space="0" w:color="BFBFBF"/>
-              <w:bottom w:val="single" w:sz="4" w:space="0" w:color="BFBFBF"/>
-              <w:right w:val="single" w:sz="4" w:space="0" w:color="BFBFBF"/>
+              <w:top w:val="single" w:sz="4" w:space="0" w:color="BFBFBF" w:themeColor="background1" w:themeShade="BF"/>
+              <w:left w:val="single" w:sz="4" w:space="0" w:color="BFBFBF" w:themeColor="background1" w:themeShade="BF"/>
+              <w:bottom w:val="single" w:sz="4" w:space="0" w:color="BFBFBF" w:themeColor="background1" w:themeShade="BF"/>
+              <w:right w:val="single" w:sz="4" w:space="0" w:color="BFBFBF" w:themeColor="background1" w:themeShade="BF"/>
             </w:tcBorders>
             <w:shd w:val="clear" w:color="auto" w:fill="D9D9D9" w:themeFill="background1" w:themeFillShade="D9"/>
             <w:tcMar>
@@ -3946,10 +4207,10 @@
           <w:tcPr>
             <w:tcW w:w="3200" w:type="dxa"/>
             <w:tcBorders>
-              <w:top w:val="single" w:sz="4" w:space="0" w:color="BFBFBF"/>
-              <w:left w:val="single" w:sz="4" w:space="0" w:color="BFBFBF"/>
-              <w:bottom w:val="single" w:sz="4" w:space="0" w:color="BFBFBF"/>
-              <w:right w:val="single" w:sz="4" w:space="0" w:color="BFBFBF"/>
+              <w:top w:val="single" w:sz="4" w:space="0" w:color="BFBFBF" w:themeColor="background1" w:themeShade="BF"/>
+              <w:left w:val="single" w:sz="4" w:space="0" w:color="BFBFBF" w:themeColor="background1" w:themeShade="BF"/>
+              <w:bottom w:val="single" w:sz="4" w:space="0" w:color="BFBFBF" w:themeColor="background1" w:themeShade="BF"/>
+              <w:right w:val="single" w:sz="4" w:space="0" w:color="BFBFBF" w:themeColor="background1" w:themeShade="BF"/>
             </w:tcBorders>
             <w:shd w:val="clear" w:color="auto" w:fill="D9D9D9" w:themeFill="background1" w:themeFillShade="D9"/>
             <w:tcMar>
@@ -3969,10 +4230,10 @@
           <w:tcPr>
             <w:tcW w:w="2600" w:type="dxa"/>
             <w:tcBorders>
-              <w:top w:val="single" w:sz="4" w:space="0" w:color="BFBFBF"/>
-              <w:left w:val="single" w:sz="4" w:space="0" w:color="BFBFBF"/>
-              <w:bottom w:val="single" w:sz="4" w:space="0" w:color="BFBFBF"/>
-              <w:right w:val="single" w:sz="4" w:space="0" w:color="BFBFBF"/>
+              <w:top w:val="single" w:sz="4" w:space="0" w:color="BFBFBF" w:themeColor="background1" w:themeShade="BF"/>
+              <w:left w:val="single" w:sz="4" w:space="0" w:color="BFBFBF" w:themeColor="background1" w:themeShade="BF"/>
+              <w:bottom w:val="single" w:sz="4" w:space="0" w:color="BFBFBF" w:themeColor="background1" w:themeShade="BF"/>
+              <w:right w:val="single" w:sz="4" w:space="0" w:color="BFBFBF" w:themeColor="background1" w:themeShade="BF"/>
             </w:tcBorders>
             <w:shd w:val="clear" w:color="auto" w:fill="D9D9D9" w:themeFill="background1" w:themeFillShade="D9"/>
             <w:tcMar>
@@ -3992,10 +4253,10 @@
           <w:tcPr>
             <w:tcW w:w="2000" w:type="dxa"/>
             <w:tcBorders>
-              <w:top w:val="single" w:sz="4" w:space="0" w:color="BFBFBF"/>
-              <w:left w:val="single" w:sz="4" w:space="0" w:color="BFBFBF"/>
-              <w:bottom w:val="single" w:sz="4" w:space="0" w:color="BFBFBF"/>
-              <w:right w:val="single" w:sz="4" w:space="0" w:color="BFBFBF"/>
+              <w:top w:val="single" w:sz="4" w:space="0" w:color="BFBFBF" w:themeColor="background1" w:themeShade="BF"/>
+              <w:left w:val="single" w:sz="4" w:space="0" w:color="BFBFBF" w:themeColor="background1" w:themeShade="BF"/>
+              <w:bottom w:val="single" w:sz="4" w:space="0" w:color="BFBFBF" w:themeColor="background1" w:themeShade="BF"/>
+              <w:right w:val="single" w:sz="4" w:space="0" w:color="BFBFBF" w:themeColor="background1" w:themeShade="BF"/>
             </w:tcBorders>
             <w:shd w:val="clear" w:color="auto" w:fill="D9D9D9" w:themeFill="background1" w:themeFillShade="D9"/>
             <w:tcMar>
@@ -4015,10 +4276,10 @@
           <w:tcPr>
             <w:tcW w:w="2712" w:type="dxa"/>
             <w:tcBorders>
-              <w:top w:val="single" w:sz="4" w:space="0" w:color="BFBFBF"/>
-              <w:left w:val="single" w:sz="4" w:space="0" w:color="BFBFBF"/>
-              <w:bottom w:val="single" w:sz="4" w:space="0" w:color="BFBFBF"/>
-              <w:right w:val="single" w:sz="4" w:space="0" w:color="BFBFBF"/>
+              <w:top w:val="single" w:sz="4" w:space="0" w:color="BFBFBF" w:themeColor="background1" w:themeShade="BF"/>
+              <w:left w:val="single" w:sz="4" w:space="0" w:color="BFBFBF" w:themeColor="background1" w:themeShade="BF"/>
+              <w:bottom w:val="single" w:sz="4" w:space="0" w:color="BFBFBF" w:themeColor="background1" w:themeShade="BF"/>
+              <w:right w:val="single" w:sz="4" w:space="0" w:color="BFBFBF" w:themeColor="background1" w:themeShade="BF"/>
             </w:tcBorders>
             <w:shd w:val="clear" w:color="auto" w:fill="D9D9D9" w:themeFill="background1" w:themeFillShade="D9"/>
             <w:tcMar>
@@ -4040,10 +4301,10 @@
           <w:tcPr>
             <w:tcW w:w="3200" w:type="dxa"/>
             <w:tcBorders>
-              <w:top w:val="single" w:sz="4" w:space="0" w:color="BFBFBF"/>
-              <w:left w:val="single" w:sz="4" w:space="0" w:color="BFBFBF"/>
-              <w:bottom w:val="single" w:sz="4" w:space="0" w:color="BFBFBF"/>
-              <w:right w:val="single" w:sz="4" w:space="0" w:color="BFBFBF"/>
+              <w:top w:val="single" w:sz="4" w:space="0" w:color="BFBFBF" w:themeColor="background1" w:themeShade="BF"/>
+              <w:left w:val="single" w:sz="4" w:space="0" w:color="BFBFBF" w:themeColor="background1" w:themeShade="BF"/>
+              <w:bottom w:val="single" w:sz="4" w:space="0" w:color="BFBFBF" w:themeColor="background1" w:themeShade="BF"/>
+              <w:right w:val="single" w:sz="4" w:space="0" w:color="BFBFBF" w:themeColor="background1" w:themeShade="BF"/>
             </w:tcBorders>
             <w:shd w:val="clear" w:color="auto" w:fill="D9D9D9" w:themeFill="background1" w:themeFillShade="D9"/>
             <w:tcMar>
@@ -4063,10 +4324,10 @@
           <w:tcPr>
             <w:tcW w:w="2600" w:type="dxa"/>
             <w:tcBorders>
-              <w:top w:val="single" w:sz="4" w:space="0" w:color="BFBFBF"/>
-              <w:left w:val="single" w:sz="4" w:space="0" w:color="BFBFBF"/>
-              <w:bottom w:val="single" w:sz="4" w:space="0" w:color="BFBFBF"/>
-              <w:right w:val="single" w:sz="4" w:space="0" w:color="BFBFBF"/>
+              <w:top w:val="single" w:sz="4" w:space="0" w:color="BFBFBF" w:themeColor="background1" w:themeShade="BF"/>
+              <w:left w:val="single" w:sz="4" w:space="0" w:color="BFBFBF" w:themeColor="background1" w:themeShade="BF"/>
+              <w:bottom w:val="single" w:sz="4" w:space="0" w:color="BFBFBF" w:themeColor="background1" w:themeShade="BF"/>
+              <w:right w:val="single" w:sz="4" w:space="0" w:color="BFBFBF" w:themeColor="background1" w:themeShade="BF"/>
             </w:tcBorders>
             <w:shd w:val="clear" w:color="auto" w:fill="D9D9D9" w:themeFill="background1" w:themeFillShade="D9"/>
             <w:tcMar>
@@ -4086,10 +4347,10 @@
           <w:tcPr>
             <w:tcW w:w="2000" w:type="dxa"/>
             <w:tcBorders>
-              <w:top w:val="single" w:sz="4" w:space="0" w:color="BFBFBF"/>
-              <w:left w:val="single" w:sz="4" w:space="0" w:color="BFBFBF"/>
-              <w:bottom w:val="single" w:sz="4" w:space="0" w:color="BFBFBF"/>
-              <w:right w:val="single" w:sz="4" w:space="0" w:color="BFBFBF"/>
+              <w:top w:val="single" w:sz="4" w:space="0" w:color="BFBFBF" w:themeColor="background1" w:themeShade="BF"/>
+              <w:left w:val="single" w:sz="4" w:space="0" w:color="BFBFBF" w:themeColor="background1" w:themeShade="BF"/>
+              <w:bottom w:val="single" w:sz="4" w:space="0" w:color="BFBFBF" w:themeColor="background1" w:themeShade="BF"/>
+              <w:right w:val="single" w:sz="4" w:space="0" w:color="BFBFBF" w:themeColor="background1" w:themeShade="BF"/>
             </w:tcBorders>
             <w:shd w:val="clear" w:color="auto" w:fill="D9D9D9" w:themeFill="background1" w:themeFillShade="D9"/>
             <w:tcMar>
@@ -4109,10 +4370,10 @@
           <w:tcPr>
             <w:tcW w:w="2712" w:type="dxa"/>
             <w:tcBorders>
-              <w:top w:val="single" w:sz="4" w:space="0" w:color="BFBFBF"/>
-              <w:left w:val="single" w:sz="4" w:space="0" w:color="BFBFBF"/>
-              <w:bottom w:val="single" w:sz="4" w:space="0" w:color="BFBFBF"/>
-              <w:right w:val="single" w:sz="4" w:space="0" w:color="BFBFBF"/>
+              <w:top w:val="single" w:sz="4" w:space="0" w:color="BFBFBF" w:themeColor="background1" w:themeShade="BF"/>
+              <w:left w:val="single" w:sz="4" w:space="0" w:color="BFBFBF" w:themeColor="background1" w:themeShade="BF"/>
+              <w:bottom w:val="single" w:sz="4" w:space="0" w:color="BFBFBF" w:themeColor="background1" w:themeShade="BF"/>
+              <w:right w:val="single" w:sz="4" w:space="0" w:color="BFBFBF" w:themeColor="background1" w:themeShade="BF"/>
             </w:tcBorders>
             <w:shd w:val="clear" w:color="auto" w:fill="D9D9D9" w:themeFill="background1" w:themeFillShade="D9"/>
             <w:tcMar>
@@ -4134,10 +4395,10 @@
           <w:tcPr>
             <w:tcW w:w="3200" w:type="dxa"/>
             <w:tcBorders>
-              <w:top w:val="single" w:sz="4" w:space="0" w:color="BFBFBF"/>
-              <w:left w:val="single" w:sz="4" w:space="0" w:color="BFBFBF"/>
-              <w:bottom w:val="single" w:sz="4" w:space="0" w:color="BFBFBF"/>
-              <w:right w:val="single" w:sz="4" w:space="0" w:color="BFBFBF"/>
+              <w:top w:val="single" w:sz="4" w:space="0" w:color="BFBFBF" w:themeColor="background1" w:themeShade="BF"/>
+              <w:left w:val="single" w:sz="4" w:space="0" w:color="BFBFBF" w:themeColor="background1" w:themeShade="BF"/>
+              <w:bottom w:val="single" w:sz="4" w:space="0" w:color="BFBFBF" w:themeColor="background1" w:themeShade="BF"/>
+              <w:right w:val="single" w:sz="4" w:space="0" w:color="BFBFBF" w:themeColor="background1" w:themeShade="BF"/>
             </w:tcBorders>
             <w:shd w:val="clear" w:color="auto" w:fill="D9D9D9" w:themeFill="background1" w:themeFillShade="D9"/>
             <w:tcMar>
@@ -4149,7 +4410,6 @@
           </w:tcPr>
           <w:p>
             <w:r>
-              <w:lastRenderedPageBreak/>
               <w:t>SKU/FC-grain semantic table (SC-BIE)</w:t>
             </w:r>
           </w:p>
@@ -4158,10 +4418,10 @@
           <w:tcPr>
             <w:tcW w:w="2600" w:type="dxa"/>
             <w:tcBorders>
-              <w:top w:val="single" w:sz="4" w:space="0" w:color="BFBFBF"/>
-              <w:left w:val="single" w:sz="4" w:space="0" w:color="BFBFBF"/>
-              <w:bottom w:val="single" w:sz="4" w:space="0" w:color="BFBFBF"/>
-              <w:right w:val="single" w:sz="4" w:space="0" w:color="BFBFBF"/>
+              <w:top w:val="single" w:sz="4" w:space="0" w:color="BFBFBF" w:themeColor="background1" w:themeShade="BF"/>
+              <w:left w:val="single" w:sz="4" w:space="0" w:color="BFBFBF" w:themeColor="background1" w:themeShade="BF"/>
+              <w:bottom w:val="single" w:sz="4" w:space="0" w:color="BFBFBF" w:themeColor="background1" w:themeShade="BF"/>
+              <w:right w:val="single" w:sz="4" w:space="0" w:color="BFBFBF" w:themeColor="background1" w:themeShade="BF"/>
             </w:tcBorders>
             <w:shd w:val="clear" w:color="auto" w:fill="D9D9D9" w:themeFill="background1" w:themeFillShade="D9"/>
             <w:tcMar>
@@ -4181,10 +4441,10 @@
           <w:tcPr>
             <w:tcW w:w="2000" w:type="dxa"/>
             <w:tcBorders>
-              <w:top w:val="single" w:sz="4" w:space="0" w:color="BFBFBF"/>
-              <w:left w:val="single" w:sz="4" w:space="0" w:color="BFBFBF"/>
-              <w:bottom w:val="single" w:sz="4" w:space="0" w:color="BFBFBF"/>
-              <w:right w:val="single" w:sz="4" w:space="0" w:color="BFBFBF"/>
+              <w:top w:val="single" w:sz="4" w:space="0" w:color="BFBFBF" w:themeColor="background1" w:themeShade="BF"/>
+              <w:left w:val="single" w:sz="4" w:space="0" w:color="BFBFBF" w:themeColor="background1" w:themeShade="BF"/>
+              <w:bottom w:val="single" w:sz="4" w:space="0" w:color="BFBFBF" w:themeColor="background1" w:themeShade="BF"/>
+              <w:right w:val="single" w:sz="4" w:space="0" w:color="BFBFBF" w:themeColor="background1" w:themeShade="BF"/>
             </w:tcBorders>
             <w:shd w:val="clear" w:color="auto" w:fill="D9D9D9" w:themeFill="background1" w:themeFillShade="D9"/>
             <w:tcMar>
@@ -4204,10 +4464,10 @@
           <w:tcPr>
             <w:tcW w:w="2712" w:type="dxa"/>
             <w:tcBorders>
-              <w:top w:val="single" w:sz="4" w:space="0" w:color="BFBFBF"/>
-              <w:left w:val="single" w:sz="4" w:space="0" w:color="BFBFBF"/>
-              <w:bottom w:val="single" w:sz="4" w:space="0" w:color="BFBFBF"/>
-              <w:right w:val="single" w:sz="4" w:space="0" w:color="BFBFBF"/>
+              <w:top w:val="single" w:sz="4" w:space="0" w:color="BFBFBF" w:themeColor="background1" w:themeShade="BF"/>
+              <w:left w:val="single" w:sz="4" w:space="0" w:color="BFBFBF" w:themeColor="background1" w:themeShade="BF"/>
+              <w:bottom w:val="single" w:sz="4" w:space="0" w:color="BFBFBF" w:themeColor="background1" w:themeShade="BF"/>
+              <w:right w:val="single" w:sz="4" w:space="0" w:color="BFBFBF" w:themeColor="background1" w:themeShade="BF"/>
             </w:tcBorders>
             <w:shd w:val="clear" w:color="auto" w:fill="D9D9D9" w:themeFill="background1" w:themeFillShade="D9"/>
             <w:tcMar>
@@ -4229,10 +4489,10 @@
           <w:tcPr>
             <w:tcW w:w="3200" w:type="dxa"/>
             <w:tcBorders>
-              <w:top w:val="single" w:sz="4" w:space="0" w:color="BFBFBF"/>
-              <w:left w:val="single" w:sz="4" w:space="0" w:color="BFBFBF"/>
-              <w:bottom w:val="single" w:sz="4" w:space="0" w:color="BFBFBF"/>
-              <w:right w:val="single" w:sz="4" w:space="0" w:color="BFBFBF"/>
+              <w:top w:val="single" w:sz="4" w:space="0" w:color="BFBFBF" w:themeColor="background1" w:themeShade="BF"/>
+              <w:left w:val="single" w:sz="4" w:space="0" w:color="BFBFBF" w:themeColor="background1" w:themeShade="BF"/>
+              <w:bottom w:val="single" w:sz="4" w:space="0" w:color="BFBFBF" w:themeColor="background1" w:themeShade="BF"/>
+              <w:right w:val="single" w:sz="4" w:space="0" w:color="BFBFBF" w:themeColor="background1" w:themeShade="BF"/>
             </w:tcBorders>
             <w:shd w:val="clear" w:color="auto" w:fill="D9D9D9" w:themeFill="background1" w:themeFillShade="D9"/>
             <w:tcMar>
@@ -4252,10 +4512,10 @@
           <w:tcPr>
             <w:tcW w:w="2600" w:type="dxa"/>
             <w:tcBorders>
-              <w:top w:val="single" w:sz="4" w:space="0" w:color="BFBFBF"/>
-              <w:left w:val="single" w:sz="4" w:space="0" w:color="BFBFBF"/>
-              <w:bottom w:val="single" w:sz="4" w:space="0" w:color="BFBFBF"/>
-              <w:right w:val="single" w:sz="4" w:space="0" w:color="BFBFBF"/>
+              <w:top w:val="single" w:sz="4" w:space="0" w:color="BFBFBF" w:themeColor="background1" w:themeShade="BF"/>
+              <w:left w:val="single" w:sz="4" w:space="0" w:color="BFBFBF" w:themeColor="background1" w:themeShade="BF"/>
+              <w:bottom w:val="single" w:sz="4" w:space="0" w:color="BFBFBF" w:themeColor="background1" w:themeShade="BF"/>
+              <w:right w:val="single" w:sz="4" w:space="0" w:color="BFBFBF" w:themeColor="background1" w:themeShade="BF"/>
             </w:tcBorders>
             <w:shd w:val="clear" w:color="auto" w:fill="D9D9D9" w:themeFill="background1" w:themeFillShade="D9"/>
             <w:tcMar>
@@ -4275,10 +4535,10 @@
           <w:tcPr>
             <w:tcW w:w="2000" w:type="dxa"/>
             <w:tcBorders>
-              <w:top w:val="single" w:sz="4" w:space="0" w:color="BFBFBF"/>
-              <w:left w:val="single" w:sz="4" w:space="0" w:color="BFBFBF"/>
-              <w:bottom w:val="single" w:sz="4" w:space="0" w:color="BFBFBF"/>
-              <w:right w:val="single" w:sz="4" w:space="0" w:color="BFBFBF"/>
+              <w:top w:val="single" w:sz="4" w:space="0" w:color="BFBFBF" w:themeColor="background1" w:themeShade="BF"/>
+              <w:left w:val="single" w:sz="4" w:space="0" w:color="BFBFBF" w:themeColor="background1" w:themeShade="BF"/>
+              <w:bottom w:val="single" w:sz="4" w:space="0" w:color="BFBFBF" w:themeColor="background1" w:themeShade="BF"/>
+              <w:right w:val="single" w:sz="4" w:space="0" w:color="BFBFBF" w:themeColor="background1" w:themeShade="BF"/>
             </w:tcBorders>
             <w:shd w:val="clear" w:color="auto" w:fill="D9D9D9" w:themeFill="background1" w:themeFillShade="D9"/>
             <w:tcMar>
@@ -4298,10 +4558,10 @@
           <w:tcPr>
             <w:tcW w:w="2712" w:type="dxa"/>
             <w:tcBorders>
-              <w:top w:val="single" w:sz="4" w:space="0" w:color="BFBFBF"/>
-              <w:left w:val="single" w:sz="4" w:space="0" w:color="BFBFBF"/>
-              <w:bottom w:val="single" w:sz="4" w:space="0" w:color="BFBFBF"/>
-              <w:right w:val="single" w:sz="4" w:space="0" w:color="BFBFBF"/>
+              <w:top w:val="single" w:sz="4" w:space="0" w:color="BFBFBF" w:themeColor="background1" w:themeShade="BF"/>
+              <w:left w:val="single" w:sz="4" w:space="0" w:color="BFBFBF" w:themeColor="background1" w:themeShade="BF"/>
+              <w:bottom w:val="single" w:sz="4" w:space="0" w:color="BFBFBF" w:themeColor="background1" w:themeShade="BF"/>
+              <w:right w:val="single" w:sz="4" w:space="0" w:color="BFBFBF" w:themeColor="background1" w:themeShade="BF"/>
             </w:tcBorders>
             <w:shd w:val="clear" w:color="auto" w:fill="D9D9D9" w:themeFill="background1" w:themeFillShade="D9"/>
             <w:tcMar>
@@ -4880,8 +5140,8 @@
       </w:r>
     </w:p>
     <w:sectPr>
-      <w:headerReference w:type="default" r:id="rId9"/>
-      <w:footerReference w:type="default" r:id="rId10"/>
+      <w:headerReference w:type="default" r:id="rId13"/>
+      <w:footerReference w:type="default" r:id="rId14"/>
       <w:pgSz w:w="12240" w:h="15840"/>
       <w:pgMar w:top="720" w:right="720" w:bottom="720" w:left="720" w:header="432" w:footer="432" w:gutter="288"/>
       <w:lnNumType w:countBy="1" w:distance="360"/>
@@ -4890,6 +5150,358 @@
     </w:sectPr>
   </w:body>
 </w:document>
+</file>
+
+<file path=word/comments.xml><?xml version="1.0" encoding="utf-8"?>
+<w:comments xmlns:wpc="http://schemas.microsoft.com/office/word/2010/wordprocessingCanvas" xmlns:cx="http://schemas.microsoft.com/office/drawing/2014/chartex" xmlns:cx1="http://schemas.microsoft.com/office/drawing/2015/9/8/chartex" xmlns:cx2="http://schemas.microsoft.com/office/drawing/2015/10/21/chartex" xmlns:cx3="http://schemas.microsoft.com/office/drawing/2016/5/9/chartex" xmlns:cx4="http://schemas.microsoft.com/office/drawing/2016/5/10/chartex" xmlns:cx5="http://schemas.microsoft.com/office/drawing/2016/5/11/chartex" xmlns:cx6="http://schemas.microsoft.com/office/drawing/2016/5/12/chartex" xmlns:cx7="http://schemas.microsoft.com/office/drawing/2016/5/13/chartex" xmlns:cx8="http://schemas.microsoft.com/office/drawing/2016/5/14/chartex" xmlns:mc="http://schemas.openxmlformats.org/markup-compatibility/2006" xmlns:aink="http://schemas.microsoft.com/office/drawing/2016/ink" xmlns:am3d="http://schemas.microsoft.com/office/drawing/2017/model3d" xmlns:o="urn:schemas-microsoft-com:office:office" xmlns:oel="http://schemas.microsoft.com/office/2019/extlst" xmlns:r="http://schemas.openxmlformats.org/officeDocument/2006/relationships" xmlns:m="http://schemas.openxmlformats.org/officeDocument/2006/math" xmlns:v="urn:schemas-microsoft-com:vml" xmlns:wp14="http://schemas.microsoft.com/office/word/2010/wordprocessingDrawing" xmlns:wp="http://schemas.openxmlformats.org/drawingml/2006/wordprocessingDrawing" xmlns:w10="urn:schemas-microsoft-com:office:word" xmlns:w="http://schemas.openxmlformats.org/wordprocessingml/2006/main" xmlns:w14="http://schemas.microsoft.com/office/word/2010/wordml" xmlns:w15="http://schemas.microsoft.com/office/word/2012/wordml" xmlns:w16cex="http://schemas.microsoft.com/office/word/2018/wordml/cex" xmlns:w16cid="http://schemas.microsoft.com/office/word/2016/wordml/cid" xmlns:w16="http://schemas.microsoft.com/office/word/2018/wordml" xmlns:w16du="http://schemas.microsoft.com/office/word/2023/wordml/word16du" xmlns:w16sdtdh="http://schemas.microsoft.com/office/word/2020/wordml/sdtdatahash" xmlns:w16sdtfl="http://schemas.microsoft.com/office/word/2024/wordml/sdtformatlock" xmlns:w16se="http://schemas.microsoft.com/office/word/2015/wordml/symex" xmlns:wpg="http://schemas.microsoft.com/office/word/2010/wordprocessingGroup" xmlns:wpi="http://schemas.microsoft.com/office/word/2010/wordprocessingInk" xmlns:wne="http://schemas.microsoft.com/office/word/2006/wordml" xmlns:wps="http://schemas.microsoft.com/office/word/2010/wordprocessingShape" mc:Ignorable="w14 w15 w16se w16cid w16 w16cex w16sdtdh w16sdtfl w16du wp14">
+  <w:comment w:id="0" w:author="Keinan Zanck" w:date="2026-03-18T12:39:00Z" w:initials="KZ">
+    <w:p>
+      <w:pPr>
+        <w:pStyle w:val="CommentText"/>
+      </w:pPr>
+      <w:r>
+        <w:rPr>
+          <w:rStyle w:val="CommentReference"/>
+        </w:rPr>
+        <w:annotationRef/>
+      </w:r>
+      <w:r>
+        <w:t xml:space="preserve">docs should be individual agnostic </w:t>
+      </w:r>
+    </w:p>
+  </w:comment>
+  <w:comment w:id="1" w:author="Nathan Miles" w:date="2026-03-18T12:41:00Z" w:initials="NM">
+    <w:p>
+      <w:r>
+        <w:rPr>
+          <w:rStyle w:val="CommentReference"/>
+        </w:rPr>
+        <w:annotationRef/>
+      </w:r>
+      <w:r>
+        <w:t>Noted—easy fix. THX</w:t>
+      </w:r>
+    </w:p>
+  </w:comment>
+  <w:comment w:id="2" w:author="Steven Palmer" w:date="2026-03-18T12:36:00Z" w:initials="SP">
+    <w:p>
+      <w:r>
+        <w:annotationRef/>
+      </w:r>
+      <w:r>
+        <w:t>Does this tie back to the $10M in entitlement in the opening sections? Is CPH the unlock, or are we planning to expand regardless of CPH integration?</w:t>
+      </w:r>
+    </w:p>
+  </w:comment>
+  <w:comment w:id="3" w:author="Keinan Zanck" w:date="2026-03-18T12:38:00Z" w:initials="KZ">
+    <w:p>
+      <w:pPr>
+        <w:pStyle w:val="CommentText"/>
+      </w:pPr>
+      <w:r>
+        <w:rPr>
+          <w:rStyle w:val="CommentReference"/>
+        </w:rPr>
+        <w:annotationRef/>
+      </w:r>
+      <w:r>
+        <w:t xml:space="preserve">if it does- I'm not aligned to include here until we see a doc quantifying the opportunity and explaining how we came to this figure. </w:t>
+      </w:r>
+    </w:p>
+    <w:p>
+      <w:pPr>
+        <w:pStyle w:val="CommentText"/>
+      </w:pPr>
+      <w:r>
+        <w:t xml:space="preserve">if it does not- also interested to hear/see where this figure is from </w:t>
+      </w:r>
+    </w:p>
+  </w:comment>
+  <w:comment w:id="4" w:author="Nathan Miles" w:date="2026-03-18T12:39:00Z" w:initials="NM">
+    <w:p>
+      <w:r>
+        <w:rPr>
+          <w:rStyle w:val="CommentReference"/>
+        </w:rPr>
+        <w:annotationRef/>
+      </w:r>
+      <w:r>
+        <w:t xml:space="preserve">I'll look back to see if I cribbed that from Nelson's notes. Possible that I might have misinterpreted. </w:t>
+      </w:r>
+    </w:p>
+  </w:comment>
+  <w:comment w:id="5" w:author="Steven Palmer" w:date="2026-03-18T12:39:00Z" w:initials="SP">
+    <w:p>
+      <w:pPr>
+        <w:pStyle w:val="CommentText"/>
+      </w:pPr>
+      <w:r>
+        <w:rPr>
+          <w:rStyle w:val="CommentReference"/>
+        </w:rPr>
+        <w:annotationRef/>
+      </w:r>
+      <w:r>
+        <w:t>first time seeing Tiers mentioned - wouldn't hurt to point to appendix to explain tiering in CPFR (our table on the confluence pretty much outlines it)</w:t>
+      </w:r>
+    </w:p>
+  </w:comment>
+  <w:comment w:id="6" w:author="Phanindher Patlola" w:date="2026-03-18T12:41:00Z" w:initials="PP">
+    <w:p>
+      <w:pPr>
+        <w:pStyle w:val="CommentText"/>
+      </w:pPr>
+      <w:r>
+        <w:rPr>
+          <w:rStyle w:val="CommentReference"/>
+        </w:rPr>
+        <w:annotationRef/>
+      </w:r>
+      <w:r>
+        <w:t>Can we add what is missing from our team - we shared prelim BRD and wireframes. Do we have user stories for ISM and Vendor reviewed and aligned?</w:t>
+      </w:r>
+    </w:p>
+  </w:comment>
+  <w:comment w:id="7" w:author="Nathan Miles" w:date="2026-03-18T12:44:00Z" w:initials="NM">
+    <w:p>
+      <w:r>
+        <w:rPr>
+          <w:rStyle w:val="CommentReference"/>
+        </w:rPr>
+        <w:annotationRef/>
+      </w:r>
+      <w:r>
+        <w:t>We have them (user stories). Alignment was informal—we showed it to Jeremy Wartnick and Harish and never got any pushback—that might be worth bubbling up, but it would help to have on or more POCs in mind which kind if points back to the engineering contact(s), no?</w:t>
+      </w:r>
+    </w:p>
+  </w:comment>
+  <w:comment w:id="8" w:author="Keinan Zanck" w:date="2026-03-18T12:42:00Z" w:initials="KZ">
+    <w:p>
+      <w:pPr>
+        <w:pStyle w:val="CommentText"/>
+      </w:pPr>
+      <w:r>
+        <w:rPr>
+          <w:rStyle w:val="CommentReference"/>
+        </w:rPr>
+        <w:annotationRef/>
+      </w:r>
+      <w:r>
+        <w:t xml:space="preserve">I'm unclear what this is- Product management support perhaps?  </w:t>
+      </w:r>
+    </w:p>
+  </w:comment>
+  <w:comment w:id="9" w:author="Phanindher Patlola" w:date="2026-03-18T12:41:00Z" w:initials="PP">
+    <w:p>
+      <w:pPr>
+        <w:pStyle w:val="CommentText"/>
+      </w:pPr>
+      <w:r>
+        <w:rPr>
+          <w:rStyle w:val="CommentReference"/>
+        </w:rPr>
+        <w:annotationRef/>
+      </w:r>
+      <w:r>
+        <w:t xml:space="preserve">Need clear math details in appendix </w:t>
+      </w:r>
+    </w:p>
+  </w:comment>
+  <w:comment w:id="10" w:author="Keinan Zanck" w:date="2026-03-18T12:43:00Z" w:initials="KZ">
+    <w:p>
+      <w:pPr>
+        <w:pStyle w:val="CommentText"/>
+      </w:pPr>
+      <w:r>
+        <w:rPr>
+          <w:rStyle w:val="CommentReference"/>
+        </w:rPr>
+        <w:annotationRef/>
+      </w:r>
+      <w:r>
+        <w:t xml:space="preserve">as mentioned above- I don't see how we can put this here for leader review before anyone has seen what this entails and the math behind it. not that it's not important, just that I'm not aligned to discuss a figure in this document until I'm aligned to that figure in the first place </w:t>
+      </w:r>
+    </w:p>
+  </w:comment>
+  <w:comment w:id="11" w:author="Steven Palmer" w:date="2026-03-18T12:45:00Z" w:initials="SP">
+    <w:p>
+      <w:pPr>
+        <w:pStyle w:val="CommentText"/>
+      </w:pPr>
+      <w:r>
+        <w:rPr>
+          <w:rStyle w:val="CommentReference"/>
+        </w:rPr>
+        <w:annotationRef/>
+      </w:r>
+      <w:r>
+        <w:t>i don't understand what this is referring to</w:t>
+      </w:r>
+    </w:p>
+  </w:comment>
+  <w:comment w:id="12" w:author="Phanindher Patlola" w:date="2026-03-18T12:42:00Z" w:initials="PP">
+    <w:p>
+      <w:pPr>
+        <w:pStyle w:val="CommentText"/>
+      </w:pPr>
+      <w:r>
+        <w:rPr>
+          <w:rStyle w:val="CommentReference"/>
+        </w:rPr>
+        <w:annotationRef/>
+      </w:r>
+      <w:r>
+        <w:t>Don’t follow this - who did this?</w:t>
+      </w:r>
+    </w:p>
+  </w:comment>
+  <w:comment w:id="13" w:author="Phanindher Patlola" w:date="2026-03-18T12:43:00Z" w:initials="PP">
+    <w:p>
+      <w:pPr>
+        <w:pStyle w:val="CommentText"/>
+      </w:pPr>
+      <w:r>
+        <w:rPr>
+          <w:rStyle w:val="CommentReference"/>
+        </w:rPr>
+        <w:annotationRef/>
+      </w:r>
+      <w:r>
+        <w:t>This isn’t done and is WIP, correct?</w:t>
+      </w:r>
+    </w:p>
+  </w:comment>
+  <w:comment w:id="14" w:author="Nathan Miles" w:date="2026-03-18T12:47:00Z" w:initials="NM">
+    <w:p>
+      <w:r>
+        <w:rPr>
+          <w:rStyle w:val="CommentReference"/>
+        </w:rPr>
+        <w:annotationRef/>
+      </w:r>
+      <w:r>
+        <w:t>PRFAQ should get a formal look before we circulate it, but it's been revised from the last review we did on both docs (PRFAQ and Roadmap from last time)</w:t>
+      </w:r>
+    </w:p>
+  </w:comment>
+  <w:comment w:id="15" w:author="Keinan Zanck" w:date="2026-03-18T12:47:00Z" w:initials="KZ">
+    <w:p>
+      <w:pPr>
+        <w:pStyle w:val="CommentText"/>
+      </w:pPr>
+      <w:r>
+        <w:rPr>
+          <w:rStyle w:val="CommentReference"/>
+        </w:rPr>
+        <w:annotationRef/>
+      </w:r>
+      <w:r>
+        <w:t xml:space="preserve">+leadership sponsorship (i.e. need to get this on a roadmap with regular updates, not just meetings) </w:t>
+      </w:r>
+    </w:p>
+  </w:comment>
+  <w:comment w:id="16" w:author="Phanindher Patlola" w:date="2026-03-18T12:44:00Z" w:initials="PP">
+    <w:p>
+      <w:pPr>
+        <w:pStyle w:val="CommentText"/>
+      </w:pPr>
+      <w:r>
+        <w:rPr>
+          <w:rStyle w:val="CommentReference"/>
+        </w:rPr>
+        <w:annotationRef/>
+      </w:r>
+      <w:r>
+        <w:t>We should not quantify engineers required</w:t>
+      </w:r>
+    </w:p>
+  </w:comment>
+  <w:comment w:id="17" w:author="Keinan Zanck" w:date="2026-03-18T12:55:00Z" w:initials="KZ">
+    <w:p>
+      <w:pPr>
+        <w:pStyle w:val="CommentText"/>
+      </w:pPr>
+      <w:r>
+        <w:rPr>
+          <w:rStyle w:val="CommentReference"/>
+        </w:rPr>
+        <w:annotationRef/>
+      </w:r>
+      <w:r>
+        <w:t xml:space="preserve">should this piece not come before we invest in all the proceeding work outlaid here? </w:t>
+      </w:r>
+    </w:p>
+  </w:comment>
+</w:comments>
+</file>
+
+<file path=word/commentsExtended.xml><?xml version="1.0" encoding="utf-8"?>
+<w15:commentsEx xmlns:wpc="http://schemas.microsoft.com/office/word/2010/wordprocessingCanvas" xmlns:cx="http://schemas.microsoft.com/office/drawing/2014/chartex" xmlns:cx1="http://schemas.microsoft.com/office/drawing/2015/9/8/chartex" xmlns:cx2="http://schemas.microsoft.com/office/drawing/2015/10/21/chartex" xmlns:cx3="http://schemas.microsoft.com/office/drawing/2016/5/9/chartex" xmlns:cx4="http://schemas.microsoft.com/office/drawing/2016/5/10/chartex" xmlns:cx5="http://schemas.microsoft.com/office/drawing/2016/5/11/chartex" xmlns:cx6="http://schemas.microsoft.com/office/drawing/2016/5/12/chartex" xmlns:cx7="http://schemas.microsoft.com/office/drawing/2016/5/13/chartex" xmlns:cx8="http://schemas.microsoft.com/office/drawing/2016/5/14/chartex" xmlns:mc="http://schemas.openxmlformats.org/markup-compatibility/2006" xmlns:aink="http://schemas.microsoft.com/office/drawing/2016/ink" xmlns:am3d="http://schemas.microsoft.com/office/drawing/2017/model3d" xmlns:o="urn:schemas-microsoft-com:office:office" xmlns:oel="http://schemas.microsoft.com/office/2019/extlst" xmlns:r="http://schemas.openxmlformats.org/officeDocument/2006/relationships" xmlns:m="http://schemas.openxmlformats.org/officeDocument/2006/math" xmlns:v="urn:schemas-microsoft-com:vml" xmlns:wp14="http://schemas.microsoft.com/office/word/2010/wordprocessingDrawing" xmlns:wp="http://schemas.openxmlformats.org/drawingml/2006/wordprocessingDrawing" xmlns:w10="urn:schemas-microsoft-com:office:word" xmlns:w="http://schemas.openxmlformats.org/wordprocessingml/2006/main" xmlns:w14="http://schemas.microsoft.com/office/word/2010/wordml" xmlns:w15="http://schemas.microsoft.com/office/word/2012/wordml" xmlns:w16cex="http://schemas.microsoft.com/office/word/2018/wordml/cex" xmlns:w16cid="http://schemas.microsoft.com/office/word/2016/wordml/cid" xmlns:w16="http://schemas.microsoft.com/office/word/2018/wordml" xmlns:w16du="http://schemas.microsoft.com/office/word/2023/wordml/word16du" xmlns:w16sdtdh="http://schemas.microsoft.com/office/word/2020/wordml/sdtdatahash" xmlns:w16sdtfl="http://schemas.microsoft.com/office/word/2024/wordml/sdtformatlock" xmlns:w16se="http://schemas.microsoft.com/office/word/2015/wordml/symex" xmlns:wpg="http://schemas.microsoft.com/office/word/2010/wordprocessingGroup" xmlns:wpi="http://schemas.microsoft.com/office/word/2010/wordprocessingInk" xmlns:wne="http://schemas.microsoft.com/office/word/2006/wordml" xmlns:wps="http://schemas.microsoft.com/office/word/2010/wordprocessingShape" mc:Ignorable="w14 w15 w16se w16cid w16 w16cex w16sdtdh w16sdtfl w16du wp14">
+  <w15:commentEx w15:paraId="33DB6E27" w15:done="0"/>
+  <w15:commentEx w15:paraId="14A3051C" w15:paraIdParent="33DB6E27" w15:done="0"/>
+  <w15:commentEx w15:paraId="30AF6615" w15:done="0"/>
+  <w15:commentEx w15:paraId="346BEFC9" w15:paraIdParent="30AF6615" w15:done="0"/>
+  <w15:commentEx w15:paraId="7223F33D" w15:paraIdParent="30AF6615" w15:done="0"/>
+  <w15:commentEx w15:paraId="555F34CB" w15:done="0"/>
+  <w15:commentEx w15:paraId="05E9D071" w15:done="0"/>
+  <w15:commentEx w15:paraId="5B3DDB54" w15:paraIdParent="05E9D071" w15:done="0"/>
+  <w15:commentEx w15:paraId="0D0CD09D" w15:done="0"/>
+  <w15:commentEx w15:paraId="598837D0" w15:done="0"/>
+  <w15:commentEx w15:paraId="5144500B" w15:done="0"/>
+  <w15:commentEx w15:paraId="581B593E" w15:done="0"/>
+  <w15:commentEx w15:paraId="4FCB176F" w15:done="0"/>
+  <w15:commentEx w15:paraId="30B8E2E5" w15:done="0"/>
+  <w15:commentEx w15:paraId="5574612E" w15:paraIdParent="30B8E2E5" w15:done="0"/>
+  <w15:commentEx w15:paraId="1F539D62" w15:done="0"/>
+  <w15:commentEx w15:paraId="338AD675" w15:done="0"/>
+  <w15:commentEx w15:paraId="25FD83EF" w15:done="0"/>
+</w15:commentsEx>
+</file>
+
+<file path=word/commentsExtensible.xml><?xml version="1.0" encoding="utf-8"?>
+<w16cex:commentsExtensible xmlns:wpc="http://schemas.microsoft.com/office/word/2010/wordprocessingCanvas" xmlns:cx="http://schemas.microsoft.com/office/drawing/2014/chartex" xmlns:cx1="http://schemas.microsoft.com/office/drawing/2015/9/8/chartex" xmlns:cx2="http://schemas.microsoft.com/office/drawing/2015/10/21/chartex" xmlns:cx3="http://schemas.microsoft.com/office/drawing/2016/5/9/chartex" xmlns:cx4="http://schemas.microsoft.com/office/drawing/2016/5/10/chartex" xmlns:cx5="http://schemas.microsoft.com/office/drawing/2016/5/11/chartex" xmlns:cx6="http://schemas.microsoft.com/office/drawing/2016/5/12/chartex" xmlns:cx7="http://schemas.microsoft.com/office/drawing/2016/5/13/chartex" xmlns:cx8="http://schemas.microsoft.com/office/drawing/2016/5/14/chartex" xmlns:cr="http://schemas.microsoft.com/office/comments/2020/reactions" xmlns:mc="http://schemas.openxmlformats.org/markup-compatibility/2006" xmlns:aink="http://schemas.microsoft.com/office/drawing/2016/ink" xmlns:am3d="http://schemas.microsoft.com/office/drawing/2017/model3d" xmlns:o="urn:schemas-microsoft-com:office:office" xmlns:oel="http://schemas.microsoft.com/office/2019/extlst" xmlns:r="http://schemas.openxmlformats.org/officeDocument/2006/relationships" xmlns:m="http://schemas.openxmlformats.org/officeDocument/2006/math" xmlns:v="urn:schemas-microsoft-com:vml" xmlns:wp14="http://schemas.microsoft.com/office/word/2010/wordprocessingDrawing" xmlns:wp="http://schemas.openxmlformats.org/drawingml/2006/wordprocessingDrawing" xmlns:w10="urn:schemas-microsoft-com:office:word" xmlns:w="http://schemas.openxmlformats.org/wordprocessingml/2006/main" xmlns:w14="http://schemas.microsoft.com/office/word/2010/wordml" xmlns:w15="http://schemas.microsoft.com/office/word/2012/wordml" xmlns:w16cex="http://schemas.microsoft.com/office/word/2018/wordml/cex" xmlns:w16cid="http://schemas.microsoft.com/office/word/2016/wordml/cid" xmlns:w16="http://schemas.microsoft.com/office/word/2018/wordml" xmlns:w16du="http://schemas.microsoft.com/office/word/2023/wordml/word16du" xmlns:w16sdtdh="http://schemas.microsoft.com/office/word/2020/wordml/sdtdatahash" xmlns:w16sdtfl="http://schemas.microsoft.com/office/word/2024/wordml/sdtformatlock" xmlns:w16se="http://schemas.microsoft.com/office/word/2015/wordml/symex" xmlns:wpg="http://schemas.microsoft.com/office/word/2010/wordprocessingGroup" xmlns:wpi="http://schemas.microsoft.com/office/word/2010/wordprocessingInk" xmlns:wne="http://schemas.microsoft.com/office/word/2006/wordml" xmlns:wps="http://schemas.microsoft.com/office/word/2010/wordprocessingShape" mc:Ignorable="w14 w15 w16se w16cid w16 w16cex w16sdtdh w16sdtfl cr w16du wp14">
+  <w16cex:commentExtensible w16cex:durableId="1FE61548" w16cex:dateUtc="2026-03-18T19:39:00Z"/>
+  <w16cex:commentExtensible w16cex:durableId="2C9C7EBC" w16cex:dateUtc="2026-03-18T19:41:00Z"/>
+  <w16cex:commentExtensible w16cex:durableId="3858D9EA" w16cex:dateUtc="2026-03-18T19:36:00Z"/>
+  <w16cex:commentExtensible w16cex:durableId="19020E4A" w16cex:dateUtc="2026-03-18T19:38:00Z"/>
+  <w16cex:commentExtensible w16cex:durableId="579BC340" w16cex:dateUtc="2026-03-18T19:39:00Z"/>
+  <w16cex:commentExtensible w16cex:durableId="2313BD4E" w16cex:dateUtc="2026-03-18T19:39:00Z"/>
+  <w16cex:commentExtensible w16cex:durableId="0CAF4CC6" w16cex:dateUtc="2026-03-18T19:41:00Z"/>
+  <w16cex:commentExtensible w16cex:durableId="681DAF75" w16cex:dateUtc="2026-03-18T19:44:00Z"/>
+  <w16cex:commentExtensible w16cex:durableId="16447B13" w16cex:dateUtc="2026-03-18T19:42:00Z"/>
+  <w16cex:commentExtensible w16cex:durableId="69642F25" w16cex:dateUtc="2026-03-18T19:41:00Z"/>
+  <w16cex:commentExtensible w16cex:durableId="75C071AE" w16cex:dateUtc="2026-03-18T19:43:00Z"/>
+  <w16cex:commentExtensible w16cex:durableId="624695EB" w16cex:dateUtc="2026-03-18T19:45:00Z"/>
+  <w16cex:commentExtensible w16cex:durableId="3127EA59" w16cex:dateUtc="2026-03-18T19:42:00Z"/>
+  <w16cex:commentExtensible w16cex:durableId="28E3C728" w16cex:dateUtc="2026-03-18T19:43:00Z"/>
+  <w16cex:commentExtensible w16cex:durableId="55D8346D" w16cex:dateUtc="2026-03-18T19:47:00Z"/>
+  <w16cex:commentExtensible w16cex:durableId="4DF14AEF" w16cex:dateUtc="2026-03-18T19:47:00Z"/>
+  <w16cex:commentExtensible w16cex:durableId="00A4416A" w16cex:dateUtc="2026-03-18T19:44:00Z"/>
+  <w16cex:commentExtensible w16cex:durableId="0BD2FEFC" w16cex:dateUtc="2026-03-18T19:55:00Z"/>
+</w16cex:commentsExtensible>
+</file>
+
+<file path=word/commentsIds.xml><?xml version="1.0" encoding="utf-8"?>
+<w16cid:commentsIds xmlns:wpc="http://schemas.microsoft.com/office/word/2010/wordprocessingCanvas" xmlns:cx="http://schemas.microsoft.com/office/drawing/2014/chartex" xmlns:cx1="http://schemas.microsoft.com/office/drawing/2015/9/8/chartex" xmlns:cx2="http://schemas.microsoft.com/office/drawing/2015/10/21/chartex" xmlns:cx3="http://schemas.microsoft.com/office/drawing/2016/5/9/chartex" xmlns:cx4="http://schemas.microsoft.com/office/drawing/2016/5/10/chartex" xmlns:cx5="http://schemas.microsoft.com/office/drawing/2016/5/11/chartex" xmlns:cx6="http://schemas.microsoft.com/office/drawing/2016/5/12/chartex" xmlns:cx7="http://schemas.microsoft.com/office/drawing/2016/5/13/chartex" xmlns:cx8="http://schemas.microsoft.com/office/drawing/2016/5/14/chartex" xmlns:mc="http://schemas.openxmlformats.org/markup-compatibility/2006" xmlns:aink="http://schemas.microsoft.com/office/drawing/2016/ink" xmlns:am3d="http://schemas.microsoft.com/office/drawing/2017/model3d" xmlns:o="urn:schemas-microsoft-com:office:office" xmlns:oel="http://schemas.microsoft.com/office/2019/extlst" xmlns:r="http://schemas.openxmlformats.org/officeDocument/2006/relationships" xmlns:m="http://schemas.openxmlformats.org/officeDocument/2006/math" xmlns:v="urn:schemas-microsoft-com:vml" xmlns:wp14="http://schemas.microsoft.com/office/word/2010/wordprocessingDrawing" xmlns:wp="http://schemas.openxmlformats.org/drawingml/2006/wordprocessingDrawing" xmlns:w10="urn:schemas-microsoft-com:office:word" xmlns:w="http://schemas.openxmlformats.org/wordprocessingml/2006/main" xmlns:w14="http://schemas.microsoft.com/office/word/2010/wordml" xmlns:w15="http://schemas.microsoft.com/office/word/2012/wordml" xmlns:w16cex="http://schemas.microsoft.com/office/word/2018/wordml/cex" xmlns:w16cid="http://schemas.microsoft.com/office/word/2016/wordml/cid" xmlns:w16="http://schemas.microsoft.com/office/word/2018/wordml" xmlns:w16du="http://schemas.microsoft.com/office/word/2023/wordml/word16du" xmlns:w16sdtdh="http://schemas.microsoft.com/office/word/2020/wordml/sdtdatahash" xmlns:w16sdtfl="http://schemas.microsoft.com/office/word/2024/wordml/sdtformatlock" xmlns:w16se="http://schemas.microsoft.com/office/word/2015/wordml/symex" xmlns:wpg="http://schemas.microsoft.com/office/word/2010/wordprocessingGroup" xmlns:wpi="http://schemas.microsoft.com/office/word/2010/wordprocessingInk" xmlns:wne="http://schemas.microsoft.com/office/word/2006/wordml" xmlns:wps="http://schemas.microsoft.com/office/word/2010/wordprocessingShape" mc:Ignorable="w14 w15 w16se w16cid w16 w16cex w16sdtdh w16sdtfl w16du wp14">
+  <w16cid:commentId w16cid:paraId="33DB6E27" w16cid:durableId="1FE61548"/>
+  <w16cid:commentId w16cid:paraId="14A3051C" w16cid:durableId="2C9C7EBC"/>
+  <w16cid:commentId w16cid:paraId="30AF6615" w16cid:durableId="3858D9EA"/>
+  <w16cid:commentId w16cid:paraId="346BEFC9" w16cid:durableId="19020E4A"/>
+  <w16cid:commentId w16cid:paraId="7223F33D" w16cid:durableId="579BC340"/>
+  <w16cid:commentId w16cid:paraId="555F34CB" w16cid:durableId="2313BD4E"/>
+  <w16cid:commentId w16cid:paraId="05E9D071" w16cid:durableId="0CAF4CC6"/>
+  <w16cid:commentId w16cid:paraId="5B3DDB54" w16cid:durableId="681DAF75"/>
+  <w16cid:commentId w16cid:paraId="0D0CD09D" w16cid:durableId="16447B13"/>
+  <w16cid:commentId w16cid:paraId="598837D0" w16cid:durableId="69642F25"/>
+  <w16cid:commentId w16cid:paraId="5144500B" w16cid:durableId="75C071AE"/>
+  <w16cid:commentId w16cid:paraId="581B593E" w16cid:durableId="624695EB"/>
+  <w16cid:commentId w16cid:paraId="4FCB176F" w16cid:durableId="3127EA59"/>
+  <w16cid:commentId w16cid:paraId="30B8E2E5" w16cid:durableId="28E3C728"/>
+  <w16cid:commentId w16cid:paraId="5574612E" w16cid:durableId="55D8346D"/>
+  <w16cid:commentId w16cid:paraId="1F539D62" w16cid:durableId="4DF14AEF"/>
+  <w16cid:commentId w16cid:paraId="338AD675" w16cid:durableId="00A4416A"/>
+  <w16cid:commentId w16cid:paraId="25FD83EF" w16cid:durableId="0BD2FEFC"/>
+</w16cid:commentsIds>
 </file>
 
 <file path=word/endnotes.xml><?xml version="1.0" encoding="utf-8"?>
@@ -5553,6 +6165,23 @@
     <w:abstractNumId w:val="0"/>
   </w:num>
 </w:numbering>
+</file>
+
+<file path=word/people.xml><?xml version="1.0" encoding="utf-8"?>
+<w15:people xmlns:wpc="http://schemas.microsoft.com/office/word/2010/wordprocessingCanvas" xmlns:cx="http://schemas.microsoft.com/office/drawing/2014/chartex" xmlns:cx1="http://schemas.microsoft.com/office/drawing/2015/9/8/chartex" xmlns:cx2="http://schemas.microsoft.com/office/drawing/2015/10/21/chartex" xmlns:cx3="http://schemas.microsoft.com/office/drawing/2016/5/9/chartex" xmlns:cx4="http://schemas.microsoft.com/office/drawing/2016/5/10/chartex" xmlns:cx5="http://schemas.microsoft.com/office/drawing/2016/5/11/chartex" xmlns:cx6="http://schemas.microsoft.com/office/drawing/2016/5/12/chartex" xmlns:cx7="http://schemas.microsoft.com/office/drawing/2016/5/13/chartex" xmlns:cx8="http://schemas.microsoft.com/office/drawing/2016/5/14/chartex" xmlns:mc="http://schemas.openxmlformats.org/markup-compatibility/2006" xmlns:aink="http://schemas.microsoft.com/office/drawing/2016/ink" xmlns:am3d="http://schemas.microsoft.com/office/drawing/2017/model3d" xmlns:o="urn:schemas-microsoft-com:office:office" xmlns:oel="http://schemas.microsoft.com/office/2019/extlst" xmlns:r="http://schemas.openxmlformats.org/officeDocument/2006/relationships" xmlns:m="http://schemas.openxmlformats.org/officeDocument/2006/math" xmlns:v="urn:schemas-microsoft-com:vml" xmlns:wp14="http://schemas.microsoft.com/office/word/2010/wordprocessingDrawing" xmlns:wp="http://schemas.openxmlformats.org/drawingml/2006/wordprocessingDrawing" xmlns:w10="urn:schemas-microsoft-com:office:word" xmlns:w="http://schemas.openxmlformats.org/wordprocessingml/2006/main" xmlns:w14="http://schemas.microsoft.com/office/word/2010/wordml" xmlns:w15="http://schemas.microsoft.com/office/word/2012/wordml" xmlns:w16cex="http://schemas.microsoft.com/office/word/2018/wordml/cex" xmlns:w16cid="http://schemas.microsoft.com/office/word/2016/wordml/cid" xmlns:w16="http://schemas.microsoft.com/office/word/2018/wordml" xmlns:w16du="http://schemas.microsoft.com/office/word/2023/wordml/word16du" xmlns:w16sdtdh="http://schemas.microsoft.com/office/word/2020/wordml/sdtdatahash" xmlns:w16sdtfl="http://schemas.microsoft.com/office/word/2024/wordml/sdtformatlock" xmlns:w16se="http://schemas.microsoft.com/office/word/2015/wordml/symex" xmlns:wpg="http://schemas.microsoft.com/office/word/2010/wordprocessingGroup" xmlns:wpi="http://schemas.microsoft.com/office/word/2010/wordprocessingInk" xmlns:wne="http://schemas.microsoft.com/office/word/2006/wordml" xmlns:wps="http://schemas.microsoft.com/office/word/2010/wordprocessingShape" mc:Ignorable="w14 w15 w16se w16cid w16 w16cex w16sdtdh w16sdtfl w16du wp14">
+  <w15:person w15:author="Keinan Zanck">
+    <w15:presenceInfo w15:providerId="AD" w15:userId="S::kzanck@chewy.com::80604190-b42d-4b28-900f-4b19c681c628"/>
+  </w15:person>
+  <w15:person w15:author="Nathan Miles">
+    <w15:presenceInfo w15:providerId="AD" w15:userId="S::nmiles1@chewy.com::feb1e035-60a1-474f-bb67-372cd6733068"/>
+  </w15:person>
+  <w15:person w15:author="Steven Palmer">
+    <w15:presenceInfo w15:providerId="AD" w15:userId="S::spalmer5@chewy.com::a6db0aa6-0219-4ca8-a21d-98cca6af58e3"/>
+  </w15:person>
+  <w15:person w15:author="Phanindher Patlola">
+    <w15:presenceInfo w15:providerId="AD" w15:userId="S::ppatlola@chewy.com::b9a94b35-5f4c-4e79-bd01-ec8b46a972aa"/>
+  </w15:person>
+</w15:people>
 </file>
 
 <file path=word/styles.xml><?xml version="1.0" encoding="utf-8"?>
@@ -6221,6 +6850,62 @@
       <w:shd w:val="clear" w:color="auto" w:fill="E1DFDD"/>
     </w:rPr>
   </w:style>
+  <w:style w:type="paragraph" w:styleId="CommentText">
+    <w:name w:val="annotation text"/>
+    <w:basedOn w:val="Normal"/>
+    <w:link w:val="CommentTextChar"/>
+    <w:uiPriority w:val="99"/>
+    <w:unhideWhenUsed/>
+    <w:rsid w:val="002562A4"/>
+    <w:pPr>
+      <w:spacing w:line="240" w:lineRule="auto"/>
+    </w:pPr>
+  </w:style>
+  <w:style w:type="character" w:customStyle="1" w:styleId="CommentTextChar">
+    <w:name w:val="Comment Text Char"/>
+    <w:basedOn w:val="DefaultParagraphFont"/>
+    <w:link w:val="CommentText"/>
+    <w:uiPriority w:val="99"/>
+    <w:rsid w:val="002562A4"/>
+  </w:style>
+  <w:style w:type="character" w:styleId="CommentReference">
+    <w:name w:val="annotation reference"/>
+    <w:basedOn w:val="DefaultParagraphFont"/>
+    <w:uiPriority w:val="99"/>
+    <w:semiHidden/>
+    <w:unhideWhenUsed/>
+    <w:rsid w:val="002562A4"/>
+    <w:rPr>
+      <w:sz w:val="16"/>
+      <w:szCs w:val="16"/>
+    </w:rPr>
+  </w:style>
+  <w:style w:type="paragraph" w:styleId="CommentSubject">
+    <w:name w:val="annotation subject"/>
+    <w:basedOn w:val="CommentText"/>
+    <w:next w:val="CommentText"/>
+    <w:link w:val="CommentSubjectChar"/>
+    <w:uiPriority w:val="99"/>
+    <w:semiHidden/>
+    <w:unhideWhenUsed/>
+    <w:rsid w:val="00F729AF"/>
+    <w:rPr>
+      <w:b/>
+      <w:bCs/>
+    </w:rPr>
+  </w:style>
+  <w:style w:type="character" w:customStyle="1" w:styleId="CommentSubjectChar">
+    <w:name w:val="Comment Subject Char"/>
+    <w:basedOn w:val="CommentTextChar"/>
+    <w:link w:val="CommentSubject"/>
+    <w:uiPriority w:val="99"/>
+    <w:semiHidden/>
+    <w:rsid w:val="00F729AF"/>
+    <w:rPr>
+      <w:b/>
+      <w:bCs/>
+    </w:rPr>
+  </w:style>
 </w:styles>
 </file>
 

</xml_diff>